<commit_message>
Added to the analysis part of the report
</commit_message>
<xml_diff>
--- a/project_docs/Project Report Draft.docx
+++ b/project_docs/Project Report Draft.docx
@@ -56,254 +56,37 @@
       <w:r>
         <w:rPr>
           <w:rFonts w:ascii="Arial" w:hAnsi="Arial" w:cs="Arial"/>
-          <w:b w:val="1"/>
-          <w:bCs w:val="1"/>
-        </w:rPr>
-        <w:t>1. Title Page</w:t>
-      </w:r>
-    </w:p>
-    <w:p>
-      <w:pPr>
-        <w:pStyle w:val="Normal"/>
-        <w:numPr>
-          <w:ilvl w:val="0"/>
-          <w:numId w:val="1"/>
-        </w:numPr>
-        <w:suppressLineNumbers w:val="0"/>
-        <w:bidi w:val="0"/>
-        <w:spacing w:before="0" w:beforeAutospacing="off" w:after="160" w:afterAutospacing="off" w:line="278" w:lineRule="auto"/>
-        <w:ind w:left="720" w:right="0" w:hanging="360"/>
-        <w:jc w:val="left"/>
-        <w:rPr>
-          <w:rFonts w:ascii="Arial" w:hAnsi="Arial" w:cs="Arial"/>
-          <w:b w:val="1"/>
-          <w:bCs w:val="1"/>
-        </w:rPr>
-      </w:pPr>
-      <w:r>
-        <w:rPr>
-          <w:rFonts w:ascii="Arial" w:hAnsi="Arial" w:cs="Arial"/>
-          <w:b w:val="1"/>
-          <w:bCs w:val="1"/>
-        </w:rPr>
-        <w:t xml:space="preserve">Course Title: </w:t>
-      </w:r>
-      <w:r>
-        <w:rPr>
-          <w:rFonts w:ascii="Arial" w:hAnsi="Arial" w:cs="Arial"/>
-          <w:b w:val="0"/>
-          <w:bCs w:val="0"/>
-        </w:rPr>
-        <w:t>PDA Data Science</w:t>
-      </w:r>
-    </w:p>
-    <w:p>
-      <w:pPr>
-        <w:numPr>
-          <w:ilvl w:val="0"/>
-          <w:numId w:val="1"/>
-        </w:numPr>
-        <w:rPr>
-          <w:rFonts w:ascii="Arial" w:hAnsi="Arial" w:cs="Arial"/>
-          <w:b w:val="1"/>
-          <w:bCs w:val="1"/>
-        </w:rPr>
-      </w:pPr>
-      <w:r>
-        <w:rPr>
-          <w:rFonts w:ascii="Arial" w:hAnsi="Arial" w:cs="Arial"/>
-          <w:b w:val="1"/>
-          <w:bCs w:val="1"/>
-        </w:rPr>
-        <w:t>Project Team</w:t>
-      </w:r>
-      <w:r>
-        <w:rPr>
-          <w:rFonts w:ascii="Arial" w:hAnsi="Arial" w:cs="Arial"/>
-          <w:b w:val="1"/>
-          <w:bCs w:val="1"/>
-        </w:rPr>
-        <w:t xml:space="preserve"> Name: </w:t>
-      </w:r>
-      <w:r>
-        <w:rPr>
-          <w:rFonts w:ascii="Arial" w:hAnsi="Arial" w:cs="Arial"/>
-          <w:b w:val="0"/>
-          <w:bCs w:val="0"/>
-        </w:rPr>
-        <w:t>The Pythonistas</w:t>
-      </w:r>
-    </w:p>
-    <w:p>
-      <w:pPr>
-        <w:pStyle w:val="Normal"/>
-        <w:numPr>
-          <w:ilvl w:val="0"/>
-          <w:numId w:val="1"/>
-        </w:numPr>
-        <w:suppressLineNumbers w:val="0"/>
-        <w:bidi w:val="0"/>
-        <w:spacing w:before="0" w:beforeAutospacing="off" w:after="160" w:afterAutospacing="off" w:line="278" w:lineRule="auto"/>
-        <w:ind w:left="720" w:right="0" w:hanging="360"/>
-        <w:jc w:val="left"/>
-        <w:rPr>
-          <w:rFonts w:ascii="Arial" w:hAnsi="Arial" w:cs="Arial"/>
-          <w:b w:val="1"/>
-          <w:bCs w:val="1"/>
-          <w:sz w:val="24"/>
-          <w:szCs w:val="24"/>
-        </w:rPr>
-      </w:pPr>
-      <w:r>
-        <w:rPr>
-          <w:rFonts w:ascii="Arial" w:hAnsi="Arial" w:cs="Arial"/>
-          <w:b w:val="1"/>
-          <w:bCs w:val="1"/>
-        </w:rPr>
-        <w:t xml:space="preserve">Project Title: </w:t>
-      </w:r>
-      <w:r>
-        <w:rPr>
-          <w:rFonts w:ascii="Arial" w:hAnsi="Arial" w:cs="Arial"/>
-          <w:b w:val="0"/>
-          <w:bCs w:val="0"/>
-        </w:rPr>
-        <w:t xml:space="preserve">"Do low-rated chess players </w:t>
-      </w:r>
-      <w:r>
-        <w:rPr>
-          <w:rFonts w:ascii="Arial" w:hAnsi="Arial" w:cs="Arial"/>
-          <w:b w:val="0"/>
-          <w:bCs w:val="0"/>
-        </w:rPr>
-        <w:t>win more games when using common or uncommon openings”</w:t>
-      </w:r>
-    </w:p>
-    <w:p>
-      <w:pPr>
-        <w:pStyle w:val="Normal"/>
-        <w:numPr>
-          <w:ilvl w:val="0"/>
-          <w:numId w:val="1"/>
-        </w:numPr>
-        <w:suppressLineNumbers w:val="0"/>
-        <w:bidi w:val="0"/>
-        <w:spacing w:before="0" w:beforeAutospacing="off" w:after="160" w:afterAutospacing="off" w:line="278" w:lineRule="auto"/>
-        <w:ind w:left="720" w:right="0" w:hanging="360"/>
-        <w:jc w:val="left"/>
-        <w:rPr>
-          <w:rFonts w:ascii="Arial" w:hAnsi="Arial" w:cs="Arial"/>
-          <w:b w:val="1"/>
-          <w:bCs w:val="1"/>
-        </w:rPr>
-      </w:pPr>
-      <w:r>
-        <w:rPr>
-          <w:rFonts w:ascii="Arial" w:hAnsi="Arial" w:cs="Arial"/>
-          <w:b w:val="1"/>
-          <w:bCs w:val="1"/>
-        </w:rPr>
-        <w:t>Student Name (s):</w:t>
-      </w:r>
-      <w:r>
-        <w:rPr>
-          <w:rFonts w:ascii="Arial" w:hAnsi="Arial" w:cs="Arial"/>
-          <w:b w:val="0"/>
-          <w:bCs w:val="0"/>
-        </w:rPr>
-        <w:t xml:space="preserve"> </w:t>
-      </w:r>
-      <w:r>
-        <w:rPr>
-          <w:rFonts w:ascii="Arial" w:hAnsi="Arial" w:cs="Arial"/>
-          <w:b w:val="0"/>
-          <w:bCs w:val="0"/>
-        </w:rPr>
-        <w:t>Anna Bekesi, James Murphy, Callum Rennie</w:t>
-      </w:r>
-    </w:p>
-    <w:p>
-      <w:pPr>
-        <w:pStyle w:val="Normal"/>
-        <w:numPr>
-          <w:ilvl w:val="0"/>
-          <w:numId w:val="1"/>
-        </w:numPr>
-        <w:suppressLineNumbers w:val="0"/>
-        <w:bidi w:val="0"/>
-        <w:spacing w:before="0" w:beforeAutospacing="off" w:after="160" w:afterAutospacing="off" w:line="278" w:lineRule="auto"/>
-        <w:ind w:left="720" w:right="0" w:hanging="360"/>
-        <w:jc w:val="left"/>
-        <w:rPr>
-          <w:rFonts w:ascii="Arial" w:hAnsi="Arial" w:cs="Arial"/>
-          <w:b w:val="0"/>
-          <w:bCs w:val="0"/>
-        </w:rPr>
-      </w:pPr>
-      <w:r>
-        <w:rPr>
-          <w:rFonts w:ascii="Arial" w:hAnsi="Arial" w:cs="Arial"/>
-          <w:b w:val="1"/>
-          <w:bCs w:val="1"/>
-        </w:rPr>
-        <w:t xml:space="preserve">Date: </w:t>
-      </w:r>
-      <w:r>
-        <w:rPr>
-          <w:rFonts w:ascii="Arial" w:hAnsi="Arial" w:cs="Arial"/>
-          <w:b w:val="0"/>
-          <w:bCs w:val="0"/>
-        </w:rPr>
-        <w:t>01</w:t>
-      </w:r>
-      <w:r>
-        <w:rPr>
-          <w:rFonts w:ascii="Arial" w:hAnsi="Arial" w:cs="Arial"/>
-          <w:b w:val="0"/>
-          <w:bCs w:val="0"/>
-        </w:rPr>
-        <w:t>/</w:t>
-      </w:r>
-      <w:r>
-        <w:rPr>
-          <w:rFonts w:ascii="Arial" w:hAnsi="Arial" w:cs="Arial"/>
-          <w:b w:val="0"/>
-          <w:bCs w:val="0"/>
-        </w:rPr>
-        <w:t>06</w:t>
-      </w:r>
-      <w:r>
-        <w:rPr>
-          <w:rFonts w:ascii="Arial" w:hAnsi="Arial" w:cs="Arial"/>
-          <w:b w:val="0"/>
-          <w:bCs w:val="0"/>
-        </w:rPr>
-        <w:t>/</w:t>
-      </w:r>
-      <w:r>
-        <w:rPr>
-          <w:rFonts w:ascii="Arial" w:hAnsi="Arial" w:cs="Arial"/>
-          <w:b w:val="0"/>
-          <w:bCs w:val="0"/>
-        </w:rPr>
-        <w:t>2025</w:t>
-      </w:r>
-    </w:p>
-    <w:p>
-      <w:pPr>
-        <w:rPr>
-          <w:rFonts w:ascii="Arial" w:hAnsi="Arial" w:cs="Arial"/>
           <w:b/>
           <w:bCs/>
         </w:rPr>
-      </w:pPr>
-      <w:r>
+        <w:t>1. Title Page</w:t>
+      </w:r>
+    </w:p>
+    <w:p>
+      <w:pPr>
+        <w:numPr>
+          <w:ilvl w:val="0"/>
+          <w:numId w:val="2"/>
+        </w:numPr>
         <w:rPr>
           <w:rFonts w:ascii="Arial" w:hAnsi="Arial" w:cs="Arial"/>
           <w:b/>
           <w:bCs/>
         </w:rPr>
-        <w:t>2. Abstract</w:t>
+      </w:pPr>
+      <w:r>
+        <w:rPr>
+          <w:rFonts w:ascii="Arial" w:hAnsi="Arial" w:cs="Arial"/>
+          <w:b/>
+          <w:bCs/>
+        </w:rPr>
+        <w:t xml:space="preserve">Course Title: </w:t>
+      </w:r>
+      <w:r>
+        <w:rPr>
+          <w:rFonts w:ascii="Arial" w:hAnsi="Arial" w:cs="Arial"/>
+        </w:rPr>
+        <w:t>PDA Data Science</w:t>
       </w:r>
     </w:p>
     <w:p>
@@ -314,49 +97,157 @@
         </w:numPr>
         <w:rPr>
           <w:rFonts w:ascii="Arial" w:hAnsi="Arial" w:cs="Arial"/>
-        </w:rPr>
-      </w:pPr>
-      <w:r>
-        <w:rPr>
-          <w:rFonts w:ascii="Arial" w:hAnsi="Arial" w:cs="Arial"/>
           <w:b/>
           <w:bCs/>
         </w:rPr>
-        <w:t>Summary of the Report:</w:t>
-      </w:r>
-    </w:p>
-    <w:p>
-      <w:pPr>
-        <w:numPr>
-          <w:ilvl w:val="1"/>
-          <w:numId w:val="2"/>
-        </w:numPr>
-        <w:rPr>
-          <w:rFonts w:ascii="Arial" w:hAnsi="Arial" w:cs="Arial"/>
-        </w:rPr>
-      </w:pPr>
-      <w:r>
-        <w:rPr>
-          <w:rFonts w:ascii="Arial" w:hAnsi="Arial" w:cs="Arial"/>
-        </w:rPr>
-        <w:t>Brief overview of the project, including objectives, methods, key findings, and conclusions.</w:t>
-      </w:r>
-    </w:p>
-    <w:p>
-      <w:pPr>
+      </w:pPr>
+      <w:r>
         <w:rPr>
           <w:rFonts w:ascii="Arial" w:hAnsi="Arial" w:cs="Arial"/>
           <w:b/>
           <w:bCs/>
         </w:rPr>
-      </w:pPr>
+        <w:t>Project Team</w:t>
+      </w:r>
       <w:r>
         <w:rPr>
           <w:rFonts w:ascii="Arial" w:hAnsi="Arial" w:cs="Arial"/>
           <w:b/>
           <w:bCs/>
         </w:rPr>
-        <w:t>3. Table of Contents</w:t>
+        <w:t xml:space="preserve"> Name: </w:t>
+      </w:r>
+      <w:r>
+        <w:rPr>
+          <w:rFonts w:ascii="Arial" w:hAnsi="Arial" w:cs="Arial"/>
+        </w:rPr>
+        <w:t>The Pythonistas</w:t>
+      </w:r>
+    </w:p>
+    <w:p>
+      <w:pPr>
+        <w:numPr>
+          <w:ilvl w:val="0"/>
+          <w:numId w:val="2"/>
+        </w:numPr>
+        <w:rPr>
+          <w:rFonts w:ascii="Arial" w:hAnsi="Arial" w:cs="Arial"/>
+          <w:b/>
+          <w:bCs/>
+        </w:rPr>
+      </w:pPr>
+      <w:r>
+        <w:rPr>
+          <w:rFonts w:ascii="Arial" w:hAnsi="Arial" w:cs="Arial"/>
+          <w:b/>
+          <w:bCs/>
+        </w:rPr>
+        <w:t xml:space="preserve">Project Title: </w:t>
+      </w:r>
+      <w:r>
+        <w:rPr>
+          <w:rFonts w:ascii="Arial" w:hAnsi="Arial" w:cs="Arial"/>
+        </w:rPr>
+        <w:t>"Do low-rated chess players win more games when using common or uncommon openings”</w:t>
+      </w:r>
+    </w:p>
+    <w:p>
+      <w:pPr>
+        <w:numPr>
+          <w:ilvl w:val="0"/>
+          <w:numId w:val="2"/>
+        </w:numPr>
+        <w:rPr>
+          <w:rFonts w:ascii="Arial" w:hAnsi="Arial" w:cs="Arial"/>
+          <w:b/>
+          <w:bCs/>
+        </w:rPr>
+      </w:pPr>
+      <w:r>
+        <w:rPr>
+          <w:rFonts w:ascii="Arial" w:hAnsi="Arial" w:cs="Arial"/>
+          <w:b/>
+          <w:bCs/>
+        </w:rPr>
+        <w:t>Student Name (s):</w:t>
+      </w:r>
+      <w:r>
+        <w:rPr>
+          <w:rFonts w:ascii="Arial" w:hAnsi="Arial" w:cs="Arial"/>
+        </w:rPr>
+        <w:t xml:space="preserve"> </w:t>
+      </w:r>
+      <w:r>
+        <w:rPr>
+          <w:rFonts w:ascii="Arial" w:hAnsi="Arial" w:cs="Arial"/>
+        </w:rPr>
+        <w:t>Anna Bekesi, James Murphy, Callum Rennie</w:t>
+      </w:r>
+    </w:p>
+    <w:p>
+      <w:pPr>
+        <w:numPr>
+          <w:ilvl w:val="0"/>
+          <w:numId w:val="2"/>
+        </w:numPr>
+        <w:rPr>
+          <w:rFonts w:ascii="Arial" w:hAnsi="Arial" w:cs="Arial"/>
+        </w:rPr>
+      </w:pPr>
+      <w:r>
+        <w:rPr>
+          <w:rFonts w:ascii="Arial" w:hAnsi="Arial" w:cs="Arial"/>
+          <w:b/>
+          <w:bCs/>
+        </w:rPr>
+        <w:t xml:space="preserve">Date: </w:t>
+      </w:r>
+      <w:r>
+        <w:rPr>
+          <w:rFonts w:ascii="Arial" w:hAnsi="Arial" w:cs="Arial"/>
+        </w:rPr>
+        <w:t>01</w:t>
+      </w:r>
+      <w:r>
+        <w:rPr>
+          <w:rFonts w:ascii="Arial" w:hAnsi="Arial" w:cs="Arial"/>
+        </w:rPr>
+        <w:t>/</w:t>
+      </w:r>
+      <w:r>
+        <w:rPr>
+          <w:rFonts w:ascii="Arial" w:hAnsi="Arial" w:cs="Arial"/>
+        </w:rPr>
+        <w:t>06</w:t>
+      </w:r>
+      <w:r>
+        <w:rPr>
+          <w:rFonts w:ascii="Arial" w:hAnsi="Arial" w:cs="Arial"/>
+        </w:rPr>
+        <w:t>/</w:t>
+      </w:r>
+      <w:r>
+        <w:rPr>
+          <w:rFonts w:ascii="Arial" w:hAnsi="Arial" w:cs="Arial"/>
+        </w:rPr>
+        <w:t>2025</w:t>
+      </w:r>
+    </w:p>
+    <w:p>
+      <w:pPr>
+        <w:rPr>
+          <w:rFonts w:ascii="Arial" w:hAnsi="Arial" w:cs="Arial"/>
+          <w:b/>
+          <w:bCs/>
+        </w:rPr>
+      </w:pPr>
+      <w:r>
+        <w:rPr>
+          <w:rFonts w:ascii="Arial" w:hAnsi="Arial" w:cs="Arial"/>
+          <w:b/>
+          <w:bCs/>
+        </w:rPr>
+        <w:t>2. Abstract</w:t>
       </w:r>
     </w:p>
     <w:p>
@@ -375,7 +266,7 @@
           <w:b/>
           <w:bCs/>
         </w:rPr>
-        <w:t>List of Sections and Subsections:</w:t>
+        <w:t>Summary of the Report:</w:t>
       </w:r>
     </w:p>
     <w:p>
@@ -392,7 +283,7 @@
         <w:rPr>
           <w:rFonts w:ascii="Arial" w:hAnsi="Arial" w:cs="Arial"/>
         </w:rPr>
-        <w:t>Include page numbers for each section.</w:t>
+        <w:t>Brief overview of the project, including objectives, methods, key findings, and conclusions.</w:t>
       </w:r>
     </w:p>
     <w:p>
@@ -409,7 +300,7 @@
           <w:b/>
           <w:bCs/>
         </w:rPr>
-        <w:t>4. Introduction</w:t>
+        <w:t>3. Table of Contents</w:t>
       </w:r>
     </w:p>
     <w:p>
@@ -428,7 +319,7 @@
           <w:b/>
           <w:bCs/>
         </w:rPr>
-        <w:t>Course Overview:</w:t>
+        <w:t>List of Sections and Subsections:</w:t>
       </w:r>
     </w:p>
     <w:p>
@@ -445,362 +336,35 @@
         <w:rPr>
           <w:rFonts w:ascii="Arial" w:hAnsi="Arial" w:cs="Arial"/>
         </w:rPr>
-        <w:t xml:space="preserve">Brief description of the course and its </w:t>
-      </w:r>
-      <w:r>
-        <w:rPr>
-          <w:rFonts w:ascii="Arial" w:hAnsi="Arial" w:cs="Arial"/>
-        </w:rPr>
-        <w:t>objectives</w:t>
-      </w:r>
-      <w:r>
-        <w:rPr>
-          <w:rFonts w:ascii="Arial" w:hAnsi="Arial" w:cs="Arial"/>
-        </w:rPr>
-        <w:t>.</w:t>
-      </w:r>
-    </w:p>
-    <w:p>
-      <w:pPr>
-        <w:ind w:left="0"/>
-        <w:rPr>
-          <w:rFonts w:ascii="Arial" w:hAnsi="Arial" w:cs="Arial"/>
-        </w:rPr>
-      </w:pPr>
-      <w:r>
-        <w:rPr>
-          <w:rFonts w:ascii="Arial" w:hAnsi="Arial" w:cs="Arial"/>
-        </w:rPr>
-        <w:t xml:space="preserve">The Professional Development Award (PDA) in Data Science is designed </w:t>
-      </w:r>
-      <w:r>
-        <w:rPr>
-          <w:rFonts w:ascii="Arial" w:hAnsi="Arial" w:cs="Arial"/>
-        </w:rPr>
-        <w:t>to</w:t>
-      </w:r>
-      <w:r>
-        <w:rPr>
-          <w:rFonts w:ascii="Arial" w:hAnsi="Arial" w:cs="Arial"/>
-        </w:rPr>
-        <w:t xml:space="preserve"> upskill individuals working in data roles to confidently apply data science techniques. </w:t>
-      </w:r>
-      <w:r>
-        <w:rPr>
-          <w:rFonts w:ascii="Arial" w:hAnsi="Arial" w:cs="Arial"/>
-        </w:rPr>
-        <w:t>The PDA covers a range of topics</w:t>
-      </w:r>
-      <w:r>
-        <w:rPr>
-          <w:rFonts w:ascii="Arial" w:hAnsi="Arial" w:cs="Arial"/>
-        </w:rPr>
-        <w:t xml:space="preserve"> </w:t>
-      </w:r>
-      <w:r>
-        <w:rPr>
-          <w:rFonts w:ascii="Arial" w:hAnsi="Arial" w:cs="Arial"/>
-        </w:rPr>
-        <w:t>required</w:t>
-      </w:r>
-      <w:r>
-        <w:rPr>
-          <w:rFonts w:ascii="Arial" w:hAnsi="Arial" w:cs="Arial"/>
-        </w:rPr>
-        <w:t xml:space="preserve"> in today’s data </w:t>
-      </w:r>
-      <w:r>
-        <w:rPr>
-          <w:rFonts w:ascii="Arial" w:hAnsi="Arial" w:cs="Arial"/>
-        </w:rPr>
-        <w:t>driven</w:t>
-      </w:r>
-      <w:r>
-        <w:rPr>
-          <w:rFonts w:ascii="Arial" w:hAnsi="Arial" w:cs="Arial"/>
-        </w:rPr>
-        <w:t xml:space="preserve"> world</w:t>
-      </w:r>
-      <w:r>
-        <w:rPr>
-          <w:rFonts w:ascii="Arial" w:hAnsi="Arial" w:cs="Arial"/>
-        </w:rPr>
-        <w:t>,</w:t>
-      </w:r>
-      <w:r>
-        <w:rPr>
-          <w:rFonts w:ascii="Arial" w:hAnsi="Arial" w:cs="Arial"/>
-        </w:rPr>
-        <w:t xml:space="preserve"> including </w:t>
-      </w:r>
-      <w:r>
-        <w:rPr>
-          <w:rFonts w:ascii="Arial" w:hAnsi="Arial" w:cs="Arial"/>
-        </w:rPr>
-        <w:t xml:space="preserve">programming, data visualisation, data analysis and </w:t>
-      </w:r>
-      <w:r>
-        <w:rPr>
-          <w:rFonts w:ascii="Arial" w:hAnsi="Arial" w:cs="Arial"/>
-        </w:rPr>
-        <w:t>communication.</w:t>
-      </w:r>
-      <w:r>
-        <w:rPr>
-          <w:rFonts w:ascii="Arial" w:hAnsi="Arial" w:cs="Arial"/>
-        </w:rPr>
-        <w:t xml:space="preserve"> </w:t>
-      </w:r>
-    </w:p>
-    <w:p>
-      <w:pPr>
-        <w:ind w:left="0"/>
-        <w:rPr>
-          <w:rFonts w:ascii="Arial" w:hAnsi="Arial" w:cs="Arial"/>
-        </w:rPr>
-      </w:pPr>
-      <w:r>
-        <w:rPr>
-          <w:rFonts w:ascii="Arial" w:hAnsi="Arial" w:cs="Arial"/>
-        </w:rPr>
-        <w:t xml:space="preserve">The </w:t>
-      </w:r>
-      <w:r>
-        <w:rPr>
-          <w:rFonts w:ascii="Arial" w:hAnsi="Arial" w:cs="Arial"/>
-        </w:rPr>
-        <w:t>award</w:t>
-      </w:r>
-      <w:r>
-        <w:rPr>
-          <w:rFonts w:ascii="Arial" w:hAnsi="Arial" w:cs="Arial"/>
-        </w:rPr>
-        <w:t xml:space="preserve"> is completed over two semesters. The first semester focuses on developing programming skills</w:t>
-      </w:r>
-      <w:r>
-        <w:rPr>
-          <w:rFonts w:ascii="Arial" w:hAnsi="Arial" w:cs="Arial"/>
-        </w:rPr>
-        <w:t xml:space="preserve"> using Python</w:t>
-      </w:r>
-      <w:r>
-        <w:rPr>
-          <w:rFonts w:ascii="Arial" w:hAnsi="Arial" w:cs="Arial"/>
-        </w:rPr>
-        <w:t>, while the second semester involves applying this knowledge to complete a group proje</w:t>
-      </w:r>
-      <w:r>
-        <w:rPr>
-          <w:rFonts w:ascii="Arial" w:hAnsi="Arial" w:cs="Arial"/>
-        </w:rPr>
-        <w:t xml:space="preserve">ct working with </w:t>
-      </w:r>
-      <w:r>
-        <w:rPr>
-          <w:rFonts w:ascii="Arial" w:hAnsi="Arial" w:cs="Arial"/>
-        </w:rPr>
-        <w:t xml:space="preserve">a </w:t>
-      </w:r>
-      <w:r>
-        <w:rPr>
-          <w:rFonts w:ascii="Arial" w:hAnsi="Arial" w:cs="Arial"/>
-        </w:rPr>
-        <w:t>real-life</w:t>
-      </w:r>
-      <w:r>
-        <w:rPr>
-          <w:rFonts w:ascii="Arial" w:hAnsi="Arial" w:cs="Arial"/>
-        </w:rPr>
-        <w:t xml:space="preserve"> data</w:t>
-      </w:r>
-      <w:r>
-        <w:rPr>
-          <w:rFonts w:ascii="Arial" w:hAnsi="Arial" w:cs="Arial"/>
-        </w:rPr>
-        <w:t>set</w:t>
-      </w:r>
-      <w:r>
-        <w:rPr>
-          <w:rFonts w:ascii="Arial" w:hAnsi="Arial" w:cs="Arial"/>
-        </w:rPr>
-        <w:t>.</w:t>
-      </w:r>
-    </w:p>
-    <w:p>
-      <w:pPr>
-        <w:numPr>
-          <w:ilvl w:val="1"/>
-          <w:numId w:val="4"/>
-        </w:numPr>
-        <w:rPr>
-          <w:rFonts w:ascii="Arial" w:hAnsi="Arial" w:cs="Arial"/>
-        </w:rPr>
-      </w:pPr>
-      <w:r>
-        <w:rPr>
-          <w:rFonts w:ascii="Arial" w:hAnsi="Arial" w:cs="Arial"/>
-        </w:rPr>
-        <w:t>Importance of data science in the current industry.</w:t>
-      </w:r>
-    </w:p>
-    <w:p>
-      <w:pPr>
-        <w:ind w:left="0"/>
-        <w:rPr>
-          <w:rFonts w:ascii="Arial" w:hAnsi="Arial" w:eastAsia="Aptos" w:cs="Arial" w:asciiTheme="minorAscii" w:hAnsiTheme="minorAscii" w:eastAsiaTheme="minorAscii" w:cstheme="minorBidi"/>
-          <w:noProof w:val="0"/>
-          <w:color w:val="auto"/>
-          <w:sz w:val="24"/>
-          <w:szCs w:val="24"/>
-          <w:lang w:val="en-GB" w:eastAsia="en-US" w:bidi="ar-SA"/>
-        </w:rPr>
-      </w:pPr>
-      <w:r>
-        <w:rPr>
-          <w:rFonts w:ascii="Arial" w:hAnsi="Arial" w:eastAsia="Aptos" w:cs="Arial" w:asciiTheme="minorAscii" w:hAnsiTheme="minorAscii" w:eastAsiaTheme="minorAscii" w:cstheme="minorBidi"/>
-          <w:noProof w:val="0"/>
-          <w:color w:val="auto"/>
-          <w:sz w:val="24"/>
-          <w:szCs w:val="24"/>
-          <w:lang w:val="en-GB" w:eastAsia="en-US" w:bidi="ar-SA"/>
-        </w:rPr>
-        <w:t xml:space="preserve">As the volume of data available has grown and technology has advanced, organisations have increasingly been using data to gain a competitive advantage. Studies have shown that organisations who effectively use data are more profitable and efficient, have higher levels of customer loyalty and employee satisfaction and are more resilient to external challenges such as recessions (Bak, 2023). </w:t>
-      </w:r>
-      <w:r>
-        <w:rPr>
-          <w:rFonts w:ascii="Arial" w:hAnsi="Arial" w:eastAsia="Aptos" w:cs="Arial" w:asciiTheme="minorAscii" w:hAnsiTheme="minorAscii" w:eastAsiaTheme="minorAscii" w:cstheme="minorBidi"/>
-          <w:noProof w:val="0"/>
-          <w:color w:val="auto"/>
-          <w:sz w:val="24"/>
-          <w:szCs w:val="24"/>
-          <w:lang w:val="en-GB" w:eastAsia="en-US" w:bidi="ar-SA"/>
-        </w:rPr>
-        <w:t>To realise these benefits, organisations need the right technology and a skilled workforce to turn their data into actionable insights</w:t>
-      </w:r>
-      <w:r>
-        <w:rPr>
-          <w:rFonts w:ascii="Arial" w:hAnsi="Arial" w:eastAsia="Aptos" w:cs="Arial" w:asciiTheme="minorAscii" w:hAnsiTheme="minorAscii" w:eastAsiaTheme="minorAscii" w:cstheme="minorBidi"/>
-          <w:noProof w:val="0"/>
-          <w:color w:val="auto"/>
-          <w:sz w:val="24"/>
-          <w:szCs w:val="24"/>
-          <w:lang w:val="en-GB" w:eastAsia="en-US" w:bidi="ar-SA"/>
-        </w:rPr>
-        <w:t>.</w:t>
-      </w:r>
-    </w:p>
-    <w:p>
-      <w:pPr>
-        <w:numPr>
-          <w:ilvl w:val="0"/>
-          <w:numId w:val="4"/>
-        </w:numPr>
-        <w:rPr>
-          <w:rFonts w:ascii="Arial" w:hAnsi="Arial" w:cs="Arial"/>
-        </w:rPr>
-      </w:pPr>
-      <w:r>
+        <w:t>Include page numbers for each section.</w:t>
+      </w:r>
+    </w:p>
+    <w:p>
+      <w:pPr>
         <w:rPr>
           <w:rFonts w:ascii="Arial" w:hAnsi="Arial" w:cs="Arial"/>
           <w:b/>
           <w:bCs/>
         </w:rPr>
-        <w:t>Project Overview:</w:t>
-      </w:r>
-    </w:p>
-    <w:p>
-      <w:pPr>
-        <w:numPr>
-          <w:ilvl w:val="1"/>
-          <w:numId w:val="4"/>
-        </w:numPr>
-        <w:rPr>
-          <w:rFonts w:ascii="Arial" w:hAnsi="Arial" w:cs="Arial"/>
-        </w:rPr>
-      </w:pPr>
-      <w:r>
-        <w:rPr>
-          <w:rFonts w:ascii="Arial" w:hAnsi="Arial" w:cs="Arial"/>
-        </w:rPr>
-        <w:t>Description of the project undertaken.</w:t>
-      </w:r>
-    </w:p>
-    <w:p>
-      <w:pPr>
-        <w:spacing w:before="0" w:beforeAutospacing="off" w:after="160" w:afterAutospacing="off" w:line="276" w:lineRule="auto"/>
-      </w:pPr>
-      <w:r>
-        <w:rPr>
-          <w:rFonts w:ascii="Arial" w:hAnsi="Arial" w:eastAsia="Arial" w:cs="Arial"/>
-          <w:noProof w:val="0"/>
-          <w:sz w:val="24"/>
-          <w:szCs w:val="24"/>
-          <w:lang w:val="en-GB"/>
-        </w:rPr>
-        <w:t>Chess Grandmaster Ben Finegold has strongly contended that studying chess openings and the choice of opening used in a game is completely irrelevant for low-rated players (under 2000 Elo). Instead, he states that the moves and tactics used later in the game are what determine match outcomes at this level.</w:t>
-      </w:r>
-    </w:p>
-    <w:p>
-      <w:pPr>
-        <w:ind w:left="720"/>
-        <w:rPr>
-          <w:rFonts w:ascii="Arial" w:hAnsi="Arial" w:cs="Arial"/>
-        </w:rPr>
-      </w:pPr>
-    </w:p>
-    <w:p>
-      <w:pPr>
-        <w:numPr>
-          <w:ilvl w:val="1"/>
-          <w:numId w:val="4"/>
-        </w:numPr>
-        <w:rPr>
-          <w:rFonts w:ascii="Arial" w:hAnsi="Arial" w:cs="Arial"/>
-        </w:rPr>
-      </w:pPr>
-      <w:r>
-        <w:rPr>
-          <w:rFonts w:ascii="Arial" w:hAnsi="Arial" w:cs="Arial"/>
-        </w:rPr>
-        <w:t>Objectives</w:t>
-      </w:r>
-      <w:r>
-        <w:rPr>
-          <w:rFonts w:ascii="Arial" w:hAnsi="Arial" w:cs="Arial"/>
-        </w:rPr>
-        <w:t xml:space="preserve"> and goals of the project.</w:t>
-      </w:r>
-    </w:p>
-    <w:p>
-      <w:pPr>
-        <w:spacing w:before="0" w:beforeAutospacing="off" w:after="160" w:afterAutospacing="off" w:line="276" w:lineRule="auto"/>
-      </w:pPr>
-      <w:r>
-        <w:rPr>
-          <w:rFonts w:ascii="Arial" w:hAnsi="Arial" w:eastAsia="Arial" w:cs="Arial"/>
-          <w:noProof w:val="0"/>
-          <w:sz w:val="24"/>
-          <w:szCs w:val="24"/>
-          <w:lang w:val="en-GB"/>
-        </w:rPr>
-        <w:t>To examine this claim empirically, this project investigates how playing uncommon openings affect match outcome compared to playing common openings.</w:t>
-      </w:r>
-    </w:p>
-    <w:p>
-      <w:pPr>
-        <w:ind w:left="0"/>
-        <w:rPr>
-          <w:rFonts w:ascii="Arial" w:hAnsi="Arial" w:cs="Arial"/>
-        </w:rPr>
-      </w:pPr>
-    </w:p>
-    <w:p>
-      <w:pPr>
+      </w:pPr>
+      <w:r>
         <w:rPr>
           <w:rFonts w:ascii="Arial" w:hAnsi="Arial" w:cs="Arial"/>
           <w:b/>
           <w:bCs/>
         </w:rPr>
+        <w:t>4. Introduction</w:t>
+      </w:r>
+    </w:p>
+    <w:p>
+      <w:pPr>
+        <w:numPr>
+          <w:ilvl w:val="0"/>
+          <w:numId w:val="5"/>
+        </w:numPr>
+        <w:rPr>
+          <w:rFonts w:ascii="Arial" w:hAnsi="Arial" w:cs="Arial"/>
+        </w:rPr>
       </w:pPr>
       <w:r>
         <w:rPr>
@@ -808,7 +372,206 @@
           <w:b/>
           <w:bCs/>
         </w:rPr>
-        <w:t>5. Methodology</w:t>
+        <w:t>Course Overview:</w:t>
+      </w:r>
+    </w:p>
+    <w:p>
+      <w:pPr>
+        <w:numPr>
+          <w:ilvl w:val="1"/>
+          <w:numId w:val="5"/>
+        </w:numPr>
+        <w:rPr>
+          <w:rFonts w:ascii="Arial" w:hAnsi="Arial" w:cs="Arial"/>
+        </w:rPr>
+      </w:pPr>
+      <w:r>
+        <w:rPr>
+          <w:rFonts w:ascii="Arial" w:hAnsi="Arial" w:cs="Arial"/>
+        </w:rPr>
+        <w:t>Brief description of the course and its objectives.</w:t>
+      </w:r>
+    </w:p>
+    <w:p>
+      <w:pPr>
+        <w:rPr>
+          <w:rFonts w:ascii="Arial" w:hAnsi="Arial" w:cs="Arial"/>
+        </w:rPr>
+      </w:pPr>
+      <w:r>
+        <w:rPr>
+          <w:rFonts w:ascii="Arial" w:hAnsi="Arial" w:cs="Arial"/>
+        </w:rPr>
+        <w:t xml:space="preserve">The Professional Development Award (PDA) in Data Science is designed </w:t>
+      </w:r>
+      <w:r>
+        <w:rPr>
+          <w:rFonts w:ascii="Arial" w:hAnsi="Arial" w:cs="Arial"/>
+        </w:rPr>
+        <w:t>to</w:t>
+      </w:r>
+      <w:r>
+        <w:rPr>
+          <w:rFonts w:ascii="Arial" w:hAnsi="Arial" w:cs="Arial"/>
+        </w:rPr>
+        <w:t xml:space="preserve"> upskill individuals working in data roles to confidently apply data science techniques. </w:t>
+      </w:r>
+      <w:r>
+        <w:rPr>
+          <w:rFonts w:ascii="Arial" w:hAnsi="Arial" w:cs="Arial"/>
+        </w:rPr>
+        <w:t>The PDA covers a range of topics</w:t>
+      </w:r>
+      <w:r>
+        <w:rPr>
+          <w:rFonts w:ascii="Arial" w:hAnsi="Arial" w:cs="Arial"/>
+        </w:rPr>
+        <w:t xml:space="preserve"> required in today’s data driven</w:t>
+      </w:r>
+      <w:r>
+        <w:rPr>
+          <w:rFonts w:ascii="Arial" w:hAnsi="Arial" w:cs="Arial"/>
+        </w:rPr>
+        <w:t xml:space="preserve"> world,</w:t>
+      </w:r>
+      <w:r>
+        <w:rPr>
+          <w:rFonts w:ascii="Arial" w:hAnsi="Arial" w:cs="Arial"/>
+        </w:rPr>
+        <w:t xml:space="preserve"> including </w:t>
+      </w:r>
+      <w:r>
+        <w:rPr>
+          <w:rFonts w:ascii="Arial" w:hAnsi="Arial" w:cs="Arial"/>
+        </w:rPr>
+        <w:t xml:space="preserve">programming, data visualisation, data analysis and </w:t>
+      </w:r>
+      <w:r>
+        <w:rPr>
+          <w:rFonts w:ascii="Arial" w:hAnsi="Arial" w:cs="Arial"/>
+        </w:rPr>
+        <w:t>communication.</w:t>
+      </w:r>
+      <w:r>
+        <w:rPr>
+          <w:rFonts w:ascii="Arial" w:hAnsi="Arial" w:cs="Arial"/>
+        </w:rPr>
+        <w:t xml:space="preserve"> </w:t>
+      </w:r>
+    </w:p>
+    <w:p>
+      <w:pPr>
+        <w:rPr>
+          <w:rFonts w:ascii="Arial" w:hAnsi="Arial" w:cs="Arial"/>
+        </w:rPr>
+      </w:pPr>
+      <w:r>
+        <w:rPr>
+          <w:rFonts w:ascii="Arial" w:hAnsi="Arial" w:cs="Arial"/>
+        </w:rPr>
+        <w:t xml:space="preserve">The </w:t>
+      </w:r>
+      <w:r>
+        <w:rPr>
+          <w:rFonts w:ascii="Arial" w:hAnsi="Arial" w:cs="Arial"/>
+        </w:rPr>
+        <w:t>award</w:t>
+      </w:r>
+      <w:r>
+        <w:rPr>
+          <w:rFonts w:ascii="Arial" w:hAnsi="Arial" w:cs="Arial"/>
+        </w:rPr>
+        <w:t xml:space="preserve"> is completed over two semesters. The first semester focuses on developing programming skills</w:t>
+      </w:r>
+      <w:r>
+        <w:rPr>
+          <w:rFonts w:ascii="Arial" w:hAnsi="Arial" w:cs="Arial"/>
+        </w:rPr>
+        <w:t xml:space="preserve"> using Python</w:t>
+      </w:r>
+      <w:r>
+        <w:rPr>
+          <w:rFonts w:ascii="Arial" w:hAnsi="Arial" w:cs="Arial"/>
+        </w:rPr>
+        <w:t>, while the second semester involves applying this knowledge to complete a group proje</w:t>
+      </w:r>
+      <w:r>
+        <w:rPr>
+          <w:rFonts w:ascii="Arial" w:hAnsi="Arial" w:cs="Arial"/>
+        </w:rPr>
+        <w:t xml:space="preserve">ct working with </w:t>
+      </w:r>
+      <w:r>
+        <w:rPr>
+          <w:rFonts w:ascii="Arial" w:hAnsi="Arial" w:cs="Arial"/>
+        </w:rPr>
+        <w:t xml:space="preserve">a </w:t>
+      </w:r>
+      <w:r>
+        <w:rPr>
+          <w:rFonts w:ascii="Arial" w:hAnsi="Arial" w:cs="Arial"/>
+        </w:rPr>
+        <w:t>real-life</w:t>
+      </w:r>
+      <w:r>
+        <w:rPr>
+          <w:rFonts w:ascii="Arial" w:hAnsi="Arial" w:cs="Arial"/>
+        </w:rPr>
+        <w:t xml:space="preserve"> data</w:t>
+      </w:r>
+      <w:r>
+        <w:rPr>
+          <w:rFonts w:ascii="Arial" w:hAnsi="Arial" w:cs="Arial"/>
+        </w:rPr>
+        <w:t>set</w:t>
+      </w:r>
+      <w:r>
+        <w:rPr>
+          <w:rFonts w:ascii="Arial" w:hAnsi="Arial" w:cs="Arial"/>
+        </w:rPr>
+        <w:t>.</w:t>
+      </w:r>
+    </w:p>
+    <w:p>
+      <w:pPr>
+        <w:numPr>
+          <w:ilvl w:val="1"/>
+          <w:numId w:val="5"/>
+        </w:numPr>
+        <w:rPr>
+          <w:rFonts w:ascii="Arial" w:hAnsi="Arial" w:cs="Arial"/>
+        </w:rPr>
+      </w:pPr>
+      <w:r>
+        <w:rPr>
+          <w:rFonts w:ascii="Arial" w:hAnsi="Arial" w:cs="Arial"/>
+        </w:rPr>
+        <w:t>Importance of data science in the current industry.</w:t>
+      </w:r>
+    </w:p>
+    <w:p>
+      <w:pPr>
+        <w:rPr>
+          <w:rFonts w:eastAsiaTheme="minorEastAsia"/>
+        </w:rPr>
+      </w:pPr>
+      <w:r>
+        <w:rPr>
+          <w:rFonts w:eastAsiaTheme="minorEastAsia"/>
+        </w:rPr>
+        <w:t xml:space="preserve">As the volume of data available has grown and technology has advanced, organisations have increasingly been using data to gain a competitive advantage. Studies have shown that organisations who effectively use data are more profitable and efficient, have higher levels of customer loyalty and employee satisfaction and are more resilient to external challenges such as recessions (Bak, 2023). </w:t>
+      </w:r>
+      <w:r>
+        <w:rPr>
+          <w:rFonts w:eastAsiaTheme="minorEastAsia"/>
+        </w:rPr>
+        <w:t>To realise these benefits, organisations need the right technology and a skilled workforce to turn their data into actionable insights</w:t>
+      </w:r>
+      <w:r>
+        <w:rPr>
+          <w:rFonts w:eastAsiaTheme="minorEastAsia"/>
+        </w:rPr>
+        <w:t>.</w:t>
       </w:r>
     </w:p>
     <w:p>
@@ -827,7 +590,7 @@
           <w:b/>
           <w:bCs/>
         </w:rPr>
-        <w:t>Team Collaboration:</w:t>
+        <w:t>Project Overview:</w:t>
       </w:r>
     </w:p>
     <w:p>
@@ -844,58 +607,19 @@
         <w:rPr>
           <w:rFonts w:ascii="Arial" w:hAnsi="Arial" w:cs="Arial"/>
         </w:rPr>
-        <w:t>List of team members and their roles.</w:t>
-      </w:r>
-    </w:p>
-    <w:p>
-      <w:pPr>
-        <w:numPr>
-          <w:ilvl w:val="2"/>
-          <w:numId w:val="5"/>
-        </w:numPr>
-        <w:rPr>
-          <w:rFonts w:ascii="Arial" w:hAnsi="Arial" w:cs="Arial"/>
-        </w:rPr>
-      </w:pPr>
-      <w:r>
-        <w:rPr>
-          <w:rFonts w:ascii="Arial" w:hAnsi="Arial" w:cs="Arial"/>
-        </w:rPr>
-        <w:t>James Murphy (Team Leader &amp; Quality Control)</w:t>
-      </w:r>
-    </w:p>
-    <w:p>
-      <w:pPr>
-        <w:numPr>
-          <w:ilvl w:val="2"/>
-          <w:numId w:val="5"/>
-        </w:numPr>
-        <w:rPr>
-          <w:rFonts w:ascii="Arial" w:hAnsi="Arial" w:cs="Arial"/>
-        </w:rPr>
-      </w:pPr>
-      <w:r>
-        <w:rPr>
-          <w:rFonts w:ascii="Arial" w:hAnsi="Arial" w:cs="Arial"/>
-        </w:rPr>
-        <w:t>Anna Bekesi (Analyst &amp; Documentation Coordinator)</w:t>
-      </w:r>
-    </w:p>
-    <w:p>
-      <w:pPr>
-        <w:numPr>
-          <w:ilvl w:val="2"/>
-          <w:numId w:val="5"/>
-        </w:numPr>
-        <w:rPr>
-          <w:rFonts w:ascii="Arial" w:hAnsi="Arial" w:cs="Arial"/>
-        </w:rPr>
-      </w:pPr>
-      <w:r>
-        <w:rPr>
-          <w:rFonts w:ascii="Arial" w:hAnsi="Arial" w:cs="Arial"/>
-        </w:rPr>
-        <w:t>Callum Rennie (Data Visualisation)</w:t>
+        <w:t>Description of the project undertaken.</w:t>
+      </w:r>
+    </w:p>
+    <w:p>
+      <w:pPr>
+        <w:spacing w:line="276" w:lineRule="auto"/>
+      </w:pPr>
+      <w:r>
+        <w:rPr>
+          <w:rFonts w:ascii="Arial" w:eastAsia="Arial" w:hAnsi="Arial" w:cs="Arial"/>
+        </w:rPr>
+        <w:lastRenderedPageBreak/>
+        <w:t>Chess Grandmaster Ben Finegold has strongly contended that studying chess openings and the choice of opening used in a game is completely irrelevant for low-rated players (under 2000 Elo). Instead, he states that the moves and tactics used later in the game are what determine match outcomes at this level.</w:t>
       </w:r>
     </w:p>
     <w:p>
@@ -920,285 +644,342 @@
         <w:rPr>
           <w:rFonts w:ascii="Arial" w:hAnsi="Arial" w:cs="Arial"/>
         </w:rPr>
-        <w:t>Tools used for communication and collaboration (e.g., Microsoft Teams, Slack).</w:t>
-      </w:r>
-    </w:p>
-    <w:p>
-      <w:pPr>
-        <w:numPr>
-          <w:ilvl w:val="2"/>
-          <w:numId w:val="5"/>
-        </w:numPr>
-        <w:rPr>
-          <w:rFonts w:ascii="Arial" w:hAnsi="Arial" w:cs="Arial"/>
-        </w:rPr>
-      </w:pPr>
-      <w:r>
-        <w:rPr>
-          <w:rFonts w:ascii="Arial" w:hAnsi="Arial" w:cs="Arial"/>
-        </w:rPr>
-        <w:t xml:space="preserve">The team met every Wednesday evening on MS Teams to discuss our progress in the last week and to </w:t>
-      </w:r>
-      <w:r>
-        <w:rPr>
-          <w:rFonts w:ascii="Arial" w:hAnsi="Arial" w:cs="Arial"/>
-        </w:rPr>
-        <w:t>identify</w:t>
-      </w:r>
-      <w:r>
-        <w:rPr>
-          <w:rFonts w:ascii="Arial" w:hAnsi="Arial" w:cs="Arial"/>
-        </w:rPr>
-        <w:t xml:space="preserve"> next steps and assign act</w:t>
-      </w:r>
-      <w:r>
-        <w:rPr>
-          <w:rFonts w:ascii="Arial" w:hAnsi="Arial" w:cs="Arial"/>
-        </w:rPr>
-        <w:t xml:space="preserve">ions to each team member. Out with the weekly meetings, team members could communicate through our private MS </w:t>
-      </w:r>
-      <w:r>
-        <w:rPr>
-          <w:rFonts w:ascii="Arial" w:hAnsi="Arial" w:cs="Arial"/>
-        </w:rPr>
-        <w:t>teams'</w:t>
-      </w:r>
-      <w:r>
-        <w:rPr>
-          <w:rFonts w:ascii="Arial" w:hAnsi="Arial" w:cs="Arial"/>
-        </w:rPr>
-        <w:t xml:space="preserve"> channel, to</w:t>
-      </w:r>
-      <w:r>
-        <w:rPr>
-          <w:rFonts w:ascii="Arial" w:hAnsi="Arial" w:cs="Arial"/>
-        </w:rPr>
-        <w:t xml:space="preserve"> ask questions, provide support and share resources.</w:t>
-      </w:r>
-    </w:p>
-    <w:p>
-      <w:pPr>
-        <w:ind w:left="2160"/>
-        <w:rPr>
-          <w:rFonts w:ascii="Arial" w:hAnsi="Arial" w:cs="Arial"/>
-        </w:rPr>
-      </w:pPr>
-    </w:p>
-    <w:p w14:noSpellErr="1">
-      <w:pPr>
-        <w:numPr>
-          <w:ilvl w:val="1"/>
-          <w:numId w:val="5"/>
-        </w:numPr>
-        <w:rPr>
-          <w:rFonts w:ascii="Arial" w:hAnsi="Arial" w:cs="Arial"/>
-        </w:rPr>
-      </w:pPr>
-      <w:r>
-        <w:rPr>
-          <w:rFonts w:ascii="Arial" w:hAnsi="Arial" w:cs="Arial"/>
-        </w:rPr>
-        <w:t xml:space="preserve">Methods and software used for </w:t>
-      </w:r>
-      <w:r>
-        <w:rPr>
-          <w:rFonts w:ascii="Arial" w:hAnsi="Arial" w:cs="Arial"/>
-        </w:rPr>
-        <w:t xml:space="preserve">the scheduling of the project tasks, </w:t>
-      </w:r>
-      <w:r>
-        <w:rPr>
-          <w:rFonts w:ascii="Arial" w:hAnsi="Arial" w:cs="Arial"/>
-        </w:rPr>
-        <w:t>roles</w:t>
-      </w:r>
-      <w:r>
-        <w:rPr>
-          <w:rFonts w:ascii="Arial" w:hAnsi="Arial" w:cs="Arial"/>
-        </w:rPr>
-        <w:t xml:space="preserve"> and </w:t>
-      </w:r>
-      <w:r>
-        <w:rPr>
-          <w:rFonts w:ascii="Arial" w:hAnsi="Arial" w:cs="Arial"/>
-        </w:rPr>
-        <w:t>responsibilities</w:t>
-      </w:r>
-    </w:p>
-    <w:p>
-      <w:pPr>
-        <w:numPr>
-          <w:ilvl w:val="2"/>
-          <w:numId w:val="5"/>
-        </w:numPr>
-        <w:rPr>
-          <w:rFonts w:ascii="Arial" w:hAnsi="Arial" w:cs="Arial"/>
-        </w:rPr>
-      </w:pPr>
-      <w:r>
-        <w:rPr>
-          <w:rFonts w:ascii="Arial" w:hAnsi="Arial" w:cs="Arial"/>
-        </w:rPr>
-        <w:t xml:space="preserve">At the start of the project, our team </w:t>
-      </w:r>
-      <w:r>
-        <w:rPr>
-          <w:rFonts w:ascii="Arial" w:hAnsi="Arial" w:cs="Arial"/>
-        </w:rPr>
-        <w:t>identified</w:t>
-      </w:r>
-      <w:r>
-        <w:rPr>
-          <w:rFonts w:ascii="Arial" w:hAnsi="Arial" w:cs="Arial"/>
-        </w:rPr>
-        <w:t xml:space="preserve"> the main steps involved in the project and set deadlines for each step. This information was used to create a plan on Micros</w:t>
-      </w:r>
-      <w:r>
-        <w:rPr>
-          <w:rFonts w:ascii="Arial" w:hAnsi="Arial" w:cs="Arial"/>
-        </w:rPr>
-        <w:t xml:space="preserve">oft Planner. </w:t>
-      </w:r>
-      <w:r>
-        <w:rPr>
-          <w:rFonts w:ascii="Arial" w:hAnsi="Arial" w:cs="Arial"/>
-        </w:rPr>
-        <w:t xml:space="preserve">Using </w:t>
-      </w:r>
-      <w:r>
-        <w:rPr>
-          <w:rFonts w:ascii="Arial" w:hAnsi="Arial" w:cs="Arial"/>
-        </w:rPr>
-        <w:t>planner,</w:t>
-      </w:r>
-      <w:r>
-        <w:rPr>
-          <w:rFonts w:ascii="Arial" w:hAnsi="Arial" w:cs="Arial"/>
-        </w:rPr>
-        <w:t xml:space="preserve"> we could set deadlines and assign responsibility to team members for different tasks. At our weekly meeting we reviewed</w:t>
-      </w:r>
-      <w:r>
-        <w:rPr>
-          <w:rFonts w:ascii="Arial" w:hAnsi="Arial" w:cs="Arial"/>
-        </w:rPr>
-        <w:t xml:space="preserve"> the pla</w:t>
-      </w:r>
-      <w:r>
-        <w:rPr>
-          <w:rFonts w:ascii="Arial" w:hAnsi="Arial" w:cs="Arial"/>
-        </w:rPr>
-        <w:t xml:space="preserve">nner to ensure we </w:t>
-      </w:r>
-      <w:r>
-        <w:rPr>
-          <w:rFonts w:ascii="Arial" w:hAnsi="Arial" w:cs="Arial"/>
-        </w:rPr>
-        <w:t>remained</w:t>
-      </w:r>
-      <w:r>
-        <w:rPr>
-          <w:rFonts w:ascii="Arial" w:hAnsi="Arial" w:cs="Arial"/>
-        </w:rPr>
-        <w:t xml:space="preserve"> on track.</w:t>
-      </w:r>
-    </w:p>
-    <w:p>
-      <w:pPr>
-        <w:numPr>
-          <w:ilvl w:val="1"/>
-          <w:numId w:val="5"/>
-        </w:numPr>
-        <w:rPr>
-          <w:rFonts w:ascii="Arial" w:hAnsi="Arial" w:cs="Arial"/>
-        </w:rPr>
-      </w:pPr>
-      <w:r>
-        <w:rPr>
-          <w:rFonts w:ascii="Arial" w:hAnsi="Arial" w:cs="Arial"/>
-        </w:rPr>
-        <w:t>Source control systems used (e.g., Git).</w:t>
-      </w:r>
-    </w:p>
-    <w:p>
-      <w:pPr>
-        <w:numPr>
-          <w:ilvl w:val="2"/>
-          <w:numId w:val="5"/>
-        </w:numPr>
-        <w:rPr>
-          <w:rFonts w:ascii="Arial" w:hAnsi="Arial" w:cs="Arial"/>
-        </w:rPr>
-      </w:pPr>
-      <w:r>
-        <w:rPr>
-          <w:rFonts w:ascii="Arial" w:hAnsi="Arial" w:cs="Arial"/>
-        </w:rPr>
-        <w:t>The team used GitHub for source control.</w:t>
-      </w:r>
-    </w:p>
-    <w:p>
-      <w:pPr>
-        <w:rPr>
-          <w:rFonts w:ascii="Arial" w:hAnsi="Arial" w:cs="Arial"/>
-        </w:rPr>
-      </w:pPr>
-    </w:p>
-    <w:p>
-      <w:pPr>
-        <w:numPr>
-          <w:ilvl w:val="0"/>
-          <w:numId w:val="5"/>
-        </w:numPr>
-        <w:rPr>
-          <w:rFonts w:ascii="Arial" w:hAnsi="Arial" w:cs="Arial"/>
-        </w:rPr>
-      </w:pPr>
-      <w:r>
+        <w:t>Objectives and goals of the project.</w:t>
+      </w:r>
+    </w:p>
+    <w:p>
+      <w:pPr>
+        <w:spacing w:line="276" w:lineRule="auto"/>
+      </w:pPr>
+      <w:r>
+        <w:rPr>
+          <w:rFonts w:ascii="Arial" w:eastAsia="Arial" w:hAnsi="Arial" w:cs="Arial"/>
+        </w:rPr>
+        <w:t>To examine this claim empirically, this project investigates how playing uncommon openings affect match outcome compared to playing common openings.</w:t>
+      </w:r>
+    </w:p>
+    <w:p>
+      <w:pPr>
+        <w:rPr>
+          <w:rFonts w:ascii="Arial" w:hAnsi="Arial" w:cs="Arial"/>
+        </w:rPr>
+      </w:pPr>
+    </w:p>
+    <w:p>
+      <w:pPr>
         <w:rPr>
           <w:rFonts w:ascii="Arial" w:hAnsi="Arial" w:cs="Arial"/>
           <w:b/>
           <w:bCs/>
         </w:rPr>
+      </w:pPr>
+      <w:r>
+        <w:rPr>
+          <w:rFonts w:ascii="Arial" w:hAnsi="Arial" w:cs="Arial"/>
+          <w:b/>
+          <w:bCs/>
+        </w:rPr>
+        <w:t>5. Methodology</w:t>
+      </w:r>
+    </w:p>
+    <w:p>
+      <w:pPr>
+        <w:numPr>
+          <w:ilvl w:val="0"/>
+          <w:numId w:val="6"/>
+        </w:numPr>
+        <w:rPr>
+          <w:rFonts w:ascii="Arial" w:hAnsi="Arial" w:cs="Arial"/>
+        </w:rPr>
+      </w:pPr>
+      <w:r>
+        <w:rPr>
+          <w:rFonts w:ascii="Arial" w:hAnsi="Arial" w:cs="Arial"/>
+          <w:b/>
+          <w:bCs/>
+        </w:rPr>
+        <w:t>Team Collaboration:</w:t>
+      </w:r>
+    </w:p>
+    <w:p>
+      <w:pPr>
+        <w:numPr>
+          <w:ilvl w:val="1"/>
+          <w:numId w:val="6"/>
+        </w:numPr>
+        <w:rPr>
+          <w:rFonts w:ascii="Arial" w:hAnsi="Arial" w:cs="Arial"/>
+        </w:rPr>
+      </w:pPr>
+      <w:r>
+        <w:rPr>
+          <w:rFonts w:ascii="Arial" w:hAnsi="Arial" w:cs="Arial"/>
+        </w:rPr>
+        <w:t>List of team members and their roles.</w:t>
+      </w:r>
+    </w:p>
+    <w:p>
+      <w:pPr>
+        <w:numPr>
+          <w:ilvl w:val="2"/>
+          <w:numId w:val="6"/>
+        </w:numPr>
+        <w:rPr>
+          <w:rFonts w:ascii="Arial" w:hAnsi="Arial" w:cs="Arial"/>
+        </w:rPr>
+      </w:pPr>
+      <w:r>
+        <w:rPr>
+          <w:rFonts w:ascii="Arial" w:hAnsi="Arial" w:cs="Arial"/>
+        </w:rPr>
+        <w:t>James Murphy (Team Leader &amp; Quality Control)</w:t>
+      </w:r>
+    </w:p>
+    <w:p>
+      <w:pPr>
+        <w:numPr>
+          <w:ilvl w:val="2"/>
+          <w:numId w:val="6"/>
+        </w:numPr>
+        <w:rPr>
+          <w:rFonts w:ascii="Arial" w:hAnsi="Arial" w:cs="Arial"/>
+        </w:rPr>
+      </w:pPr>
+      <w:r>
+        <w:rPr>
+          <w:rFonts w:ascii="Arial" w:hAnsi="Arial" w:cs="Arial"/>
+        </w:rPr>
+        <w:t>Anna Bekesi (Analyst &amp; Documentation Coordinator)</w:t>
+      </w:r>
+    </w:p>
+    <w:p>
+      <w:pPr>
+        <w:numPr>
+          <w:ilvl w:val="2"/>
+          <w:numId w:val="6"/>
+        </w:numPr>
+        <w:rPr>
+          <w:rFonts w:ascii="Arial" w:hAnsi="Arial" w:cs="Arial"/>
+        </w:rPr>
+      </w:pPr>
+      <w:r>
+        <w:rPr>
+          <w:rFonts w:ascii="Arial" w:hAnsi="Arial" w:cs="Arial"/>
+        </w:rPr>
+        <w:t>Callum Rennie (Data Visualisation)</w:t>
+      </w:r>
+    </w:p>
+    <w:p>
+      <w:pPr>
+        <w:ind w:left="720"/>
+        <w:rPr>
+          <w:rFonts w:ascii="Arial" w:hAnsi="Arial" w:cs="Arial"/>
+        </w:rPr>
+      </w:pPr>
+    </w:p>
+    <w:p>
+      <w:pPr>
+        <w:numPr>
+          <w:ilvl w:val="1"/>
+          <w:numId w:val="6"/>
+        </w:numPr>
+        <w:rPr>
+          <w:rFonts w:ascii="Arial" w:hAnsi="Arial" w:cs="Arial"/>
+        </w:rPr>
+      </w:pPr>
+      <w:r>
+        <w:rPr>
+          <w:rFonts w:ascii="Arial" w:hAnsi="Arial" w:cs="Arial"/>
+        </w:rPr>
+        <w:t>Tools used for communication and collaboration (e.g., Microsoft Teams, Slack).</w:t>
+      </w:r>
+    </w:p>
+    <w:p>
+      <w:pPr>
+        <w:numPr>
+          <w:ilvl w:val="2"/>
+          <w:numId w:val="6"/>
+        </w:numPr>
+        <w:rPr>
+          <w:rFonts w:ascii="Arial" w:hAnsi="Arial" w:cs="Arial"/>
+        </w:rPr>
+      </w:pPr>
+      <w:r>
+        <w:rPr>
+          <w:rFonts w:ascii="Arial" w:hAnsi="Arial" w:cs="Arial"/>
+        </w:rPr>
+        <w:t>The team met every Wednesday evening on MS Teams to discuss our progress in the last week and to identify next steps and assign act</w:t>
+      </w:r>
+      <w:r>
+        <w:rPr>
+          <w:rFonts w:ascii="Arial" w:hAnsi="Arial" w:cs="Arial"/>
+        </w:rPr>
+        <w:t xml:space="preserve">ions to each team member. Out with the weekly meetings, team members could communicate through our private MS </w:t>
+      </w:r>
+      <w:r>
+        <w:rPr>
+          <w:rFonts w:ascii="Arial" w:hAnsi="Arial" w:cs="Arial"/>
+        </w:rPr>
+        <w:t>teams'</w:t>
+      </w:r>
+      <w:r>
+        <w:rPr>
+          <w:rFonts w:ascii="Arial" w:hAnsi="Arial" w:cs="Arial"/>
+        </w:rPr>
+        <w:t xml:space="preserve"> channel, to</w:t>
+      </w:r>
+      <w:r>
+        <w:rPr>
+          <w:rFonts w:ascii="Arial" w:hAnsi="Arial" w:cs="Arial"/>
+        </w:rPr>
+        <w:t xml:space="preserve"> ask questions, provide support and share resources.</w:t>
+      </w:r>
+    </w:p>
+    <w:p>
+      <w:pPr>
+        <w:ind w:left="2160"/>
+        <w:rPr>
+          <w:rFonts w:ascii="Arial" w:hAnsi="Arial" w:cs="Arial"/>
+        </w:rPr>
+      </w:pPr>
+    </w:p>
+    <w:p>
+      <w:pPr>
+        <w:numPr>
+          <w:ilvl w:val="1"/>
+          <w:numId w:val="6"/>
+        </w:numPr>
+        <w:rPr>
+          <w:rFonts w:ascii="Arial" w:hAnsi="Arial" w:cs="Arial"/>
+        </w:rPr>
+      </w:pPr>
+      <w:r>
+        <w:rPr>
+          <w:rFonts w:ascii="Arial" w:hAnsi="Arial" w:cs="Arial"/>
+        </w:rPr>
+        <w:t xml:space="preserve">Methods and software used for </w:t>
+      </w:r>
+      <w:r>
+        <w:rPr>
+          <w:rFonts w:ascii="Arial" w:hAnsi="Arial" w:cs="Arial"/>
+        </w:rPr>
+        <w:t xml:space="preserve">the scheduling of the project tasks, roles and </w:t>
+      </w:r>
+      <w:r>
+        <w:rPr>
+          <w:rFonts w:ascii="Arial" w:hAnsi="Arial" w:cs="Arial"/>
+        </w:rPr>
+        <w:t>responsibilities</w:t>
+      </w:r>
+    </w:p>
+    <w:p>
+      <w:pPr>
+        <w:numPr>
+          <w:ilvl w:val="2"/>
+          <w:numId w:val="6"/>
+        </w:numPr>
+        <w:rPr>
+          <w:rFonts w:ascii="Arial" w:hAnsi="Arial" w:cs="Arial"/>
+        </w:rPr>
+      </w:pPr>
+      <w:r>
+        <w:rPr>
+          <w:rFonts w:ascii="Arial" w:hAnsi="Arial" w:cs="Arial"/>
+        </w:rPr>
+        <w:t>At the start of the project, our team identified the main steps involved in the project and set deadlines for each step. This information was used to create a plan on Micros</w:t>
+      </w:r>
+      <w:r>
+        <w:rPr>
+          <w:rFonts w:ascii="Arial" w:hAnsi="Arial" w:cs="Arial"/>
+        </w:rPr>
+        <w:t xml:space="preserve">oft Planner. </w:t>
+      </w:r>
+      <w:r>
+        <w:rPr>
+          <w:rFonts w:ascii="Arial" w:hAnsi="Arial" w:cs="Arial"/>
+        </w:rPr>
+        <w:t>Using planner, we could set deadlines and assign responsibility to team members for different tasks. At our weekly meeting we reviewed the planner to ensure we remained on track.</w:t>
+      </w:r>
+    </w:p>
+    <w:p>
+      <w:pPr>
+        <w:numPr>
+          <w:ilvl w:val="1"/>
+          <w:numId w:val="6"/>
+        </w:numPr>
+        <w:rPr>
+          <w:rFonts w:ascii="Arial" w:hAnsi="Arial" w:cs="Arial"/>
+        </w:rPr>
+      </w:pPr>
+      <w:r>
+        <w:rPr>
+          <w:rFonts w:ascii="Arial" w:hAnsi="Arial" w:cs="Arial"/>
+        </w:rPr>
+        <w:t>Source control systems used (e.g., Git).</w:t>
+      </w:r>
+    </w:p>
+    <w:p>
+      <w:pPr>
+        <w:numPr>
+          <w:ilvl w:val="2"/>
+          <w:numId w:val="6"/>
+        </w:numPr>
+        <w:rPr>
+          <w:rFonts w:ascii="Arial" w:hAnsi="Arial" w:cs="Arial"/>
+        </w:rPr>
+      </w:pPr>
+      <w:r>
+        <w:rPr>
+          <w:rFonts w:ascii="Arial" w:hAnsi="Arial" w:cs="Arial"/>
+        </w:rPr>
+        <w:t>The team used GitHub for source control.</w:t>
+      </w:r>
+    </w:p>
+    <w:p>
+      <w:pPr>
+        <w:rPr>
+          <w:rFonts w:ascii="Arial" w:hAnsi="Arial" w:cs="Arial"/>
+        </w:rPr>
+      </w:pPr>
+    </w:p>
+    <w:p>
+      <w:pPr>
+        <w:numPr>
+          <w:ilvl w:val="0"/>
+          <w:numId w:val="6"/>
+        </w:numPr>
+        <w:rPr>
+          <w:rFonts w:ascii="Arial" w:hAnsi="Arial" w:cs="Arial"/>
+        </w:rPr>
+      </w:pPr>
+      <w:r>
+        <w:rPr>
+          <w:rFonts w:ascii="Arial" w:hAnsi="Arial" w:cs="Arial"/>
+          <w:b/>
+          <w:bCs/>
+        </w:rPr>
         <w:t>Data Collection:</w:t>
       </w:r>
     </w:p>
     <w:p>
       <w:pPr>
+        <w:pStyle w:val="ListParagraph"/>
         <w:numPr>
           <w:ilvl w:val="1"/>
-          <w:numId w:val="5"/>
-        </w:numPr>
-        <w:rPr>
-          <w:rFonts w:ascii="Arial" w:hAnsi="Arial" w:cs="Arial"/>
-        </w:rPr>
-      </w:pPr>
-      <w:r>
-        <w:rPr>
-          <w:rFonts w:ascii="Arial" w:hAnsi="Arial" w:cs="Arial"/>
-        </w:rPr>
-        <w:t>Description of data sources.</w:t>
-      </w:r>
-    </w:p>
-    <w:p>
-      <w:pPr>
-        <w:numPr>
-          <w:ilvl w:val="2"/>
-          <w:numId w:val="5"/>
-        </w:numPr>
-        <w:rPr>
-          <w:rFonts w:ascii="Arial" w:hAnsi="Arial" w:eastAsia="Arial" w:cs="Arial"/>
-          <w:noProof w:val="0"/>
-          <w:sz w:val="24"/>
-          <w:szCs w:val="24"/>
-          <w:lang w:val="en-GB"/>
-        </w:rPr>
-      </w:pPr>
+          <w:numId w:val="6"/>
+        </w:numPr>
+        <w:rPr>
+          <w:rFonts w:ascii="Arial" w:eastAsia="Arial" w:hAnsi="Arial" w:cs="Arial"/>
+        </w:rPr>
+      </w:pPr>
+      <w:proofErr w:type="spellStart"/>
       <w:r>
         <w:rPr>
           <w:rFonts w:ascii="Arial" w:hAnsi="Arial" w:cs="Arial"/>
         </w:rPr>
         <w:t>Lichess</w:t>
       </w:r>
+      <w:proofErr w:type="spellEnd"/>
       <w:r>
         <w:rPr>
           <w:rFonts w:ascii="Arial" w:hAnsi="Arial" w:cs="Arial"/>
@@ -1223,67 +1004,259 @@
         </w:rPr>
         <w:t>. It is one of the most popular chess websites in the world, where more than 5 million games take place each day (</w:t>
       </w:r>
-      <w:hyperlink r:id="Re75e20ebb57c4a03">
+      <w:hyperlink r:id="rId8">
         <w:r>
           <w:rPr>
             <w:rStyle w:val="Hyperlink"/>
-            <w:rFonts w:ascii="Arial" w:hAnsi="Arial" w:eastAsia="Arial" w:cs="Arial"/>
-            <w:noProof w:val="0"/>
-            <w:sz w:val="24"/>
-            <w:szCs w:val="24"/>
-            <w:lang w:val="en-GB"/>
+            <w:rFonts w:ascii="Arial" w:eastAsia="Arial" w:hAnsi="Arial" w:cs="Arial"/>
           </w:rPr>
           <w:t>About lichess.org • lichess.org).</w:t>
         </w:r>
       </w:hyperlink>
+      <w:r>
+        <w:rPr>
+          <w:rFonts w:ascii="Arial" w:eastAsia="Arial" w:hAnsi="Arial" w:cs="Arial"/>
+        </w:rPr>
+        <w:t xml:space="preserve"> </w:t>
+      </w:r>
+      <w:r>
+        <w:rPr>
+          <w:rFonts w:ascii="Arial" w:eastAsia="Arial" w:hAnsi="Arial" w:cs="Arial"/>
+        </w:rPr>
+        <w:t xml:space="preserve">Puzzles and lessons are </w:t>
+      </w:r>
+      <w:r>
+        <w:rPr>
+          <w:rFonts w:ascii="Arial" w:eastAsia="Arial" w:hAnsi="Arial" w:cs="Arial"/>
+        </w:rPr>
+        <w:t xml:space="preserve">also </w:t>
+      </w:r>
+      <w:r>
+        <w:rPr>
+          <w:rFonts w:ascii="Arial" w:eastAsia="Arial" w:hAnsi="Arial" w:cs="Arial"/>
+        </w:rPr>
+        <w:t xml:space="preserve">available for registered users </w:t>
+      </w:r>
+      <w:r>
+        <w:rPr>
+          <w:rFonts w:ascii="Arial" w:eastAsia="Arial" w:hAnsi="Arial" w:cs="Arial"/>
+        </w:rPr>
+        <w:lastRenderedPageBreak/>
+        <w:t>as well.</w:t>
+      </w:r>
+      <w:r>
+        <w:rPr>
+          <w:rFonts w:ascii="Arial" w:eastAsia="Arial" w:hAnsi="Arial" w:cs="Arial"/>
+        </w:rPr>
+        <w:t xml:space="preserve"> In addition, t</w:t>
+      </w:r>
+      <w:r>
+        <w:rPr>
+          <w:rFonts w:ascii="Arial" w:eastAsia="Arial" w:hAnsi="Arial" w:cs="Arial"/>
+        </w:rPr>
+        <w:t>he website hosts tournaments with the option for live viewing of the matche</w:t>
+      </w:r>
+      <w:r>
+        <w:rPr>
+          <w:rFonts w:ascii="Arial" w:eastAsia="Arial" w:hAnsi="Arial" w:cs="Arial"/>
+        </w:rPr>
+        <w:t xml:space="preserve">s. </w:t>
+      </w:r>
+    </w:p>
+    <w:p>
+      <w:pPr>
+        <w:numPr>
+          <w:ilvl w:val="1"/>
+          <w:numId w:val="6"/>
+        </w:numPr>
+      </w:pPr>
+      <w:r>
+        <w:rPr>
+          <w:rFonts w:ascii="Arial" w:eastAsia="Arial" w:hAnsi="Arial" w:cs="Arial"/>
+        </w:rPr>
+        <w:t xml:space="preserve">Our project uses data available through </w:t>
+      </w:r>
+      <w:proofErr w:type="spellStart"/>
+      <w:r>
+        <w:rPr>
+          <w:rFonts w:ascii="Arial" w:eastAsia="Arial" w:hAnsi="Arial" w:cs="Arial"/>
+        </w:rPr>
+        <w:t>Lichess.org’s</w:t>
+      </w:r>
+      <w:proofErr w:type="spellEnd"/>
+      <w:r>
+        <w:rPr>
+          <w:rFonts w:ascii="Arial" w:eastAsia="Arial" w:hAnsi="Arial" w:cs="Arial"/>
+        </w:rPr>
+        <w:t xml:space="preserve"> API. </w:t>
+      </w:r>
+      <w:r>
+        <w:rPr>
+          <w:rFonts w:ascii="Arial" w:eastAsia="Arial" w:hAnsi="Arial" w:cs="Arial"/>
+        </w:rPr>
+        <w:t>This</w:t>
+      </w:r>
+      <w:r>
+        <w:rPr>
+          <w:rFonts w:ascii="Arial" w:eastAsia="Arial" w:hAnsi="Arial" w:cs="Arial"/>
+        </w:rPr>
+        <w:t xml:space="preserve"> data </w:t>
+      </w:r>
+      <w:r>
+        <w:rPr>
+          <w:rFonts w:ascii="Arial" w:eastAsia="Arial" w:hAnsi="Arial" w:cs="Arial"/>
+        </w:rPr>
+        <w:t xml:space="preserve">is </w:t>
+      </w:r>
+      <w:r>
+        <w:rPr>
+          <w:rFonts w:ascii="Arial" w:eastAsia="Arial" w:hAnsi="Arial" w:cs="Arial"/>
+        </w:rPr>
+        <w:t xml:space="preserve">downloadable in a </w:t>
+      </w:r>
+      <w:proofErr w:type="spellStart"/>
+      <w:r>
+        <w:rPr>
+          <w:rFonts w:ascii="Arial" w:eastAsia="Arial" w:hAnsi="Arial" w:cs="Arial"/>
+        </w:rPr>
+        <w:t>pgn.zst</w:t>
+      </w:r>
+      <w:proofErr w:type="spellEnd"/>
+      <w:r>
+        <w:rPr>
+          <w:rFonts w:ascii="Arial" w:eastAsia="Arial" w:hAnsi="Arial" w:cs="Arial"/>
+        </w:rPr>
+        <w:t xml:space="preserve"> format</w:t>
+      </w:r>
+      <w:r>
+        <w:rPr>
+          <w:rFonts w:ascii="Arial" w:eastAsia="Arial" w:hAnsi="Arial" w:cs="Arial"/>
+        </w:rPr>
+        <w:t xml:space="preserve"> from </w:t>
+      </w:r>
+      <w:hyperlink r:id="rId9" w:history="1">
+        <w:r>
+          <w:rPr>
+            <w:rStyle w:val="Hyperlink"/>
+          </w:rPr>
+          <w:t>https://database.lichess.org/</w:t>
+        </w:r>
+      </w:hyperlink>
+      <w:r>
+        <w:t xml:space="preserve">. </w:t>
+      </w:r>
+      <w:r>
+        <w:rPr>
+          <w:rFonts w:ascii="Arial" w:hAnsi="Arial" w:cs="Arial"/>
+        </w:rPr>
+        <w:t xml:space="preserve"> </w:t>
+      </w:r>
+      <w:r>
+        <w:rPr>
+          <w:rFonts w:ascii="Arial" w:hAnsi="Arial" w:cs="Arial"/>
+        </w:rPr>
+        <w:t xml:space="preserve">. For this project we decided to use the games that took place between </w:t>
+      </w:r>
+      <w:r>
+        <w:rPr>
+          <w:highlight w:val="yellow"/>
+        </w:rPr>
+        <w:t>01/01/2012 and 31/12/2012</w:t>
+      </w:r>
+      <w:r>
+        <w:rPr>
+          <w:highlight w:val="yellow"/>
+        </w:rPr>
+        <w:t xml:space="preserve">. </w:t>
+      </w:r>
+      <w:r>
+        <w:t>This</w:t>
+      </w:r>
+      <w:r>
+        <w:t xml:space="preserve"> resulted in a dataset with approximately </w:t>
+      </w:r>
+      <w:r>
+        <w:rPr>
+          <w:highlight w:val="yellow"/>
+        </w:rPr>
+        <w:t>120 000</w:t>
+      </w:r>
+      <w:r>
+        <w:t xml:space="preserve"> lines/</w:t>
+      </w:r>
+      <w:r>
+        <w:rPr>
+          <w:highlight w:val="yellow"/>
+        </w:rPr>
+        <w:t>x</w:t>
+      </w:r>
+      <w:r>
+        <w:t xml:space="preserve"> games. To allow for an easier import and data manipulation, </w:t>
+      </w:r>
+      <w:r>
+        <w:t>we filtered the data according the following criteria:</w:t>
+      </w:r>
     </w:p>
     <w:p>
       <w:pPr>
         <w:numPr>
           <w:ilvl w:val="2"/>
-          <w:numId w:val="5"/>
-        </w:numPr>
-        <w:rPr>
-          <w:rFonts w:ascii="Arial" w:hAnsi="Arial" w:eastAsia="Arial" w:cs="Arial"/>
-          <w:noProof w:val="0"/>
-          <w:sz w:val="24"/>
-          <w:szCs w:val="24"/>
-          <w:lang w:val="en-GB"/>
-        </w:rPr>
-      </w:pPr>
-      <w:r>
-        <w:rPr>
-          <w:rFonts w:ascii="Arial" w:hAnsi="Arial" w:eastAsia="Arial" w:cs="Arial"/>
-          <w:noProof w:val="0"/>
-          <w:sz w:val="24"/>
-          <w:szCs w:val="24"/>
-          <w:lang w:val="en-GB"/>
-        </w:rPr>
-        <w:t>Lichess has an API</w:t>
+          <w:numId w:val="6"/>
+        </w:numPr>
+      </w:pPr>
+      <w:r>
+        <w:t>We only kept rated classical games, since bullet or blitz games require different tactics compared to normal games</w:t>
+      </w:r>
+    </w:p>
+    <w:p>
+      <w:pPr>
+        <w:numPr>
+          <w:ilvl w:val="2"/>
+          <w:numId w:val="6"/>
+        </w:numPr>
+      </w:pPr>
+      <w:r>
+        <w:t xml:space="preserve">We filtered out games that ended in a draw, since we chose the outcome of the games as the metric we use to compare the effectiveness of using different openings. </w:t>
+      </w:r>
+    </w:p>
+    <w:p>
+      <w:pPr>
+        <w:numPr>
+          <w:ilvl w:val="2"/>
+          <w:numId w:val="6"/>
+        </w:numPr>
+      </w:pPr>
+      <w:r>
+        <w:t>We filtered out games where the difference between the ELO rating of the white and black player was bigger than 50 since a rating difference bigger than that suggests that one player is more experienced than the other and therefore more likely to win.</w:t>
       </w:r>
     </w:p>
     <w:p>
       <w:pPr>
         <w:numPr>
           <w:ilvl w:val="1"/>
-          <w:numId w:val="5"/>
-        </w:numPr>
-        <w:rPr>
-          <w:rFonts w:ascii="Arial" w:hAnsi="Arial" w:cs="Arial"/>
-        </w:rPr>
-      </w:pPr>
-      <w:r>
-        <w:rPr>
-          <w:rFonts w:ascii="Arial" w:hAnsi="Arial" w:cs="Arial"/>
-        </w:rPr>
-        <w:t>Methods used for data collection.</w:t>
+          <w:numId w:val="6"/>
+        </w:numPr>
+      </w:pPr>
+      <w:r>
+        <w:t>This filtered dataset was saved as a .csv file (</w:t>
+      </w:r>
+      <w:proofErr w:type="spellStart"/>
+      <w:r>
+        <w:t>filtered_chess_games</w:t>
+      </w:r>
+      <w:proofErr w:type="spellEnd"/>
+      <w:r>
+        <w:t>).</w:t>
+      </w:r>
+      <w:r>
+        <w:t xml:space="preserve"> This csv was then further cleaned in the next step of the process.</w:t>
       </w:r>
     </w:p>
     <w:p>
       <w:pPr>
         <w:numPr>
           <w:ilvl w:val="0"/>
-          <w:numId w:val="5"/>
+          <w:numId w:val="6"/>
         </w:numPr>
         <w:rPr>
           <w:rFonts w:ascii="Arial" w:hAnsi="Arial" w:cs="Arial"/>
@@ -1295,42 +1268,283 @@
           <w:b/>
           <w:bCs/>
         </w:rPr>
+        <w:t>Data Cleaning and Transformation:</w:t>
+      </w:r>
+    </w:p>
+    <w:p>
+      <w:pPr>
+        <w:numPr>
+          <w:ilvl w:val="1"/>
+          <w:numId w:val="6"/>
+        </w:numPr>
+        <w:rPr>
+          <w:rFonts w:ascii="Arial" w:hAnsi="Arial" w:cs="Arial"/>
+        </w:rPr>
+      </w:pPr>
+      <w:r>
+        <w:rPr>
+          <w:rFonts w:ascii="Arial" w:hAnsi="Arial" w:cs="Arial"/>
+        </w:rPr>
+        <w:t xml:space="preserve">The main data cleaning was performed using python with the assistance of several packages and functions defined in our scripts (utils.py, paths.py and _init_.py). </w:t>
+      </w:r>
+    </w:p>
+    <w:p>
+      <w:pPr>
+        <w:numPr>
+          <w:ilvl w:val="1"/>
+          <w:numId w:val="6"/>
+        </w:numPr>
+        <w:rPr>
+          <w:rFonts w:ascii="Arial" w:hAnsi="Arial" w:cs="Arial"/>
+        </w:rPr>
+      </w:pPr>
+      <w:r>
+        <w:rPr>
+          <w:rFonts w:ascii="Arial" w:hAnsi="Arial" w:cs="Arial"/>
+        </w:rPr>
+        <w:t>The main cleaning process is saved in our cleaning script (cleaning.py). The steps we have taken are below:</w:t>
+      </w:r>
+    </w:p>
+    <w:p>
+      <w:pPr>
+        <w:numPr>
+          <w:ilvl w:val="2"/>
+          <w:numId w:val="6"/>
+        </w:numPr>
+        <w:rPr>
+          <w:rFonts w:ascii="Arial" w:hAnsi="Arial" w:cs="Arial"/>
+        </w:rPr>
+      </w:pPr>
+      <w:r>
+        <w:rPr>
+          <w:rFonts w:ascii="Arial" w:hAnsi="Arial" w:cs="Arial"/>
+        </w:rPr>
+        <w:t xml:space="preserve">We’ve removed </w:t>
+      </w:r>
+      <w:r>
+        <w:rPr>
+          <w:rFonts w:ascii="Arial" w:hAnsi="Arial" w:cs="Arial"/>
+        </w:rPr>
+        <w:t>duplicates, keeping only the first appearance for white and black players.</w:t>
+      </w:r>
+      <w:r>
+        <w:rPr>
+          <w:rFonts w:ascii="Arial" w:hAnsi="Arial" w:cs="Arial"/>
+        </w:rPr>
+        <w:t xml:space="preserve"> </w:t>
+      </w:r>
+      <w:r>
+        <w:rPr>
+          <w:rFonts w:ascii="Arial" w:hAnsi="Arial" w:cs="Arial"/>
+        </w:rPr>
+        <w:t>We did this to create a unique entry for each player (username)</w:t>
+      </w:r>
+      <w:r>
+        <w:rPr>
+          <w:rFonts w:ascii="Arial" w:hAnsi="Arial" w:cs="Arial"/>
+        </w:rPr>
+        <w:t>, allowing us to not put too much emphasis on one specific player.</w:t>
+      </w:r>
+    </w:p>
+    <w:p>
+      <w:pPr>
+        <w:numPr>
+          <w:ilvl w:val="2"/>
+          <w:numId w:val="6"/>
+        </w:numPr>
+        <w:rPr>
+          <w:rFonts w:ascii="Arial" w:hAnsi="Arial" w:cs="Arial"/>
+        </w:rPr>
+      </w:pPr>
+      <w:r>
+        <w:rPr>
+          <w:rFonts w:ascii="Arial" w:hAnsi="Arial" w:cs="Arial"/>
+        </w:rPr>
+        <w:t>We’ve f</w:t>
+      </w:r>
+      <w:r>
+        <w:rPr>
+          <w:rFonts w:ascii="Arial" w:hAnsi="Arial" w:cs="Arial"/>
+        </w:rPr>
+        <w:t>ilter</w:t>
+      </w:r>
+      <w:r>
+        <w:rPr>
+          <w:rFonts w:ascii="Arial" w:hAnsi="Arial" w:cs="Arial"/>
+        </w:rPr>
+        <w:t>ed</w:t>
+      </w:r>
+      <w:r>
+        <w:rPr>
+          <w:rFonts w:ascii="Arial" w:hAnsi="Arial" w:cs="Arial"/>
+        </w:rPr>
+        <w:t xml:space="preserve"> to only include beginner</w:t>
+      </w:r>
+      <w:r>
+        <w:rPr>
+          <w:rFonts w:ascii="Arial" w:hAnsi="Arial" w:cs="Arial"/>
+        </w:rPr>
+        <w:t xml:space="preserve"> players</w:t>
+      </w:r>
+      <w:r>
+        <w:rPr>
+          <w:rFonts w:ascii="Arial" w:hAnsi="Arial" w:cs="Arial"/>
+        </w:rPr>
+        <w:t xml:space="preserve"> (Elo between 1,000 and 1,500)</w:t>
+      </w:r>
+      <w:r>
+        <w:rPr>
+          <w:rFonts w:ascii="Arial" w:hAnsi="Arial" w:cs="Arial"/>
+        </w:rPr>
+        <w:t xml:space="preserve">. Since we are only interested in low-rated players for our analysis, we excluded players with other Elo ratings. At a higher level of play, openings do not matter as much, there is more emphasis on decisions made in the mid- and end-game, therefore, the relationship between openings and winning are not straightforward (and potentially non-existent). The statement made by Grandmaster </w:t>
+      </w:r>
+      <w:r>
+        <w:rPr>
+          <w:rFonts w:ascii="Arial" w:eastAsia="Arial" w:hAnsi="Arial" w:cs="Arial"/>
+        </w:rPr>
+        <w:t>Ben Finegold</w:t>
+      </w:r>
+      <w:r>
+        <w:rPr>
+          <w:rFonts w:ascii="Arial" w:eastAsia="Arial" w:hAnsi="Arial" w:cs="Arial"/>
+        </w:rPr>
+        <w:t xml:space="preserve"> also only concerns beginner/low-rated players. </w:t>
+      </w:r>
+    </w:p>
+    <w:p>
+      <w:pPr>
+        <w:numPr>
+          <w:ilvl w:val="2"/>
+          <w:numId w:val="6"/>
+        </w:numPr>
+        <w:rPr>
+          <w:rFonts w:ascii="Arial" w:hAnsi="Arial" w:cs="Arial"/>
+        </w:rPr>
+      </w:pPr>
+      <w:r>
+        <w:rPr>
+          <w:rFonts w:ascii="Arial" w:hAnsi="Arial" w:cs="Arial"/>
+        </w:rPr>
+        <w:t xml:space="preserve">We’ve standardised and consolidated opening names by putting variations of the same opening under the same name (including numbered variations and variations in the naming of the same opening). This was done so we can assess those as one and so we have a better overview of the “commonness”/”rarity” of an opening. We left gambits separate, since those variations matter and have different responsibilities. </w:t>
+      </w:r>
+    </w:p>
+    <w:p>
+      <w:pPr>
+        <w:numPr>
+          <w:ilvl w:val="2"/>
+          <w:numId w:val="6"/>
+        </w:numPr>
+        <w:rPr>
+          <w:rFonts w:ascii="Arial" w:hAnsi="Arial" w:cs="Arial"/>
+        </w:rPr>
+      </w:pPr>
+      <w:r>
+        <w:rPr>
+          <w:rFonts w:ascii="Arial" w:hAnsi="Arial" w:cs="Arial"/>
+        </w:rPr>
+        <w:t>We’ve r</w:t>
+      </w:r>
+      <w:r>
+        <w:rPr>
+          <w:rFonts w:ascii="Arial" w:hAnsi="Arial" w:cs="Arial"/>
+        </w:rPr>
+        <w:t>emove</w:t>
+      </w:r>
+      <w:r>
+        <w:rPr>
+          <w:rFonts w:ascii="Arial" w:hAnsi="Arial" w:cs="Arial"/>
+        </w:rPr>
+        <w:t>d</w:t>
+      </w:r>
+      <w:r>
+        <w:rPr>
+          <w:rFonts w:ascii="Arial" w:hAnsi="Arial" w:cs="Arial"/>
+        </w:rPr>
+        <w:t xml:space="preserve"> rows where either white or black Elo rating exceeds 50 points</w:t>
+      </w:r>
+      <w:r>
+        <w:rPr>
+          <w:rFonts w:ascii="Arial" w:hAnsi="Arial" w:cs="Arial"/>
+        </w:rPr>
+        <w:t xml:space="preserve">, so we are not looking at players with vastly different levels of </w:t>
+      </w:r>
+      <w:r>
+        <w:rPr>
+          <w:rFonts w:ascii="Arial" w:hAnsi="Arial" w:cs="Arial"/>
+        </w:rPr>
         <w:lastRenderedPageBreak/>
-        <w:t>Data Cleaning and Transformation:</w:t>
+        <w:t>knowledge. This also allows us to filter out those who have played fewer games on the platform, since the Elo change for those players will be larger after a match, while the platform tries to assign the correct value to the player’s skill level.</w:t>
       </w:r>
     </w:p>
     <w:p>
       <w:pPr>
         <w:numPr>
           <w:ilvl w:val="1"/>
-          <w:numId w:val="5"/>
-        </w:numPr>
-        <w:rPr>
-          <w:rFonts w:ascii="Arial" w:hAnsi="Arial" w:cs="Arial"/>
-        </w:rPr>
-      </w:pPr>
-      <w:r>
-        <w:rPr>
-          <w:rFonts w:ascii="Arial" w:hAnsi="Arial" w:cs="Arial"/>
-        </w:rPr>
-        <w:t>Steps taken to clean and transform the data.</w:t>
-      </w:r>
-    </w:p>
-    <w:p>
-      <w:pPr>
-        <w:numPr>
-          <w:ilvl w:val="1"/>
-          <w:numId w:val="5"/>
-        </w:numPr>
-        <w:rPr>
-          <w:rFonts w:ascii="Arial" w:hAnsi="Arial" w:cs="Arial"/>
-        </w:rPr>
-      </w:pPr>
-      <w:r>
-        <w:rPr>
-          <w:rFonts w:ascii="Arial" w:hAnsi="Arial" w:cs="Arial"/>
-        </w:rPr>
-        <w:t>Tools and software used for data cleaning.</w:t>
+          <w:numId w:val="6"/>
+        </w:numPr>
+        <w:rPr>
+          <w:rFonts w:ascii="Arial" w:hAnsi="Arial" w:cs="Arial"/>
+        </w:rPr>
+      </w:pPr>
+      <w:r>
+        <w:rPr>
+          <w:rFonts w:ascii="Arial" w:hAnsi="Arial" w:cs="Arial"/>
+        </w:rPr>
+        <w:t xml:space="preserve">Once the cleaning has been completed, we were working from the pandas </w:t>
+      </w:r>
+      <w:proofErr w:type="spellStart"/>
+      <w:r>
+        <w:rPr>
+          <w:rFonts w:ascii="Arial" w:hAnsi="Arial" w:cs="Arial"/>
+        </w:rPr>
+        <w:t>dataframe</w:t>
+      </w:r>
+      <w:proofErr w:type="spellEnd"/>
+      <w:r>
+        <w:rPr>
+          <w:rFonts w:ascii="Arial" w:hAnsi="Arial" w:cs="Arial"/>
+        </w:rPr>
+        <w:t xml:space="preserve"> “</w:t>
+      </w:r>
+      <w:proofErr w:type="spellStart"/>
+      <w:r>
+        <w:rPr>
+          <w:rFonts w:ascii="Arial" w:hAnsi="Arial" w:cs="Arial"/>
+        </w:rPr>
+        <w:t>cleaned_df</w:t>
+      </w:r>
+      <w:proofErr w:type="spellEnd"/>
+      <w:r>
+        <w:rPr>
+          <w:rFonts w:ascii="Arial" w:hAnsi="Arial" w:cs="Arial"/>
+        </w:rPr>
+        <w:t xml:space="preserve">”. </w:t>
+      </w:r>
+      <w:r>
+        <w:rPr>
+          <w:rFonts w:ascii="Arial" w:hAnsi="Arial" w:cs="Arial"/>
+        </w:rPr>
+        <w:t xml:space="preserve"> </w:t>
+      </w:r>
+      <w:r>
+        <w:rPr>
+          <w:rFonts w:ascii="Arial" w:hAnsi="Arial" w:cs="Arial"/>
+        </w:rPr>
+        <w:t xml:space="preserve">This was the </w:t>
+      </w:r>
+      <w:proofErr w:type="spellStart"/>
+      <w:r>
+        <w:rPr>
+          <w:rFonts w:ascii="Arial" w:hAnsi="Arial" w:cs="Arial"/>
+        </w:rPr>
+        <w:t>dataframe</w:t>
+      </w:r>
+      <w:proofErr w:type="spellEnd"/>
+      <w:r>
+        <w:rPr>
+          <w:rFonts w:ascii="Arial" w:hAnsi="Arial" w:cs="Arial"/>
+        </w:rPr>
+        <w:t xml:space="preserve"> that was used in the next step.</w:t>
       </w:r>
     </w:p>
     <w:p>
@@ -1354,7 +1568,7 @@
       <w:pPr>
         <w:numPr>
           <w:ilvl w:val="0"/>
-          <w:numId w:val="6"/>
+          <w:numId w:val="7"/>
         </w:numPr>
         <w:rPr>
           <w:rFonts w:ascii="Arial" w:hAnsi="Arial" w:cs="Arial"/>
@@ -1373,41 +1587,56 @@
       <w:pPr>
         <w:numPr>
           <w:ilvl w:val="1"/>
-          <w:numId w:val="6"/>
-        </w:numPr>
-        <w:rPr>
-          <w:rFonts w:ascii="Arial" w:hAnsi="Arial" w:cs="Arial"/>
-        </w:rPr>
-      </w:pPr>
-      <w:r>
-        <w:rPr>
-          <w:rFonts w:ascii="Arial" w:hAnsi="Arial" w:cs="Arial"/>
-        </w:rPr>
-        <w:t>Techniques used for exploratory data analysis.</w:t>
-      </w:r>
-    </w:p>
-    <w:p>
-      <w:pPr>
-        <w:numPr>
-          <w:ilvl w:val="1"/>
-          <w:numId w:val="6"/>
-        </w:numPr>
-        <w:rPr>
-          <w:rFonts w:ascii="Arial" w:hAnsi="Arial" w:cs="Arial"/>
-        </w:rPr>
-      </w:pPr>
-      <w:r>
-        <w:rPr>
-          <w:rFonts w:ascii="Arial" w:hAnsi="Arial" w:cs="Arial"/>
-        </w:rPr>
-        <w:t>Key findings from the exploratory analysis.</w:t>
+          <w:numId w:val="7"/>
+        </w:numPr>
+        <w:rPr>
+          <w:rFonts w:ascii="Arial" w:hAnsi="Arial" w:cs="Arial"/>
+        </w:rPr>
+      </w:pPr>
+      <w:r>
+        <w:rPr>
+          <w:rFonts w:ascii="Arial" w:hAnsi="Arial" w:cs="Arial"/>
+        </w:rPr>
+        <w:t xml:space="preserve">To explore the data, we used pandas and seaborn to </w:t>
+      </w:r>
+      <w:r>
+        <w:rPr>
+          <w:rFonts w:ascii="Arial" w:hAnsi="Arial" w:cs="Arial"/>
+        </w:rPr>
+        <w:t xml:space="preserve">look at the cleaned </w:t>
+      </w:r>
+      <w:proofErr w:type="spellStart"/>
+      <w:r>
+        <w:rPr>
+          <w:rFonts w:ascii="Arial" w:hAnsi="Arial" w:cs="Arial"/>
+        </w:rPr>
+        <w:t>dataframe</w:t>
+      </w:r>
+      <w:proofErr w:type="spellEnd"/>
+      <w:r>
+        <w:rPr>
+          <w:rFonts w:ascii="Arial" w:hAnsi="Arial" w:cs="Arial"/>
+        </w:rPr>
+        <w:t xml:space="preserve">. This lead to a few improvements and additions </w:t>
+      </w:r>
+      <w:r>
+        <w:rPr>
+          <w:rFonts w:ascii="Arial" w:hAnsi="Arial" w:cs="Arial"/>
+        </w:rPr>
+        <w:t xml:space="preserve">in the code </w:t>
+      </w:r>
+      <w:r>
+        <w:rPr>
+          <w:rFonts w:ascii="Arial" w:hAnsi="Arial" w:cs="Arial"/>
+        </w:rPr>
+        <w:t xml:space="preserve">(like the difference in Elo rating), which allowed us to create a better, more representative dataset for the statistical analysis. </w:t>
       </w:r>
     </w:p>
     <w:p>
       <w:pPr>
         <w:numPr>
           <w:ilvl w:val="0"/>
-          <w:numId w:val="6"/>
+          <w:numId w:val="7"/>
         </w:numPr>
         <w:rPr>
           <w:rFonts w:ascii="Arial" w:hAnsi="Arial" w:cs="Arial"/>
@@ -1426,34 +1655,193 @@
       <w:pPr>
         <w:numPr>
           <w:ilvl w:val="1"/>
-          <w:numId w:val="6"/>
-        </w:numPr>
-        <w:rPr>
-          <w:rFonts w:ascii="Arial" w:hAnsi="Arial" w:cs="Arial"/>
-        </w:rPr>
-      </w:pPr>
-      <w:r>
-        <w:rPr>
-          <w:rFonts w:ascii="Arial" w:hAnsi="Arial" w:cs="Arial"/>
-        </w:rPr>
-        <w:t>Statistical methods applied.</w:t>
+          <w:numId w:val="7"/>
+        </w:numPr>
+        <w:rPr>
+          <w:rFonts w:ascii="Arial" w:hAnsi="Arial" w:cs="Arial"/>
+        </w:rPr>
+      </w:pPr>
+      <w:r>
+        <w:rPr>
+          <w:rFonts w:ascii="Arial" w:hAnsi="Arial" w:cs="Arial"/>
+        </w:rPr>
+        <w:t>To prepare the data for the statistical analysis, we performed the following steps:</w:t>
+      </w:r>
+    </w:p>
+    <w:p>
+      <w:pPr>
+        <w:numPr>
+          <w:ilvl w:val="2"/>
+          <w:numId w:val="7"/>
+        </w:numPr>
+        <w:rPr>
+          <w:rFonts w:ascii="Arial" w:hAnsi="Arial" w:cs="Arial"/>
+        </w:rPr>
+      </w:pPr>
+      <w:r>
+        <w:rPr>
+          <w:rFonts w:ascii="Arial" w:hAnsi="Arial" w:cs="Arial"/>
+        </w:rPr>
+        <w:t>We identified the top 30 most commonly used openings by ordering the frequency of use for each opening in descending order. We also looked at the top 70 and 50 openings, but we noticed a significant drop off of how often an opening was played at the top 30. The other openings were played in less than 1% of the games, therefore we set the top 30 openings as our threshold as those which appeared that infrequently cannot be categorised as common or uncommon</w:t>
+      </w:r>
+      <w:r>
+        <w:rPr>
+          <w:rFonts w:ascii="Arial" w:hAnsi="Arial" w:cs="Arial"/>
+        </w:rPr>
+        <w:t>. They appear to just be random openings, which players likely to played accidentally or they are too obscure to appear in other games. As our main assumption is that if a player studied an uncommon opening, we assume that there is intent behind an opening chosen and therefore decided to look at those openings which appeared frequently enough to suggest that.</w:t>
+      </w:r>
+    </w:p>
+    <w:p>
+      <w:pPr>
+        <w:numPr>
+          <w:ilvl w:val="2"/>
+          <w:numId w:val="7"/>
+        </w:numPr>
+        <w:rPr>
+          <w:rFonts w:ascii="Arial" w:hAnsi="Arial" w:cs="Arial"/>
+        </w:rPr>
+      </w:pPr>
+      <w:r>
+        <w:rPr>
+          <w:rFonts w:ascii="Arial" w:hAnsi="Arial" w:cs="Arial"/>
+        </w:rPr>
+        <w:t xml:space="preserve">We then labelled the top 30 openings as common or uncommon. The top 15 most played openings </w:t>
+      </w:r>
+      <w:r>
+        <w:rPr>
+          <w:rFonts w:ascii="Arial" w:hAnsi="Arial" w:cs="Arial"/>
+        </w:rPr>
+        <w:t>got labelled “common”, while the bottom 15 received the “uncommon” label.</w:t>
+      </w:r>
+    </w:p>
+    <w:p>
+      <w:pPr>
+        <w:numPr>
+          <w:ilvl w:val="2"/>
+          <w:numId w:val="7"/>
+        </w:numPr>
+        <w:rPr>
+          <w:rFonts w:ascii="Arial" w:hAnsi="Arial" w:cs="Arial"/>
+        </w:rPr>
+      </w:pPr>
+      <w:r>
+        <w:rPr>
+          <w:rFonts w:ascii="Arial" w:hAnsi="Arial" w:cs="Arial"/>
+        </w:rPr>
+        <w:t xml:space="preserve">We also assigned a “responsibility” for an opening (white/black) based on domain knowledge. This is to know which player decided which opening gets played and if they’ve won the game. </w:t>
+      </w:r>
+    </w:p>
+    <w:p>
+      <w:pPr>
+        <w:numPr>
+          <w:ilvl w:val="2"/>
+          <w:numId w:val="7"/>
+        </w:numPr>
+        <w:rPr>
+          <w:rFonts w:ascii="Arial" w:hAnsi="Arial" w:cs="Arial"/>
+        </w:rPr>
+      </w:pPr>
+      <w:r>
+        <w:rPr>
+          <w:rFonts w:ascii="Arial" w:hAnsi="Arial" w:cs="Arial"/>
+        </w:rPr>
+        <w:t xml:space="preserve">We’ve added an “outcome” column to show who won the game. This allows us to compare this to the responsibility column to see if the player who used the opening won the game or not. </w:t>
       </w:r>
     </w:p>
     <w:p>
       <w:pPr>
         <w:numPr>
           <w:ilvl w:val="1"/>
-          <w:numId w:val="6"/>
-        </w:numPr>
-        <w:rPr>
-          <w:rFonts w:ascii="Arial" w:hAnsi="Arial" w:cs="Arial"/>
-        </w:rPr>
-      </w:pPr>
-      <w:r>
-        <w:rPr>
-          <w:rFonts w:ascii="Arial" w:hAnsi="Arial" w:cs="Arial"/>
-        </w:rPr>
-        <w:t>Interpretation of the results.</w:t>
+          <w:numId w:val="7"/>
+        </w:numPr>
+        <w:rPr>
+          <w:rFonts w:ascii="Arial" w:hAnsi="Arial" w:cs="Arial"/>
+        </w:rPr>
+      </w:pPr>
+      <w:r>
+        <w:rPr>
+          <w:rFonts w:ascii="Arial" w:hAnsi="Arial" w:cs="Arial"/>
+        </w:rPr>
+        <w:t xml:space="preserve">Once the updated </w:t>
+      </w:r>
+      <w:proofErr w:type="spellStart"/>
+      <w:r>
+        <w:rPr>
+          <w:rFonts w:ascii="Arial" w:hAnsi="Arial" w:cs="Arial"/>
+        </w:rPr>
+        <w:t>dataframe</w:t>
+      </w:r>
+      <w:proofErr w:type="spellEnd"/>
+      <w:r>
+        <w:rPr>
+          <w:rFonts w:ascii="Arial" w:hAnsi="Arial" w:cs="Arial"/>
+        </w:rPr>
+        <w:t xml:space="preserve"> was done, we performed three main analyses:</w:t>
+      </w:r>
+    </w:p>
+    <w:p>
+      <w:pPr>
+        <w:numPr>
+          <w:ilvl w:val="2"/>
+          <w:numId w:val="7"/>
+        </w:numPr>
+        <w:rPr>
+          <w:rFonts w:ascii="Arial" w:hAnsi="Arial" w:cs="Arial"/>
+        </w:rPr>
+      </w:pPr>
+      <w:r>
+        <w:rPr>
+          <w:rFonts w:ascii="Arial" w:hAnsi="Arial" w:cs="Arial"/>
+        </w:rPr>
+        <w:t>We compared the win rates of players of those using common and those using uncommon openings. The win rate of a player using a common opening has a slightly higher chance of winning (</w:t>
+      </w:r>
+      <w:r>
+        <w:rPr>
+          <w:rFonts w:ascii="Arial" w:hAnsi="Arial" w:cs="Arial"/>
+          <w:highlight w:val="yellow"/>
+        </w:rPr>
+        <w:t>52 vs 48 %)</w:t>
+      </w:r>
+    </w:p>
+    <w:p>
+      <w:pPr>
+        <w:numPr>
+          <w:ilvl w:val="2"/>
+          <w:numId w:val="7"/>
+        </w:numPr>
+        <w:rPr>
+          <w:rFonts w:ascii="Arial" w:hAnsi="Arial" w:cs="Arial"/>
+        </w:rPr>
+      </w:pPr>
+      <w:r>
+        <w:rPr>
+          <w:rFonts w:ascii="Arial" w:hAnsi="Arial" w:cs="Arial"/>
+        </w:rPr>
+        <w:t xml:space="preserve">We used a chi-square test of independence to investigate the relationship between the opening played and whether the game was won. We identified a </w:t>
+      </w:r>
+      <w:r>
+        <w:rPr>
+          <w:rFonts w:ascii="Arial" w:hAnsi="Arial" w:cs="Arial"/>
+        </w:rPr>
+        <w:lastRenderedPageBreak/>
+        <w:t>statistically significant relationship between the two, so we can conclude that the opening played had an effect on the outcome of the game in our dataset.</w:t>
+      </w:r>
+    </w:p>
+    <w:p>
+      <w:pPr>
+        <w:numPr>
+          <w:ilvl w:val="2"/>
+          <w:numId w:val="7"/>
+        </w:numPr>
+        <w:rPr>
+          <w:rFonts w:ascii="Arial" w:hAnsi="Arial" w:cs="Arial"/>
+        </w:rPr>
+      </w:pPr>
+      <w:r>
+        <w:rPr>
+          <w:rFonts w:ascii="Arial" w:hAnsi="Arial" w:cs="Arial"/>
+        </w:rPr>
+        <w:t xml:space="preserve">We then used logistic regression to look at what this relationship this is and if a player playing an uncommon or a common opening has a higher chance of winning a game. Based on the results, a player using a common opening is more likely to win a game. </w:t>
       </w:r>
     </w:p>
     <w:p>
@@ -1477,7 +1865,7 @@
       <w:pPr>
         <w:numPr>
           <w:ilvl w:val="0"/>
-          <w:numId w:val="7"/>
+          <w:numId w:val="8"/>
         </w:numPr>
         <w:rPr>
           <w:rFonts w:ascii="Arial" w:hAnsi="Arial" w:cs="Arial"/>
@@ -1496,7 +1884,7 @@
       <w:pPr>
         <w:numPr>
           <w:ilvl w:val="1"/>
-          <w:numId w:val="7"/>
+          <w:numId w:val="8"/>
         </w:numPr>
         <w:rPr>
           <w:rFonts w:ascii="Arial" w:hAnsi="Arial" w:cs="Arial"/>
@@ -1513,7 +1901,7 @@
       <w:pPr>
         <w:numPr>
           <w:ilvl w:val="0"/>
-          <w:numId w:val="7"/>
+          <w:numId w:val="8"/>
         </w:numPr>
         <w:rPr>
           <w:rFonts w:ascii="Arial" w:hAnsi="Arial" w:cs="Arial"/>
@@ -1548,7 +1936,7 @@
       <w:pPr>
         <w:numPr>
           <w:ilvl w:val="1"/>
-          <w:numId w:val="7"/>
+          <w:numId w:val="8"/>
         </w:numPr>
         <w:rPr>
           <w:rFonts w:ascii="Arial" w:hAnsi="Arial" w:cs="Arial"/>
@@ -1577,7 +1965,7 @@
       <w:pPr>
         <w:numPr>
           <w:ilvl w:val="1"/>
-          <w:numId w:val="7"/>
+          <w:numId w:val="8"/>
         </w:numPr>
         <w:rPr>
           <w:rFonts w:ascii="Arial" w:hAnsi="Arial" w:cs="Arial"/>
@@ -1606,7 +1994,7 @@
       <w:pPr>
         <w:numPr>
           <w:ilvl w:val="0"/>
-          <w:numId w:val="7"/>
+          <w:numId w:val="8"/>
         </w:numPr>
         <w:rPr>
           <w:rFonts w:ascii="Arial" w:hAnsi="Arial" w:cs="Arial"/>
@@ -1625,7 +2013,7 @@
       <w:pPr>
         <w:numPr>
           <w:ilvl w:val="1"/>
-          <w:numId w:val="7"/>
+          <w:numId w:val="8"/>
         </w:numPr>
         <w:rPr>
           <w:rFonts w:ascii="Arial" w:hAnsi="Arial" w:cs="Arial"/>
@@ -1642,7 +2030,7 @@
       <w:pPr>
         <w:numPr>
           <w:ilvl w:val="1"/>
-          <w:numId w:val="7"/>
+          <w:numId w:val="8"/>
         </w:numPr>
         <w:rPr>
           <w:rFonts w:ascii="Arial" w:hAnsi="Arial" w:cs="Arial"/>
@@ -1676,7 +2064,7 @@
       <w:pPr>
         <w:numPr>
           <w:ilvl w:val="0"/>
-          <w:numId w:val="8"/>
+          <w:numId w:val="9"/>
         </w:numPr>
         <w:rPr>
           <w:rFonts w:ascii="Arial" w:hAnsi="Arial" w:cs="Arial"/>
@@ -1695,7 +2083,7 @@
       <w:pPr>
         <w:numPr>
           <w:ilvl w:val="1"/>
-          <w:numId w:val="8"/>
+          <w:numId w:val="9"/>
         </w:numPr>
         <w:rPr>
           <w:rFonts w:ascii="Arial" w:hAnsi="Arial" w:cs="Arial"/>
@@ -1712,7 +2100,7 @@
       <w:pPr>
         <w:numPr>
           <w:ilvl w:val="1"/>
-          <w:numId w:val="8"/>
+          <w:numId w:val="9"/>
         </w:numPr>
         <w:rPr>
           <w:rFonts w:ascii="Arial" w:hAnsi="Arial" w:cs="Arial"/>
@@ -1729,7 +2117,7 @@
       <w:pPr>
         <w:numPr>
           <w:ilvl w:val="1"/>
-          <w:numId w:val="8"/>
+          <w:numId w:val="9"/>
         </w:numPr>
         <w:rPr>
           <w:rFonts w:ascii="Arial" w:hAnsi="Arial" w:cs="Arial"/>
@@ -1746,7 +2134,7 @@
       <w:pPr>
         <w:numPr>
           <w:ilvl w:val="0"/>
-          <w:numId w:val="8"/>
+          <w:numId w:val="9"/>
         </w:numPr>
         <w:rPr>
           <w:rFonts w:ascii="Arial" w:hAnsi="Arial" w:cs="Arial"/>
@@ -1765,7 +2153,7 @@
       <w:pPr>
         <w:numPr>
           <w:ilvl w:val="1"/>
-          <w:numId w:val="8"/>
+          <w:numId w:val="9"/>
         </w:numPr>
         <w:rPr>
           <w:rFonts w:ascii="Arial" w:hAnsi="Arial" w:cs="Arial"/>
@@ -1782,7 +2170,7 @@
       <w:pPr>
         <w:numPr>
           <w:ilvl w:val="1"/>
-          <w:numId w:val="8"/>
+          <w:numId w:val="9"/>
         </w:numPr>
         <w:rPr>
           <w:rFonts w:ascii="Arial" w:hAnsi="Arial" w:cs="Arial"/>
@@ -1793,6 +2181,35 @@
           <w:rFonts w:ascii="Arial" w:hAnsi="Arial" w:cs="Arial"/>
         </w:rPr>
         <w:t>Ethical considerations and data bias.</w:t>
+      </w:r>
+    </w:p>
+    <w:p>
+      <w:pPr>
+        <w:numPr>
+          <w:ilvl w:val="2"/>
+          <w:numId w:val="9"/>
+        </w:numPr>
+        <w:rPr>
+          <w:rFonts w:ascii="Arial" w:hAnsi="Arial" w:cs="Arial"/>
+        </w:rPr>
+      </w:pPr>
+      <w:r>
+        <w:rPr>
+          <w:rFonts w:ascii="Arial" w:hAnsi="Arial" w:cs="Arial"/>
+        </w:rPr>
+        <w:t xml:space="preserve">During the data cleaning step, we have made several decisions that have </w:t>
+      </w:r>
+      <w:r>
+        <w:rPr>
+          <w:rFonts w:ascii="Arial" w:hAnsi="Arial" w:cs="Arial"/>
+        </w:rPr>
+        <w:t xml:space="preserve">an impact on the final dataset we </w:t>
+      </w:r>
+      <w:r>
+        <w:rPr>
+          <w:rFonts w:ascii="Arial" w:hAnsi="Arial" w:cs="Arial"/>
+        </w:rPr>
+        <w:t xml:space="preserve">carried out the statistical analysis on. </w:t>
       </w:r>
     </w:p>
     <w:p>
@@ -1816,7 +2233,7 @@
       <w:pPr>
         <w:numPr>
           <w:ilvl w:val="0"/>
-          <w:numId w:val="9"/>
+          <w:numId w:val="10"/>
         </w:numPr>
         <w:rPr>
           <w:rFonts w:ascii="Arial" w:hAnsi="Arial" w:cs="Arial"/>
@@ -1835,7 +2252,7 @@
       <w:pPr>
         <w:numPr>
           <w:ilvl w:val="1"/>
-          <w:numId w:val="9"/>
+          <w:numId w:val="10"/>
         </w:numPr>
         <w:rPr>
           <w:rFonts w:ascii="Arial" w:hAnsi="Arial" w:cs="Arial"/>
@@ -1852,7 +2269,7 @@
       <w:pPr>
         <w:numPr>
           <w:ilvl w:val="1"/>
-          <w:numId w:val="9"/>
+          <w:numId w:val="10"/>
         </w:numPr>
         <w:rPr>
           <w:rFonts w:ascii="Arial" w:hAnsi="Arial" w:cs="Arial"/>
@@ -1869,7 +2286,7 @@
       <w:pPr>
         <w:numPr>
           <w:ilvl w:val="1"/>
-          <w:numId w:val="9"/>
+          <w:numId w:val="10"/>
         </w:numPr>
         <w:rPr>
           <w:rFonts w:ascii="Arial" w:hAnsi="Arial" w:cs="Arial"/>
@@ -1880,7 +2297,7 @@
       <w:pPr>
         <w:numPr>
           <w:ilvl w:val="0"/>
-          <w:numId w:val="9"/>
+          <w:numId w:val="10"/>
         </w:numPr>
         <w:rPr>
           <w:rFonts w:ascii="Arial" w:hAnsi="Arial" w:cs="Arial"/>
@@ -1892,25 +2309,42 @@
           <w:b/>
           <w:bCs/>
         </w:rPr>
+        <w:t>Future Work:</w:t>
+      </w:r>
+    </w:p>
+    <w:p>
+      <w:pPr>
+        <w:numPr>
+          <w:ilvl w:val="1"/>
+          <w:numId w:val="10"/>
+        </w:numPr>
+        <w:rPr>
+          <w:rFonts w:ascii="Arial" w:hAnsi="Arial" w:cs="Arial"/>
+        </w:rPr>
+      </w:pPr>
+      <w:r>
+        <w:rPr>
+          <w:rFonts w:ascii="Arial" w:hAnsi="Arial" w:cs="Arial"/>
+        </w:rPr>
+        <w:t xml:space="preserve">This project has the potential to be carried out on a much larger scale. We could look at a different time period and a variety of game types. </w:t>
+      </w:r>
+    </w:p>
+    <w:p>
+      <w:pPr>
+        <w:numPr>
+          <w:ilvl w:val="1"/>
+          <w:numId w:val="10"/>
+        </w:numPr>
+        <w:rPr>
+          <w:rFonts w:ascii="Arial" w:hAnsi="Arial" w:cs="Arial"/>
+        </w:rPr>
+      </w:pPr>
+      <w:r>
+        <w:rPr>
+          <w:rFonts w:ascii="Arial" w:hAnsi="Arial" w:cs="Arial"/>
+        </w:rPr>
         <w:lastRenderedPageBreak/>
-        <w:t>Future Work:</w:t>
-      </w:r>
-    </w:p>
-    <w:p>
-      <w:pPr>
-        <w:numPr>
-          <w:ilvl w:val="1"/>
-          <w:numId w:val="9"/>
-        </w:numPr>
-        <w:rPr>
-          <w:rFonts w:ascii="Arial" w:hAnsi="Arial" w:cs="Arial"/>
-        </w:rPr>
-      </w:pPr>
-      <w:r>
-        <w:rPr>
-          <w:rFonts w:ascii="Arial" w:hAnsi="Arial" w:cs="Arial"/>
-        </w:rPr>
-        <w:t>Suggestions for future improvements or extensions of the project.</w:t>
+        <w:t xml:space="preserve">We can also compare trends in how much an opening is used over time or in specific game types. </w:t>
       </w:r>
     </w:p>
     <w:p>
@@ -1934,7 +2368,7 @@
       <w:pPr>
         <w:numPr>
           <w:ilvl w:val="0"/>
-          <w:numId w:val="10"/>
+          <w:numId w:val="11"/>
         </w:numPr>
         <w:rPr>
           <w:rFonts w:ascii="Arial" w:hAnsi="Arial" w:cs="Arial"/>
@@ -1953,7 +2387,7 @@
       <w:pPr>
         <w:numPr>
           <w:ilvl w:val="1"/>
-          <w:numId w:val="10"/>
+          <w:numId w:val="11"/>
         </w:numPr>
         <w:rPr>
           <w:rFonts w:ascii="Arial" w:hAnsi="Arial" w:cs="Arial"/>
@@ -1970,7 +2404,7 @@
       <w:pPr>
         <w:numPr>
           <w:ilvl w:val="1"/>
-          <w:numId w:val="10"/>
+          <w:numId w:val="11"/>
         </w:numPr>
         <w:rPr>
           <w:rFonts w:ascii="Arial" w:hAnsi="Arial" w:cs="Arial"/>
@@ -2004,7 +2438,7 @@
       <w:pPr>
         <w:numPr>
           <w:ilvl w:val="0"/>
-          <w:numId w:val="11"/>
+          <w:numId w:val="12"/>
         </w:numPr>
         <w:rPr>
           <w:rFonts w:ascii="Arial" w:hAnsi="Arial" w:cs="Arial"/>
@@ -2023,7 +2457,7 @@
       <w:pPr>
         <w:numPr>
           <w:ilvl w:val="1"/>
-          <w:numId w:val="11"/>
+          <w:numId w:val="12"/>
         </w:numPr>
         <w:rPr>
           <w:rFonts w:ascii="Arial" w:hAnsi="Arial" w:cs="Arial"/>
@@ -2059,7 +2493,7 @@
     <w:p/>
     <w:p/>
     <w:sectPr>
-      <w:pgSz w:w="11906" w:h="16838" w:orient="portrait"/>
+      <w:pgSz w:w="11906" w:h="16838"/>
       <w:pgMar w:top="720" w:right="720" w:bottom="720" w:left="720" w:header="708" w:footer="708" w:gutter="0"/>
       <w:cols w:space="708"/>
       <w:docGrid w:linePitch="360"/>
@@ -2070,118 +2504,6 @@
 
 <file path=word/numbering.xml><?xml version="1.0" encoding="utf-8"?>
 <w:numbering xmlns:wpc="http://schemas.microsoft.com/office/word/2010/wordprocessingCanvas" xmlns:cx="http://schemas.microsoft.com/office/drawing/2014/chartex" xmlns:cx1="http://schemas.microsoft.com/office/drawing/2015/9/8/chartex" xmlns:cx2="http://schemas.microsoft.com/office/drawing/2015/10/21/chartex" xmlns:cx3="http://schemas.microsoft.com/office/drawing/2016/5/9/chartex" xmlns:cx4="http://schemas.microsoft.com/office/drawing/2016/5/10/chartex" xmlns:cx5="http://schemas.microsoft.com/office/drawing/2016/5/11/chartex" xmlns:cx6="http://schemas.microsoft.com/office/drawing/2016/5/12/chartex" xmlns:cx7="http://schemas.microsoft.com/office/drawing/2016/5/13/chartex" xmlns:cx8="http://schemas.microsoft.com/office/drawing/2016/5/14/chartex" xmlns:mc="http://schemas.openxmlformats.org/markup-compatibility/2006" xmlns:aink="http://schemas.microsoft.com/office/drawing/2016/ink" xmlns:am3d="http://schemas.microsoft.com/office/drawing/2017/model3d" xmlns:o="urn:schemas-microsoft-com:office:office" xmlns:oel="http://schemas.microsoft.com/office/2019/extlst" xmlns:r="http://schemas.openxmlformats.org/officeDocument/2006/relationships" xmlns:m="http://schemas.openxmlformats.org/officeDocument/2006/math" xmlns:v="urn:schemas-microsoft-com:vml" xmlns:wp14="http://schemas.microsoft.com/office/word/2010/wordprocessingDrawing" xmlns:wp="http://schemas.openxmlformats.org/drawingml/2006/wordprocessingDrawing" xmlns:w10="urn:schemas-microsoft-com:office:word" xmlns:w="http://schemas.openxmlformats.org/wordprocessingml/2006/main" xmlns:w14="http://schemas.microsoft.com/office/word/2010/wordml" xmlns:w15="http://schemas.microsoft.com/office/word/2012/wordml" xmlns:w16cex="http://schemas.microsoft.com/office/word/2018/wordml/cex" xmlns:w16cid="http://schemas.microsoft.com/office/word/2016/wordml/cid" xmlns:w16="http://schemas.microsoft.com/office/word/2018/wordml" xmlns:w16du="http://schemas.microsoft.com/office/word/2023/wordml/word16du" xmlns:w16sdtdh="http://schemas.microsoft.com/office/word/2020/wordml/sdtdatahash" xmlns:w16sdtfl="http://schemas.microsoft.com/office/word/2024/wordml/sdtformatlock" xmlns:w16se="http://schemas.microsoft.com/office/word/2015/wordml/symex" xmlns:wpg="http://schemas.microsoft.com/office/word/2010/wordprocessingGroup" xmlns:wpi="http://schemas.microsoft.com/office/word/2010/wordprocessingInk" xmlns:wne="http://schemas.microsoft.com/office/word/2006/wordml" xmlns:wps="http://schemas.microsoft.com/office/word/2010/wordprocessingShape" mc:Ignorable="w14 w15 w16se w16cid w16 w16cex w16sdtdh w16sdtfl w16du wp14">
-  <w:abstractNum xmlns:w="http://schemas.openxmlformats.org/wordprocessingml/2006/main" w:abstractNumId="11">
-    <w:nsid w:val="55e9712e"/>
-    <w:multiLevelType xmlns:w="http://schemas.openxmlformats.org/wordprocessingml/2006/main" w:val="hybridMultilevel"/>
-    <w:lvl xmlns:w="http://schemas.openxmlformats.org/wordprocessingml/2006/main" w:ilvl="0">
-      <w:start w:val="1"/>
-      <w:numFmt w:val="bullet"/>
-      <w:lvlText w:val="-"/>
-      <w:lvlJc w:val="left"/>
-      <w:pPr>
-        <w:ind w:left="2520" w:hanging="360"/>
-      </w:pPr>
-      <w:rPr>
-        <w:rFonts w:hint="default" w:ascii="Aptos" w:hAnsi="Aptos"/>
-      </w:rPr>
-    </w:lvl>
-    <w:lvl xmlns:w="http://schemas.openxmlformats.org/wordprocessingml/2006/main" w:ilvl="1">
-      <w:start w:val="1"/>
-      <w:numFmt w:val="bullet"/>
-      <w:lvlText w:val="o"/>
-      <w:lvlJc w:val="left"/>
-      <w:pPr>
-        <w:ind w:left="3240" w:hanging="360"/>
-      </w:pPr>
-      <w:rPr>
-        <w:rFonts w:hint="default" w:ascii="Courier New" w:hAnsi="Courier New"/>
-      </w:rPr>
-    </w:lvl>
-    <w:lvl xmlns:w="http://schemas.openxmlformats.org/wordprocessingml/2006/main" w:ilvl="2">
-      <w:start w:val="1"/>
-      <w:numFmt w:val="bullet"/>
-      <w:lvlText w:val=""/>
-      <w:lvlJc w:val="left"/>
-      <w:pPr>
-        <w:ind w:left="3960" w:hanging="360"/>
-      </w:pPr>
-      <w:rPr>
-        <w:rFonts w:hint="default" w:ascii="Wingdings" w:hAnsi="Wingdings"/>
-      </w:rPr>
-    </w:lvl>
-    <w:lvl xmlns:w="http://schemas.openxmlformats.org/wordprocessingml/2006/main" w:ilvl="3">
-      <w:start w:val="1"/>
-      <w:numFmt w:val="bullet"/>
-      <w:lvlText w:val=""/>
-      <w:lvlJc w:val="left"/>
-      <w:pPr>
-        <w:ind w:left="4680" w:hanging="360"/>
-      </w:pPr>
-      <w:rPr>
-        <w:rFonts w:hint="default" w:ascii="Symbol" w:hAnsi="Symbol"/>
-      </w:rPr>
-    </w:lvl>
-    <w:lvl xmlns:w="http://schemas.openxmlformats.org/wordprocessingml/2006/main" w:ilvl="4">
-      <w:start w:val="1"/>
-      <w:numFmt w:val="bullet"/>
-      <w:lvlText w:val="o"/>
-      <w:lvlJc w:val="left"/>
-      <w:pPr>
-        <w:ind w:left="5400" w:hanging="360"/>
-      </w:pPr>
-      <w:rPr>
-        <w:rFonts w:hint="default" w:ascii="Courier New" w:hAnsi="Courier New"/>
-      </w:rPr>
-    </w:lvl>
-    <w:lvl xmlns:w="http://schemas.openxmlformats.org/wordprocessingml/2006/main" w:ilvl="5">
-      <w:start w:val="1"/>
-      <w:numFmt w:val="bullet"/>
-      <w:lvlText w:val=""/>
-      <w:lvlJc w:val="left"/>
-      <w:pPr>
-        <w:ind w:left="6120" w:hanging="360"/>
-      </w:pPr>
-      <w:rPr>
-        <w:rFonts w:hint="default" w:ascii="Wingdings" w:hAnsi="Wingdings"/>
-      </w:rPr>
-    </w:lvl>
-    <w:lvl xmlns:w="http://schemas.openxmlformats.org/wordprocessingml/2006/main" w:ilvl="6">
-      <w:start w:val="1"/>
-      <w:numFmt w:val="bullet"/>
-      <w:lvlText w:val=""/>
-      <w:lvlJc w:val="left"/>
-      <w:pPr>
-        <w:ind w:left="6840" w:hanging="360"/>
-      </w:pPr>
-      <w:rPr>
-        <w:rFonts w:hint="default" w:ascii="Symbol" w:hAnsi="Symbol"/>
-      </w:rPr>
-    </w:lvl>
-    <w:lvl xmlns:w="http://schemas.openxmlformats.org/wordprocessingml/2006/main" w:ilvl="7">
-      <w:start w:val="1"/>
-      <w:numFmt w:val="bullet"/>
-      <w:lvlText w:val="o"/>
-      <w:lvlJc w:val="left"/>
-      <w:pPr>
-        <w:ind w:left="7560" w:hanging="360"/>
-      </w:pPr>
-      <w:rPr>
-        <w:rFonts w:hint="default" w:ascii="Courier New" w:hAnsi="Courier New"/>
-      </w:rPr>
-    </w:lvl>
-    <w:lvl xmlns:w="http://schemas.openxmlformats.org/wordprocessingml/2006/main" w:ilvl="8">
-      <w:start w:val="1"/>
-      <w:numFmt w:val="bullet"/>
-      <w:lvlText w:val=""/>
-      <w:lvlJc w:val="left"/>
-      <w:pPr>
-        <w:ind w:left="8280" w:hanging="360"/>
-      </w:pPr>
-      <w:rPr>
-        <w:rFonts w:hint="default" w:ascii="Wingdings" w:hAnsi="Wingdings"/>
-      </w:rPr>
-    </w:lvl>
-  </w:abstractNum>
   <w:abstractNum w:abstractNumId="0" w15:restartNumberingAfterBreak="0">
     <w:nsid w:val="052B6B69"/>
     <w:multiLevelType w:val="multilevel"/>
@@ -2198,7 +2520,7 @@
         <w:ind w:left="720" w:hanging="360"/>
       </w:pPr>
       <w:rPr>
-        <w:rFonts w:hint="default" w:ascii="Symbol" w:hAnsi="Symbol"/>
+        <w:rFonts w:ascii="Symbol" w:hAnsi="Symbol" w:hint="default"/>
         <w:sz w:val="20"/>
       </w:rPr>
     </w:lvl>
@@ -2214,11 +2536,11 @@
         <w:ind w:left="1440" w:hanging="360"/>
       </w:pPr>
       <w:rPr>
-        <w:rFonts w:hint="default" w:ascii="Courier New" w:hAnsi="Courier New"/>
-        <w:sz w:val="20"/>
-      </w:rPr>
-    </w:lvl>
-    <w:lvl w:ilvl="2" w:tentative="1">
+        <w:rFonts w:ascii="Courier New" w:hAnsi="Courier New" w:hint="default"/>
+        <w:sz w:val="20"/>
+      </w:rPr>
+    </w:lvl>
+    <w:lvl w:ilvl="2">
       <w:start w:val="1"/>
       <w:numFmt w:val="bullet"/>
       <w:lvlText w:val=""/>
@@ -2230,7 +2552,7 @@
         <w:ind w:left="2160" w:hanging="360"/>
       </w:pPr>
       <w:rPr>
-        <w:rFonts w:hint="default" w:ascii="Wingdings" w:hAnsi="Wingdings"/>
+        <w:rFonts w:ascii="Wingdings" w:hAnsi="Wingdings" w:hint="default"/>
         <w:sz w:val="20"/>
       </w:rPr>
     </w:lvl>
@@ -2246,7 +2568,7 @@
         <w:ind w:left="2880" w:hanging="360"/>
       </w:pPr>
       <w:rPr>
-        <w:rFonts w:hint="default" w:ascii="Wingdings" w:hAnsi="Wingdings"/>
+        <w:rFonts w:ascii="Wingdings" w:hAnsi="Wingdings" w:hint="default"/>
         <w:sz w:val="20"/>
       </w:rPr>
     </w:lvl>
@@ -2262,7 +2584,7 @@
         <w:ind w:left="3600" w:hanging="360"/>
       </w:pPr>
       <w:rPr>
-        <w:rFonts w:hint="default" w:ascii="Wingdings" w:hAnsi="Wingdings"/>
+        <w:rFonts w:ascii="Wingdings" w:hAnsi="Wingdings" w:hint="default"/>
         <w:sz w:val="20"/>
       </w:rPr>
     </w:lvl>
@@ -2278,7 +2600,7 @@
         <w:ind w:left="4320" w:hanging="360"/>
       </w:pPr>
       <w:rPr>
-        <w:rFonts w:hint="default" w:ascii="Wingdings" w:hAnsi="Wingdings"/>
+        <w:rFonts w:ascii="Wingdings" w:hAnsi="Wingdings" w:hint="default"/>
         <w:sz w:val="20"/>
       </w:rPr>
     </w:lvl>
@@ -2294,7 +2616,7 @@
         <w:ind w:left="5040" w:hanging="360"/>
       </w:pPr>
       <w:rPr>
-        <w:rFonts w:hint="default" w:ascii="Wingdings" w:hAnsi="Wingdings"/>
+        <w:rFonts w:ascii="Wingdings" w:hAnsi="Wingdings" w:hint="default"/>
         <w:sz w:val="20"/>
       </w:rPr>
     </w:lvl>
@@ -2310,7 +2632,7 @@
         <w:ind w:left="5760" w:hanging="360"/>
       </w:pPr>
       <w:rPr>
-        <w:rFonts w:hint="default" w:ascii="Wingdings" w:hAnsi="Wingdings"/>
+        <w:rFonts w:ascii="Wingdings" w:hAnsi="Wingdings" w:hint="default"/>
         <w:sz w:val="20"/>
       </w:rPr>
     </w:lvl>
@@ -2326,7 +2648,7 @@
         <w:ind w:left="6480" w:hanging="360"/>
       </w:pPr>
       <w:rPr>
-        <w:rFonts w:hint="default" w:ascii="Wingdings" w:hAnsi="Wingdings"/>
+        <w:rFonts w:ascii="Wingdings" w:hAnsi="Wingdings" w:hint="default"/>
         <w:sz w:val="20"/>
       </w:rPr>
     </w:lvl>
@@ -2347,7 +2669,7 @@
         <w:ind w:left="720" w:hanging="360"/>
       </w:pPr>
       <w:rPr>
-        <w:rFonts w:hint="default" w:ascii="Symbol" w:hAnsi="Symbol"/>
+        <w:rFonts w:ascii="Symbol" w:hAnsi="Symbol" w:hint="default"/>
         <w:sz w:val="20"/>
       </w:rPr>
     </w:lvl>
@@ -2363,7 +2685,7 @@
         <w:ind w:left="1440" w:hanging="360"/>
       </w:pPr>
       <w:rPr>
-        <w:rFonts w:hint="default" w:ascii="Courier New" w:hAnsi="Courier New"/>
+        <w:rFonts w:ascii="Courier New" w:hAnsi="Courier New" w:hint="default"/>
         <w:sz w:val="20"/>
       </w:rPr>
     </w:lvl>
@@ -2379,7 +2701,7 @@
         <w:ind w:left="2160" w:hanging="360"/>
       </w:pPr>
       <w:rPr>
-        <w:rFonts w:hint="default" w:ascii="Wingdings" w:hAnsi="Wingdings"/>
+        <w:rFonts w:ascii="Wingdings" w:hAnsi="Wingdings" w:hint="default"/>
         <w:sz w:val="20"/>
       </w:rPr>
     </w:lvl>
@@ -2395,7 +2717,7 @@
         <w:ind w:left="2880" w:hanging="360"/>
       </w:pPr>
       <w:rPr>
-        <w:rFonts w:hint="default" w:ascii="Wingdings" w:hAnsi="Wingdings"/>
+        <w:rFonts w:ascii="Wingdings" w:hAnsi="Wingdings" w:hint="default"/>
         <w:sz w:val="20"/>
       </w:rPr>
     </w:lvl>
@@ -2411,7 +2733,7 @@
         <w:ind w:left="3600" w:hanging="360"/>
       </w:pPr>
       <w:rPr>
-        <w:rFonts w:hint="default" w:ascii="Wingdings" w:hAnsi="Wingdings"/>
+        <w:rFonts w:ascii="Wingdings" w:hAnsi="Wingdings" w:hint="default"/>
         <w:sz w:val="20"/>
       </w:rPr>
     </w:lvl>
@@ -2427,7 +2749,7 @@
         <w:ind w:left="4320" w:hanging="360"/>
       </w:pPr>
       <w:rPr>
-        <w:rFonts w:hint="default" w:ascii="Wingdings" w:hAnsi="Wingdings"/>
+        <w:rFonts w:ascii="Wingdings" w:hAnsi="Wingdings" w:hint="default"/>
         <w:sz w:val="20"/>
       </w:rPr>
     </w:lvl>
@@ -2443,7 +2765,7 @@
         <w:ind w:left="5040" w:hanging="360"/>
       </w:pPr>
       <w:rPr>
-        <w:rFonts w:hint="default" w:ascii="Wingdings" w:hAnsi="Wingdings"/>
+        <w:rFonts w:ascii="Wingdings" w:hAnsi="Wingdings" w:hint="default"/>
         <w:sz w:val="20"/>
       </w:rPr>
     </w:lvl>
@@ -2459,7 +2781,7 @@
         <w:ind w:left="5760" w:hanging="360"/>
       </w:pPr>
       <w:rPr>
-        <w:rFonts w:hint="default" w:ascii="Wingdings" w:hAnsi="Wingdings"/>
+        <w:rFonts w:ascii="Wingdings" w:hAnsi="Wingdings" w:hint="default"/>
         <w:sz w:val="20"/>
       </w:rPr>
     </w:lvl>
@@ -2475,7 +2797,7 @@
         <w:ind w:left="6480" w:hanging="360"/>
       </w:pPr>
       <w:rPr>
-        <w:rFonts w:hint="default" w:ascii="Wingdings" w:hAnsi="Wingdings"/>
+        <w:rFonts w:ascii="Wingdings" w:hAnsi="Wingdings" w:hint="default"/>
         <w:sz w:val="20"/>
       </w:rPr>
     </w:lvl>
@@ -2496,7 +2818,7 @@
         <w:ind w:left="720" w:hanging="360"/>
       </w:pPr>
       <w:rPr>
-        <w:rFonts w:hint="default" w:ascii="Symbol" w:hAnsi="Symbol"/>
+        <w:rFonts w:ascii="Symbol" w:hAnsi="Symbol" w:hint="default"/>
         <w:sz w:val="20"/>
       </w:rPr>
     </w:lvl>
@@ -2512,11 +2834,11 @@
         <w:ind w:left="1440" w:hanging="360"/>
       </w:pPr>
       <w:rPr>
-        <w:rFonts w:hint="default" w:ascii="Courier New" w:hAnsi="Courier New"/>
-        <w:sz w:val="20"/>
-      </w:rPr>
-    </w:lvl>
-    <w:lvl w:ilvl="2" w:tentative="1">
+        <w:rFonts w:ascii="Courier New" w:hAnsi="Courier New" w:hint="default"/>
+        <w:sz w:val="20"/>
+      </w:rPr>
+    </w:lvl>
+    <w:lvl w:ilvl="2">
       <w:start w:val="1"/>
       <w:numFmt w:val="bullet"/>
       <w:lvlText w:val=""/>
@@ -2528,7 +2850,7 @@
         <w:ind w:left="2160" w:hanging="360"/>
       </w:pPr>
       <w:rPr>
-        <w:rFonts w:hint="default" w:ascii="Wingdings" w:hAnsi="Wingdings"/>
+        <w:rFonts w:ascii="Wingdings" w:hAnsi="Wingdings" w:hint="default"/>
         <w:sz w:val="20"/>
       </w:rPr>
     </w:lvl>
@@ -2544,7 +2866,7 @@
         <w:ind w:left="2880" w:hanging="360"/>
       </w:pPr>
       <w:rPr>
-        <w:rFonts w:hint="default" w:ascii="Wingdings" w:hAnsi="Wingdings"/>
+        <w:rFonts w:ascii="Wingdings" w:hAnsi="Wingdings" w:hint="default"/>
         <w:sz w:val="20"/>
       </w:rPr>
     </w:lvl>
@@ -2560,7 +2882,7 @@
         <w:ind w:left="3600" w:hanging="360"/>
       </w:pPr>
       <w:rPr>
-        <w:rFonts w:hint="default" w:ascii="Wingdings" w:hAnsi="Wingdings"/>
+        <w:rFonts w:ascii="Wingdings" w:hAnsi="Wingdings" w:hint="default"/>
         <w:sz w:val="20"/>
       </w:rPr>
     </w:lvl>
@@ -2576,7 +2898,7 @@
         <w:ind w:left="4320" w:hanging="360"/>
       </w:pPr>
       <w:rPr>
-        <w:rFonts w:hint="default" w:ascii="Wingdings" w:hAnsi="Wingdings"/>
+        <w:rFonts w:ascii="Wingdings" w:hAnsi="Wingdings" w:hint="default"/>
         <w:sz w:val="20"/>
       </w:rPr>
     </w:lvl>
@@ -2592,7 +2914,7 @@
         <w:ind w:left="5040" w:hanging="360"/>
       </w:pPr>
       <w:rPr>
-        <w:rFonts w:hint="default" w:ascii="Wingdings" w:hAnsi="Wingdings"/>
+        <w:rFonts w:ascii="Wingdings" w:hAnsi="Wingdings" w:hint="default"/>
         <w:sz w:val="20"/>
       </w:rPr>
     </w:lvl>
@@ -2608,7 +2930,7 @@
         <w:ind w:left="5760" w:hanging="360"/>
       </w:pPr>
       <w:rPr>
-        <w:rFonts w:hint="default" w:ascii="Wingdings" w:hAnsi="Wingdings"/>
+        <w:rFonts w:ascii="Wingdings" w:hAnsi="Wingdings" w:hint="default"/>
         <w:sz w:val="20"/>
       </w:rPr>
     </w:lvl>
@@ -2624,12 +2946,152 @@
         <w:ind w:left="6480" w:hanging="360"/>
       </w:pPr>
       <w:rPr>
-        <w:rFonts w:hint="default" w:ascii="Wingdings" w:hAnsi="Wingdings"/>
+        <w:rFonts w:ascii="Wingdings" w:hAnsi="Wingdings" w:hint="default"/>
         <w:sz w:val="20"/>
       </w:rPr>
     </w:lvl>
   </w:abstractNum>
   <w:abstractNum w:abstractNumId="3" w15:restartNumberingAfterBreak="0">
+    <w:nsid w:val="2546290C"/>
+    <w:multiLevelType w:val="hybridMultilevel"/>
+    <w:tmpl w:val="D2DE27A0"/>
+    <w:lvl w:ilvl="0" w:tplc="8AAA12FC">
+      <w:start w:val="1"/>
+      <w:numFmt w:val="bullet"/>
+      <w:lvlText w:val=""/>
+      <w:lvlJc w:val="left"/>
+      <w:pPr>
+        <w:tabs>
+          <w:tab w:val="num" w:pos="720"/>
+        </w:tabs>
+        <w:ind w:left="720" w:hanging="360"/>
+      </w:pPr>
+      <w:rPr>
+        <w:rFonts w:ascii="Symbol" w:hAnsi="Symbol" w:hint="default"/>
+      </w:rPr>
+    </w:lvl>
+    <w:lvl w:ilvl="1" w:tplc="D29AEF50" w:tentative="1">
+      <w:start w:val="1"/>
+      <w:numFmt w:val="bullet"/>
+      <w:lvlText w:val=""/>
+      <w:lvlJc w:val="left"/>
+      <w:pPr>
+        <w:tabs>
+          <w:tab w:val="num" w:pos="1440"/>
+        </w:tabs>
+        <w:ind w:left="1440" w:hanging="360"/>
+      </w:pPr>
+      <w:rPr>
+        <w:rFonts w:ascii="Symbol" w:hAnsi="Symbol" w:hint="default"/>
+      </w:rPr>
+    </w:lvl>
+    <w:lvl w:ilvl="2" w:tplc="7B3C2818" w:tentative="1">
+      <w:start w:val="1"/>
+      <w:numFmt w:val="bullet"/>
+      <w:lvlText w:val=""/>
+      <w:lvlJc w:val="left"/>
+      <w:pPr>
+        <w:tabs>
+          <w:tab w:val="num" w:pos="2160"/>
+        </w:tabs>
+        <w:ind w:left="2160" w:hanging="360"/>
+      </w:pPr>
+      <w:rPr>
+        <w:rFonts w:ascii="Symbol" w:hAnsi="Symbol" w:hint="default"/>
+      </w:rPr>
+    </w:lvl>
+    <w:lvl w:ilvl="3" w:tplc="881292F2" w:tentative="1">
+      <w:start w:val="1"/>
+      <w:numFmt w:val="bullet"/>
+      <w:lvlText w:val=""/>
+      <w:lvlJc w:val="left"/>
+      <w:pPr>
+        <w:tabs>
+          <w:tab w:val="num" w:pos="2880"/>
+        </w:tabs>
+        <w:ind w:left="2880" w:hanging="360"/>
+      </w:pPr>
+      <w:rPr>
+        <w:rFonts w:ascii="Symbol" w:hAnsi="Symbol" w:hint="default"/>
+      </w:rPr>
+    </w:lvl>
+    <w:lvl w:ilvl="4" w:tplc="FC96B980" w:tentative="1">
+      <w:start w:val="1"/>
+      <w:numFmt w:val="bullet"/>
+      <w:lvlText w:val=""/>
+      <w:lvlJc w:val="left"/>
+      <w:pPr>
+        <w:tabs>
+          <w:tab w:val="num" w:pos="3600"/>
+        </w:tabs>
+        <w:ind w:left="3600" w:hanging="360"/>
+      </w:pPr>
+      <w:rPr>
+        <w:rFonts w:ascii="Symbol" w:hAnsi="Symbol" w:hint="default"/>
+      </w:rPr>
+    </w:lvl>
+    <w:lvl w:ilvl="5" w:tplc="04688C64" w:tentative="1">
+      <w:start w:val="1"/>
+      <w:numFmt w:val="bullet"/>
+      <w:lvlText w:val=""/>
+      <w:lvlJc w:val="left"/>
+      <w:pPr>
+        <w:tabs>
+          <w:tab w:val="num" w:pos="4320"/>
+        </w:tabs>
+        <w:ind w:left="4320" w:hanging="360"/>
+      </w:pPr>
+      <w:rPr>
+        <w:rFonts w:ascii="Symbol" w:hAnsi="Symbol" w:hint="default"/>
+      </w:rPr>
+    </w:lvl>
+    <w:lvl w:ilvl="6" w:tplc="72E8A22A" w:tentative="1">
+      <w:start w:val="1"/>
+      <w:numFmt w:val="bullet"/>
+      <w:lvlText w:val=""/>
+      <w:lvlJc w:val="left"/>
+      <w:pPr>
+        <w:tabs>
+          <w:tab w:val="num" w:pos="5040"/>
+        </w:tabs>
+        <w:ind w:left="5040" w:hanging="360"/>
+      </w:pPr>
+      <w:rPr>
+        <w:rFonts w:ascii="Symbol" w:hAnsi="Symbol" w:hint="default"/>
+      </w:rPr>
+    </w:lvl>
+    <w:lvl w:ilvl="7" w:tplc="D1460372" w:tentative="1">
+      <w:start w:val="1"/>
+      <w:numFmt w:val="bullet"/>
+      <w:lvlText w:val=""/>
+      <w:lvlJc w:val="left"/>
+      <w:pPr>
+        <w:tabs>
+          <w:tab w:val="num" w:pos="5760"/>
+        </w:tabs>
+        <w:ind w:left="5760" w:hanging="360"/>
+      </w:pPr>
+      <w:rPr>
+        <w:rFonts w:ascii="Symbol" w:hAnsi="Symbol" w:hint="default"/>
+      </w:rPr>
+    </w:lvl>
+    <w:lvl w:ilvl="8" w:tplc="67884956" w:tentative="1">
+      <w:start w:val="1"/>
+      <w:numFmt w:val="bullet"/>
+      <w:lvlText w:val=""/>
+      <w:lvlJc w:val="left"/>
+      <w:pPr>
+        <w:tabs>
+          <w:tab w:val="num" w:pos="6480"/>
+        </w:tabs>
+        <w:ind w:left="6480" w:hanging="360"/>
+      </w:pPr>
+      <w:rPr>
+        <w:rFonts w:ascii="Symbol" w:hAnsi="Symbol" w:hint="default"/>
+      </w:rPr>
+    </w:lvl>
+  </w:abstractNum>
+  <w:abstractNum w:abstractNumId="4" w15:restartNumberingAfterBreak="0">
     <w:nsid w:val="27C02461"/>
     <w:multiLevelType w:val="multilevel"/>
     <w:tmpl w:val="8D12956C"/>
@@ -2645,7 +3107,7 @@
         <w:ind w:left="720" w:hanging="360"/>
       </w:pPr>
       <w:rPr>
-        <w:rFonts w:hint="default" w:ascii="Symbol" w:hAnsi="Symbol"/>
+        <w:rFonts w:ascii="Symbol" w:hAnsi="Symbol" w:hint="default"/>
         <w:sz w:val="20"/>
       </w:rPr>
     </w:lvl>
@@ -2661,7 +3123,7 @@
         <w:ind w:left="1440" w:hanging="360"/>
       </w:pPr>
       <w:rPr>
-        <w:rFonts w:hint="default" w:ascii="Courier New" w:hAnsi="Courier New"/>
+        <w:rFonts w:ascii="Courier New" w:hAnsi="Courier New" w:hint="default"/>
         <w:sz w:val="20"/>
       </w:rPr>
     </w:lvl>
@@ -2677,7 +3139,7 @@
         <w:ind w:left="2160" w:hanging="360"/>
       </w:pPr>
       <w:rPr>
-        <w:rFonts w:hint="default" w:ascii="Wingdings" w:hAnsi="Wingdings"/>
+        <w:rFonts w:ascii="Wingdings" w:hAnsi="Wingdings" w:hint="default"/>
         <w:sz w:val="20"/>
       </w:rPr>
     </w:lvl>
@@ -2693,7 +3155,7 @@
         <w:ind w:left="2880" w:hanging="360"/>
       </w:pPr>
       <w:rPr>
-        <w:rFonts w:hint="default" w:ascii="Wingdings" w:hAnsi="Wingdings"/>
+        <w:rFonts w:ascii="Wingdings" w:hAnsi="Wingdings" w:hint="default"/>
         <w:sz w:val="20"/>
       </w:rPr>
     </w:lvl>
@@ -2709,7 +3171,7 @@
         <w:ind w:left="3600" w:hanging="360"/>
       </w:pPr>
       <w:rPr>
-        <w:rFonts w:hint="default" w:ascii="Wingdings" w:hAnsi="Wingdings"/>
+        <w:rFonts w:ascii="Wingdings" w:hAnsi="Wingdings" w:hint="default"/>
         <w:sz w:val="20"/>
       </w:rPr>
     </w:lvl>
@@ -2725,7 +3187,7 @@
         <w:ind w:left="4320" w:hanging="360"/>
       </w:pPr>
       <w:rPr>
-        <w:rFonts w:hint="default" w:ascii="Wingdings" w:hAnsi="Wingdings"/>
+        <w:rFonts w:ascii="Wingdings" w:hAnsi="Wingdings" w:hint="default"/>
         <w:sz w:val="20"/>
       </w:rPr>
     </w:lvl>
@@ -2741,7 +3203,7 @@
         <w:ind w:left="5040" w:hanging="360"/>
       </w:pPr>
       <w:rPr>
-        <w:rFonts w:hint="default" w:ascii="Wingdings" w:hAnsi="Wingdings"/>
+        <w:rFonts w:ascii="Wingdings" w:hAnsi="Wingdings" w:hint="default"/>
         <w:sz w:val="20"/>
       </w:rPr>
     </w:lvl>
@@ -2757,7 +3219,7 @@
         <w:ind w:left="5760" w:hanging="360"/>
       </w:pPr>
       <w:rPr>
-        <w:rFonts w:hint="default" w:ascii="Wingdings" w:hAnsi="Wingdings"/>
+        <w:rFonts w:ascii="Wingdings" w:hAnsi="Wingdings" w:hint="default"/>
         <w:sz w:val="20"/>
       </w:rPr>
     </w:lvl>
@@ -2773,12 +3235,12 @@
         <w:ind w:left="6480" w:hanging="360"/>
       </w:pPr>
       <w:rPr>
-        <w:rFonts w:hint="default" w:ascii="Wingdings" w:hAnsi="Wingdings"/>
+        <w:rFonts w:ascii="Wingdings" w:hAnsi="Wingdings" w:hint="default"/>
         <w:sz w:val="20"/>
       </w:rPr>
     </w:lvl>
   </w:abstractNum>
-  <w:abstractNum w:abstractNumId="4" w15:restartNumberingAfterBreak="0">
+  <w:abstractNum w:abstractNumId="5" w15:restartNumberingAfterBreak="0">
     <w:nsid w:val="2B8C4A43"/>
     <w:multiLevelType w:val="multilevel"/>
     <w:tmpl w:val="69CC28AA"/>
@@ -2794,7 +3256,7 @@
         <w:ind w:left="720" w:hanging="360"/>
       </w:pPr>
       <w:rPr>
-        <w:rFonts w:hint="default" w:ascii="Symbol" w:hAnsi="Symbol"/>
+        <w:rFonts w:ascii="Symbol" w:hAnsi="Symbol" w:hint="default"/>
         <w:sz w:val="20"/>
       </w:rPr>
     </w:lvl>
@@ -2810,7 +3272,7 @@
         <w:ind w:left="1440" w:hanging="360"/>
       </w:pPr>
       <w:rPr>
-        <w:rFonts w:hint="default" w:ascii="Courier New" w:hAnsi="Courier New"/>
+        <w:rFonts w:ascii="Courier New" w:hAnsi="Courier New" w:hint="default"/>
         <w:sz w:val="20"/>
       </w:rPr>
     </w:lvl>
@@ -2826,7 +3288,7 @@
         <w:ind w:left="2160" w:hanging="360"/>
       </w:pPr>
       <w:rPr>
-        <w:rFonts w:hint="default" w:ascii="Wingdings" w:hAnsi="Wingdings"/>
+        <w:rFonts w:ascii="Wingdings" w:hAnsi="Wingdings" w:hint="default"/>
         <w:sz w:val="20"/>
       </w:rPr>
     </w:lvl>
@@ -2842,7 +3304,7 @@
         <w:ind w:left="2880" w:hanging="360"/>
       </w:pPr>
       <w:rPr>
-        <w:rFonts w:hint="default" w:ascii="Wingdings" w:hAnsi="Wingdings"/>
+        <w:rFonts w:ascii="Wingdings" w:hAnsi="Wingdings" w:hint="default"/>
         <w:sz w:val="20"/>
       </w:rPr>
     </w:lvl>
@@ -2858,7 +3320,7 @@
         <w:ind w:left="3600" w:hanging="360"/>
       </w:pPr>
       <w:rPr>
-        <w:rFonts w:hint="default" w:ascii="Wingdings" w:hAnsi="Wingdings"/>
+        <w:rFonts w:ascii="Wingdings" w:hAnsi="Wingdings" w:hint="default"/>
         <w:sz w:val="20"/>
       </w:rPr>
     </w:lvl>
@@ -2874,7 +3336,7 @@
         <w:ind w:left="4320" w:hanging="360"/>
       </w:pPr>
       <w:rPr>
-        <w:rFonts w:hint="default" w:ascii="Wingdings" w:hAnsi="Wingdings"/>
+        <w:rFonts w:ascii="Wingdings" w:hAnsi="Wingdings" w:hint="default"/>
         <w:sz w:val="20"/>
       </w:rPr>
     </w:lvl>
@@ -2890,7 +3352,7 @@
         <w:ind w:left="5040" w:hanging="360"/>
       </w:pPr>
       <w:rPr>
-        <w:rFonts w:hint="default" w:ascii="Wingdings" w:hAnsi="Wingdings"/>
+        <w:rFonts w:ascii="Wingdings" w:hAnsi="Wingdings" w:hint="default"/>
         <w:sz w:val="20"/>
       </w:rPr>
     </w:lvl>
@@ -2906,7 +3368,7 @@
         <w:ind w:left="5760" w:hanging="360"/>
       </w:pPr>
       <w:rPr>
-        <w:rFonts w:hint="default" w:ascii="Wingdings" w:hAnsi="Wingdings"/>
+        <w:rFonts w:ascii="Wingdings" w:hAnsi="Wingdings" w:hint="default"/>
         <w:sz w:val="20"/>
       </w:rPr>
     </w:lvl>
@@ -2922,12 +3384,12 @@
         <w:ind w:left="6480" w:hanging="360"/>
       </w:pPr>
       <w:rPr>
-        <w:rFonts w:hint="default" w:ascii="Wingdings" w:hAnsi="Wingdings"/>
+        <w:rFonts w:ascii="Wingdings" w:hAnsi="Wingdings" w:hint="default"/>
         <w:sz w:val="20"/>
       </w:rPr>
     </w:lvl>
   </w:abstractNum>
-  <w:abstractNum w:abstractNumId="5" w15:restartNumberingAfterBreak="0">
+  <w:abstractNum w:abstractNumId="6" w15:restartNumberingAfterBreak="0">
     <w:nsid w:val="40AE1833"/>
     <w:multiLevelType w:val="multilevel"/>
     <w:tmpl w:val="035EAFC4"/>
@@ -2943,7 +3405,7 @@
         <w:ind w:left="720" w:hanging="360"/>
       </w:pPr>
       <w:rPr>
-        <w:rFonts w:hint="default" w:ascii="Symbol" w:hAnsi="Symbol"/>
+        <w:rFonts w:ascii="Symbol" w:hAnsi="Symbol" w:hint="default"/>
         <w:sz w:val="20"/>
       </w:rPr>
     </w:lvl>
@@ -2959,7 +3421,7 @@
         <w:ind w:left="1440" w:hanging="360"/>
       </w:pPr>
       <w:rPr>
-        <w:rFonts w:hint="default" w:ascii="Courier New" w:hAnsi="Courier New"/>
+        <w:rFonts w:ascii="Courier New" w:hAnsi="Courier New" w:hint="default"/>
         <w:sz w:val="20"/>
       </w:rPr>
     </w:lvl>
@@ -2975,7 +3437,7 @@
         <w:ind w:left="2160" w:hanging="360"/>
       </w:pPr>
       <w:rPr>
-        <w:rFonts w:hint="default" w:ascii="Wingdings" w:hAnsi="Wingdings"/>
+        <w:rFonts w:ascii="Wingdings" w:hAnsi="Wingdings" w:hint="default"/>
         <w:sz w:val="20"/>
       </w:rPr>
     </w:lvl>
@@ -2991,7 +3453,7 @@
         <w:ind w:left="2880" w:hanging="360"/>
       </w:pPr>
       <w:rPr>
-        <w:rFonts w:hint="default" w:ascii="Wingdings" w:hAnsi="Wingdings"/>
+        <w:rFonts w:ascii="Wingdings" w:hAnsi="Wingdings" w:hint="default"/>
         <w:sz w:val="20"/>
       </w:rPr>
     </w:lvl>
@@ -3007,7 +3469,7 @@
         <w:ind w:left="3600" w:hanging="360"/>
       </w:pPr>
       <w:rPr>
-        <w:rFonts w:hint="default" w:ascii="Wingdings" w:hAnsi="Wingdings"/>
+        <w:rFonts w:ascii="Wingdings" w:hAnsi="Wingdings" w:hint="default"/>
         <w:sz w:val="20"/>
       </w:rPr>
     </w:lvl>
@@ -3023,7 +3485,7 @@
         <w:ind w:left="4320" w:hanging="360"/>
       </w:pPr>
       <w:rPr>
-        <w:rFonts w:hint="default" w:ascii="Wingdings" w:hAnsi="Wingdings"/>
+        <w:rFonts w:ascii="Wingdings" w:hAnsi="Wingdings" w:hint="default"/>
         <w:sz w:val="20"/>
       </w:rPr>
     </w:lvl>
@@ -3039,7 +3501,7 @@
         <w:ind w:left="5040" w:hanging="360"/>
       </w:pPr>
       <w:rPr>
-        <w:rFonts w:hint="default" w:ascii="Wingdings" w:hAnsi="Wingdings"/>
+        <w:rFonts w:ascii="Wingdings" w:hAnsi="Wingdings" w:hint="default"/>
         <w:sz w:val="20"/>
       </w:rPr>
     </w:lvl>
@@ -3055,7 +3517,7 @@
         <w:ind w:left="5760" w:hanging="360"/>
       </w:pPr>
       <w:rPr>
-        <w:rFonts w:hint="default" w:ascii="Wingdings" w:hAnsi="Wingdings"/>
+        <w:rFonts w:ascii="Wingdings" w:hAnsi="Wingdings" w:hint="default"/>
         <w:sz w:val="20"/>
       </w:rPr>
     </w:lvl>
@@ -3071,12 +3533,12 @@
         <w:ind w:left="6480" w:hanging="360"/>
       </w:pPr>
       <w:rPr>
-        <w:rFonts w:hint="default" w:ascii="Wingdings" w:hAnsi="Wingdings"/>
+        <w:rFonts w:ascii="Wingdings" w:hAnsi="Wingdings" w:hint="default"/>
         <w:sz w:val="20"/>
       </w:rPr>
     </w:lvl>
   </w:abstractNum>
-  <w:abstractNum w:abstractNumId="6" w15:restartNumberingAfterBreak="0">
+  <w:abstractNum w:abstractNumId="7" w15:restartNumberingAfterBreak="0">
     <w:nsid w:val="4E833068"/>
     <w:multiLevelType w:val="multilevel"/>
     <w:tmpl w:val="711CB56A"/>
@@ -3092,7 +3554,7 @@
         <w:ind w:left="720" w:hanging="360"/>
       </w:pPr>
       <w:rPr>
-        <w:rFonts w:hint="default" w:ascii="Symbol" w:hAnsi="Symbol"/>
+        <w:rFonts w:ascii="Symbol" w:hAnsi="Symbol" w:hint="default"/>
         <w:sz w:val="20"/>
       </w:rPr>
     </w:lvl>
@@ -3108,11 +3570,11 @@
         <w:ind w:left="1440" w:hanging="360"/>
       </w:pPr>
       <w:rPr>
-        <w:rFonts w:hint="default" w:ascii="Courier New" w:hAnsi="Courier New"/>
-        <w:sz w:val="20"/>
-      </w:rPr>
-    </w:lvl>
-    <w:lvl w:ilvl="2" w:tentative="1">
+        <w:rFonts w:ascii="Courier New" w:hAnsi="Courier New" w:hint="default"/>
+        <w:sz w:val="20"/>
+      </w:rPr>
+    </w:lvl>
+    <w:lvl w:ilvl="2">
       <w:start w:val="1"/>
       <w:numFmt w:val="bullet"/>
       <w:lvlText w:val=""/>
@@ -3124,7 +3586,7 @@
         <w:ind w:left="2160" w:hanging="360"/>
       </w:pPr>
       <w:rPr>
-        <w:rFonts w:hint="default" w:ascii="Wingdings" w:hAnsi="Wingdings"/>
+        <w:rFonts w:ascii="Wingdings" w:hAnsi="Wingdings" w:hint="default"/>
         <w:sz w:val="20"/>
       </w:rPr>
     </w:lvl>
@@ -3140,7 +3602,7 @@
         <w:ind w:left="2880" w:hanging="360"/>
       </w:pPr>
       <w:rPr>
-        <w:rFonts w:hint="default" w:ascii="Wingdings" w:hAnsi="Wingdings"/>
+        <w:rFonts w:ascii="Wingdings" w:hAnsi="Wingdings" w:hint="default"/>
         <w:sz w:val="20"/>
       </w:rPr>
     </w:lvl>
@@ -3156,7 +3618,7 @@
         <w:ind w:left="3600" w:hanging="360"/>
       </w:pPr>
       <w:rPr>
-        <w:rFonts w:hint="default" w:ascii="Wingdings" w:hAnsi="Wingdings"/>
+        <w:rFonts w:ascii="Wingdings" w:hAnsi="Wingdings" w:hint="default"/>
         <w:sz w:val="20"/>
       </w:rPr>
     </w:lvl>
@@ -3172,7 +3634,7 @@
         <w:ind w:left="4320" w:hanging="360"/>
       </w:pPr>
       <w:rPr>
-        <w:rFonts w:hint="default" w:ascii="Wingdings" w:hAnsi="Wingdings"/>
+        <w:rFonts w:ascii="Wingdings" w:hAnsi="Wingdings" w:hint="default"/>
         <w:sz w:val="20"/>
       </w:rPr>
     </w:lvl>
@@ -3188,7 +3650,7 @@
         <w:ind w:left="5040" w:hanging="360"/>
       </w:pPr>
       <w:rPr>
-        <w:rFonts w:hint="default" w:ascii="Wingdings" w:hAnsi="Wingdings"/>
+        <w:rFonts w:ascii="Wingdings" w:hAnsi="Wingdings" w:hint="default"/>
         <w:sz w:val="20"/>
       </w:rPr>
     </w:lvl>
@@ -3204,7 +3666,7 @@
         <w:ind w:left="5760" w:hanging="360"/>
       </w:pPr>
       <w:rPr>
-        <w:rFonts w:hint="default" w:ascii="Wingdings" w:hAnsi="Wingdings"/>
+        <w:rFonts w:ascii="Wingdings" w:hAnsi="Wingdings" w:hint="default"/>
         <w:sz w:val="20"/>
       </w:rPr>
     </w:lvl>
@@ -3220,12 +3682,125 @@
         <w:ind w:left="6480" w:hanging="360"/>
       </w:pPr>
       <w:rPr>
-        <w:rFonts w:hint="default" w:ascii="Wingdings" w:hAnsi="Wingdings"/>
+        <w:rFonts w:ascii="Wingdings" w:hAnsi="Wingdings" w:hint="default"/>
         <w:sz w:val="20"/>
       </w:rPr>
     </w:lvl>
   </w:abstractNum>
-  <w:abstractNum w:abstractNumId="7" w15:restartNumberingAfterBreak="0">
+  <w:abstractNum w:abstractNumId="8" w15:restartNumberingAfterBreak="0">
+    <w:nsid w:val="55E9712E"/>
+    <w:multiLevelType w:val="hybridMultilevel"/>
+    <w:tmpl w:val="EA3CB0FC"/>
+    <w:lvl w:ilvl="0" w:tplc="23C485CE">
+      <w:start w:val="1"/>
+      <w:numFmt w:val="bullet"/>
+      <w:lvlText w:val="-"/>
+      <w:lvlJc w:val="left"/>
+      <w:pPr>
+        <w:ind w:left="2520" w:hanging="360"/>
+      </w:pPr>
+      <w:rPr>
+        <w:rFonts w:ascii="Aptos" w:hAnsi="Aptos" w:hint="default"/>
+      </w:rPr>
+    </w:lvl>
+    <w:lvl w:ilvl="1" w:tplc="970C1B6A">
+      <w:start w:val="1"/>
+      <w:numFmt w:val="bullet"/>
+      <w:lvlText w:val="o"/>
+      <w:lvlJc w:val="left"/>
+      <w:pPr>
+        <w:ind w:left="3240" w:hanging="360"/>
+      </w:pPr>
+      <w:rPr>
+        <w:rFonts w:ascii="Courier New" w:hAnsi="Courier New" w:hint="default"/>
+      </w:rPr>
+    </w:lvl>
+    <w:lvl w:ilvl="2" w:tplc="036ED9DE">
+      <w:start w:val="1"/>
+      <w:numFmt w:val="bullet"/>
+      <w:lvlText w:val=""/>
+      <w:lvlJc w:val="left"/>
+      <w:pPr>
+        <w:ind w:left="3960" w:hanging="360"/>
+      </w:pPr>
+      <w:rPr>
+        <w:rFonts w:ascii="Wingdings" w:hAnsi="Wingdings" w:hint="default"/>
+      </w:rPr>
+    </w:lvl>
+    <w:lvl w:ilvl="3" w:tplc="C02ABB92">
+      <w:start w:val="1"/>
+      <w:numFmt w:val="bullet"/>
+      <w:lvlText w:val=""/>
+      <w:lvlJc w:val="left"/>
+      <w:pPr>
+        <w:ind w:left="4680" w:hanging="360"/>
+      </w:pPr>
+      <w:rPr>
+        <w:rFonts w:ascii="Symbol" w:hAnsi="Symbol" w:hint="default"/>
+      </w:rPr>
+    </w:lvl>
+    <w:lvl w:ilvl="4" w:tplc="47E0D6B2">
+      <w:start w:val="1"/>
+      <w:numFmt w:val="bullet"/>
+      <w:lvlText w:val="o"/>
+      <w:lvlJc w:val="left"/>
+      <w:pPr>
+        <w:ind w:left="5400" w:hanging="360"/>
+      </w:pPr>
+      <w:rPr>
+        <w:rFonts w:ascii="Courier New" w:hAnsi="Courier New" w:hint="default"/>
+      </w:rPr>
+    </w:lvl>
+    <w:lvl w:ilvl="5" w:tplc="218A0D56">
+      <w:start w:val="1"/>
+      <w:numFmt w:val="bullet"/>
+      <w:lvlText w:val=""/>
+      <w:lvlJc w:val="left"/>
+      <w:pPr>
+        <w:ind w:left="6120" w:hanging="360"/>
+      </w:pPr>
+      <w:rPr>
+        <w:rFonts w:ascii="Wingdings" w:hAnsi="Wingdings" w:hint="default"/>
+      </w:rPr>
+    </w:lvl>
+    <w:lvl w:ilvl="6" w:tplc="18888C22">
+      <w:start w:val="1"/>
+      <w:numFmt w:val="bullet"/>
+      <w:lvlText w:val=""/>
+      <w:lvlJc w:val="left"/>
+      <w:pPr>
+        <w:ind w:left="6840" w:hanging="360"/>
+      </w:pPr>
+      <w:rPr>
+        <w:rFonts w:ascii="Symbol" w:hAnsi="Symbol" w:hint="default"/>
+      </w:rPr>
+    </w:lvl>
+    <w:lvl w:ilvl="7" w:tplc="9FFC0900">
+      <w:start w:val="1"/>
+      <w:numFmt w:val="bullet"/>
+      <w:lvlText w:val="o"/>
+      <w:lvlJc w:val="left"/>
+      <w:pPr>
+        <w:ind w:left="7560" w:hanging="360"/>
+      </w:pPr>
+      <w:rPr>
+        <w:rFonts w:ascii="Courier New" w:hAnsi="Courier New" w:hint="default"/>
+      </w:rPr>
+    </w:lvl>
+    <w:lvl w:ilvl="8" w:tplc="99888E66">
+      <w:start w:val="1"/>
+      <w:numFmt w:val="bullet"/>
+      <w:lvlText w:val=""/>
+      <w:lvlJc w:val="left"/>
+      <w:pPr>
+        <w:ind w:left="8280" w:hanging="360"/>
+      </w:pPr>
+      <w:rPr>
+        <w:rFonts w:ascii="Wingdings" w:hAnsi="Wingdings" w:hint="default"/>
+      </w:rPr>
+    </w:lvl>
+  </w:abstractNum>
+  <w:abstractNum w:abstractNumId="9" w15:restartNumberingAfterBreak="0">
     <w:nsid w:val="5EA80C6A"/>
     <w:multiLevelType w:val="multilevel"/>
     <w:tmpl w:val="E62014F6"/>
@@ -3241,7 +3816,7 @@
         <w:ind w:left="720" w:hanging="360"/>
       </w:pPr>
       <w:rPr>
-        <w:rFonts w:hint="default" w:ascii="Symbol" w:hAnsi="Symbol"/>
+        <w:rFonts w:ascii="Symbol" w:hAnsi="Symbol" w:hint="default"/>
         <w:sz w:val="20"/>
       </w:rPr>
     </w:lvl>
@@ -3257,7 +3832,7 @@
         <w:ind w:left="1440" w:hanging="360"/>
       </w:pPr>
       <w:rPr>
-        <w:rFonts w:hint="default" w:ascii="Courier New" w:hAnsi="Courier New"/>
+        <w:rFonts w:ascii="Courier New" w:hAnsi="Courier New" w:hint="default"/>
         <w:sz w:val="20"/>
       </w:rPr>
     </w:lvl>
@@ -3273,7 +3848,7 @@
         <w:ind w:left="2160" w:hanging="360"/>
       </w:pPr>
       <w:rPr>
-        <w:rFonts w:hint="default" w:ascii="Wingdings" w:hAnsi="Wingdings"/>
+        <w:rFonts w:ascii="Wingdings" w:hAnsi="Wingdings" w:hint="default"/>
         <w:sz w:val="20"/>
       </w:rPr>
     </w:lvl>
@@ -3289,7 +3864,7 @@
         <w:ind w:left="2880" w:hanging="360"/>
       </w:pPr>
       <w:rPr>
-        <w:rFonts w:hint="default" w:ascii="Wingdings" w:hAnsi="Wingdings"/>
+        <w:rFonts w:ascii="Wingdings" w:hAnsi="Wingdings" w:hint="default"/>
         <w:sz w:val="20"/>
       </w:rPr>
     </w:lvl>
@@ -3305,7 +3880,7 @@
         <w:ind w:left="3600" w:hanging="360"/>
       </w:pPr>
       <w:rPr>
-        <w:rFonts w:hint="default" w:ascii="Wingdings" w:hAnsi="Wingdings"/>
+        <w:rFonts w:ascii="Wingdings" w:hAnsi="Wingdings" w:hint="default"/>
         <w:sz w:val="20"/>
       </w:rPr>
     </w:lvl>
@@ -3321,7 +3896,7 @@
         <w:ind w:left="4320" w:hanging="360"/>
       </w:pPr>
       <w:rPr>
-        <w:rFonts w:hint="default" w:ascii="Wingdings" w:hAnsi="Wingdings"/>
+        <w:rFonts w:ascii="Wingdings" w:hAnsi="Wingdings" w:hint="default"/>
         <w:sz w:val="20"/>
       </w:rPr>
     </w:lvl>
@@ -3337,7 +3912,7 @@
         <w:ind w:left="5040" w:hanging="360"/>
       </w:pPr>
       <w:rPr>
-        <w:rFonts w:hint="default" w:ascii="Wingdings" w:hAnsi="Wingdings"/>
+        <w:rFonts w:ascii="Wingdings" w:hAnsi="Wingdings" w:hint="default"/>
         <w:sz w:val="20"/>
       </w:rPr>
     </w:lvl>
@@ -3353,7 +3928,7 @@
         <w:ind w:left="5760" w:hanging="360"/>
       </w:pPr>
       <w:rPr>
-        <w:rFonts w:hint="default" w:ascii="Wingdings" w:hAnsi="Wingdings"/>
+        <w:rFonts w:ascii="Wingdings" w:hAnsi="Wingdings" w:hint="default"/>
         <w:sz w:val="20"/>
       </w:rPr>
     </w:lvl>
@@ -3369,12 +3944,12 @@
         <w:ind w:left="6480" w:hanging="360"/>
       </w:pPr>
       <w:rPr>
-        <w:rFonts w:hint="default" w:ascii="Wingdings" w:hAnsi="Wingdings"/>
+        <w:rFonts w:ascii="Wingdings" w:hAnsi="Wingdings" w:hint="default"/>
         <w:sz w:val="20"/>
       </w:rPr>
     </w:lvl>
   </w:abstractNum>
-  <w:abstractNum w:abstractNumId="8" w15:restartNumberingAfterBreak="0">
+  <w:abstractNum w:abstractNumId="10" w15:restartNumberingAfterBreak="0">
     <w:nsid w:val="78C62644"/>
     <w:multiLevelType w:val="multilevel"/>
     <w:tmpl w:val="7EC0205C"/>
@@ -3390,7 +3965,7 @@
         <w:ind w:left="720" w:hanging="360"/>
       </w:pPr>
       <w:rPr>
-        <w:rFonts w:hint="default" w:ascii="Symbol" w:hAnsi="Symbol"/>
+        <w:rFonts w:ascii="Symbol" w:hAnsi="Symbol" w:hint="default"/>
         <w:sz w:val="20"/>
       </w:rPr>
     </w:lvl>
@@ -3406,7 +3981,7 @@
         <w:ind w:left="1440" w:hanging="360"/>
       </w:pPr>
       <w:rPr>
-        <w:rFonts w:hint="default" w:ascii="Courier New" w:hAnsi="Courier New"/>
+        <w:rFonts w:ascii="Courier New" w:hAnsi="Courier New" w:hint="default"/>
         <w:sz w:val="20"/>
       </w:rPr>
     </w:lvl>
@@ -3422,7 +3997,7 @@
         <w:ind w:left="2160" w:hanging="360"/>
       </w:pPr>
       <w:rPr>
-        <w:rFonts w:hint="default" w:ascii="Wingdings" w:hAnsi="Wingdings"/>
+        <w:rFonts w:ascii="Wingdings" w:hAnsi="Wingdings" w:hint="default"/>
         <w:sz w:val="20"/>
       </w:rPr>
     </w:lvl>
@@ -3438,7 +4013,7 @@
         <w:ind w:left="2880" w:hanging="360"/>
       </w:pPr>
       <w:rPr>
-        <w:rFonts w:hint="default" w:ascii="Wingdings" w:hAnsi="Wingdings"/>
+        <w:rFonts w:ascii="Wingdings" w:hAnsi="Wingdings" w:hint="default"/>
         <w:sz w:val="20"/>
       </w:rPr>
     </w:lvl>
@@ -3454,7 +4029,7 @@
         <w:ind w:left="3600" w:hanging="360"/>
       </w:pPr>
       <w:rPr>
-        <w:rFonts w:hint="default" w:ascii="Wingdings" w:hAnsi="Wingdings"/>
+        <w:rFonts w:ascii="Wingdings" w:hAnsi="Wingdings" w:hint="default"/>
         <w:sz w:val="20"/>
       </w:rPr>
     </w:lvl>
@@ -3470,7 +4045,7 @@
         <w:ind w:left="4320" w:hanging="360"/>
       </w:pPr>
       <w:rPr>
-        <w:rFonts w:hint="default" w:ascii="Wingdings" w:hAnsi="Wingdings"/>
+        <w:rFonts w:ascii="Wingdings" w:hAnsi="Wingdings" w:hint="default"/>
         <w:sz w:val="20"/>
       </w:rPr>
     </w:lvl>
@@ -3486,7 +4061,7 @@
         <w:ind w:left="5040" w:hanging="360"/>
       </w:pPr>
       <w:rPr>
-        <w:rFonts w:hint="default" w:ascii="Wingdings" w:hAnsi="Wingdings"/>
+        <w:rFonts w:ascii="Wingdings" w:hAnsi="Wingdings" w:hint="default"/>
         <w:sz w:val="20"/>
       </w:rPr>
     </w:lvl>
@@ -3502,7 +4077,7 @@
         <w:ind w:left="5760" w:hanging="360"/>
       </w:pPr>
       <w:rPr>
-        <w:rFonts w:hint="default" w:ascii="Wingdings" w:hAnsi="Wingdings"/>
+        <w:rFonts w:ascii="Wingdings" w:hAnsi="Wingdings" w:hint="default"/>
         <w:sz w:val="20"/>
       </w:rPr>
     </w:lvl>
@@ -3518,12 +4093,12 @@
         <w:ind w:left="6480" w:hanging="360"/>
       </w:pPr>
       <w:rPr>
-        <w:rFonts w:hint="default" w:ascii="Wingdings" w:hAnsi="Wingdings"/>
+        <w:rFonts w:ascii="Wingdings" w:hAnsi="Wingdings" w:hint="default"/>
         <w:sz w:val="20"/>
       </w:rPr>
     </w:lvl>
   </w:abstractNum>
-  <w:abstractNum w:abstractNumId="9" w15:restartNumberingAfterBreak="0">
+  <w:abstractNum w:abstractNumId="11" w15:restartNumberingAfterBreak="0">
     <w:nsid w:val="7D1F6DBE"/>
     <w:multiLevelType w:val="multilevel"/>
     <w:tmpl w:val="E62CE096"/>
@@ -3539,7 +4114,7 @@
         <w:ind w:left="720" w:hanging="360"/>
       </w:pPr>
       <w:rPr>
-        <w:rFonts w:hint="default" w:ascii="Symbol" w:hAnsi="Symbol"/>
+        <w:rFonts w:ascii="Symbol" w:hAnsi="Symbol" w:hint="default"/>
         <w:sz w:val="20"/>
       </w:rPr>
     </w:lvl>
@@ -3555,7 +4130,7 @@
         <w:ind w:left="1440" w:hanging="360"/>
       </w:pPr>
       <w:rPr>
-        <w:rFonts w:hint="default" w:ascii="Courier New" w:hAnsi="Courier New"/>
+        <w:rFonts w:ascii="Courier New" w:hAnsi="Courier New" w:hint="default"/>
         <w:sz w:val="20"/>
       </w:rPr>
     </w:lvl>
@@ -3571,7 +4146,7 @@
         <w:ind w:left="2160" w:hanging="360"/>
       </w:pPr>
       <w:rPr>
-        <w:rFonts w:hint="default" w:ascii="Wingdings" w:hAnsi="Wingdings"/>
+        <w:rFonts w:ascii="Wingdings" w:hAnsi="Wingdings" w:hint="default"/>
         <w:sz w:val="20"/>
       </w:rPr>
     </w:lvl>
@@ -3587,7 +4162,7 @@
         <w:ind w:left="2880" w:hanging="360"/>
       </w:pPr>
       <w:rPr>
-        <w:rFonts w:hint="default" w:ascii="Wingdings" w:hAnsi="Wingdings"/>
+        <w:rFonts w:ascii="Wingdings" w:hAnsi="Wingdings" w:hint="default"/>
         <w:sz w:val="20"/>
       </w:rPr>
     </w:lvl>
@@ -3603,7 +4178,7 @@
         <w:ind w:left="3600" w:hanging="360"/>
       </w:pPr>
       <w:rPr>
-        <w:rFonts w:hint="default" w:ascii="Wingdings" w:hAnsi="Wingdings"/>
+        <w:rFonts w:ascii="Wingdings" w:hAnsi="Wingdings" w:hint="default"/>
         <w:sz w:val="20"/>
       </w:rPr>
     </w:lvl>
@@ -3619,7 +4194,7 @@
         <w:ind w:left="4320" w:hanging="360"/>
       </w:pPr>
       <w:rPr>
-        <w:rFonts w:hint="default" w:ascii="Wingdings" w:hAnsi="Wingdings"/>
+        <w:rFonts w:ascii="Wingdings" w:hAnsi="Wingdings" w:hint="default"/>
         <w:sz w:val="20"/>
       </w:rPr>
     </w:lvl>
@@ -3635,7 +4210,7 @@
         <w:ind w:left="5040" w:hanging="360"/>
       </w:pPr>
       <w:rPr>
-        <w:rFonts w:hint="default" w:ascii="Wingdings" w:hAnsi="Wingdings"/>
+        <w:rFonts w:ascii="Wingdings" w:hAnsi="Wingdings" w:hint="default"/>
         <w:sz w:val="20"/>
       </w:rPr>
     </w:lvl>
@@ -3651,7 +4226,7 @@
         <w:ind w:left="5760" w:hanging="360"/>
       </w:pPr>
       <w:rPr>
-        <w:rFonts w:hint="default" w:ascii="Wingdings" w:hAnsi="Wingdings"/>
+        <w:rFonts w:ascii="Wingdings" w:hAnsi="Wingdings" w:hint="default"/>
         <w:sz w:val="20"/>
       </w:rPr>
     </w:lvl>
@@ -3667,12 +4242,12 @@
         <w:ind w:left="6480" w:hanging="360"/>
       </w:pPr>
       <w:rPr>
-        <w:rFonts w:hint="default" w:ascii="Wingdings" w:hAnsi="Wingdings"/>
+        <w:rFonts w:ascii="Wingdings" w:hAnsi="Wingdings" w:hint="default"/>
         <w:sz w:val="20"/>
       </w:rPr>
     </w:lvl>
   </w:abstractNum>
-  <w:abstractNum w:abstractNumId="10" w15:restartNumberingAfterBreak="0">
+  <w:abstractNum w:abstractNumId="12" w15:restartNumberingAfterBreak="0">
     <w:nsid w:val="7DA02E7F"/>
     <w:multiLevelType w:val="multilevel"/>
     <w:tmpl w:val="13089344"/>
@@ -3688,7 +4263,7 @@
         <w:ind w:left="720" w:hanging="360"/>
       </w:pPr>
       <w:rPr>
-        <w:rFonts w:hint="default" w:ascii="Symbol" w:hAnsi="Symbol"/>
+        <w:rFonts w:ascii="Symbol" w:hAnsi="Symbol" w:hint="default"/>
         <w:sz w:val="20"/>
       </w:rPr>
     </w:lvl>
@@ -3704,7 +4279,7 @@
         <w:ind w:left="1440" w:hanging="360"/>
       </w:pPr>
       <w:rPr>
-        <w:rFonts w:hint="default" w:ascii="Courier New" w:hAnsi="Courier New"/>
+        <w:rFonts w:ascii="Courier New" w:hAnsi="Courier New" w:hint="default"/>
         <w:sz w:val="20"/>
       </w:rPr>
     </w:lvl>
@@ -3720,7 +4295,7 @@
         <w:ind w:left="2160" w:hanging="360"/>
       </w:pPr>
       <w:rPr>
-        <w:rFonts w:hint="default" w:ascii="Wingdings" w:hAnsi="Wingdings"/>
+        <w:rFonts w:ascii="Wingdings" w:hAnsi="Wingdings" w:hint="default"/>
         <w:sz w:val="20"/>
       </w:rPr>
     </w:lvl>
@@ -3736,7 +4311,7 @@
         <w:ind w:left="2880" w:hanging="360"/>
       </w:pPr>
       <w:rPr>
-        <w:rFonts w:hint="default" w:ascii="Wingdings" w:hAnsi="Wingdings"/>
+        <w:rFonts w:ascii="Wingdings" w:hAnsi="Wingdings" w:hint="default"/>
         <w:sz w:val="20"/>
       </w:rPr>
     </w:lvl>
@@ -3752,7 +4327,7 @@
         <w:ind w:left="3600" w:hanging="360"/>
       </w:pPr>
       <w:rPr>
-        <w:rFonts w:hint="default" w:ascii="Wingdings" w:hAnsi="Wingdings"/>
+        <w:rFonts w:ascii="Wingdings" w:hAnsi="Wingdings" w:hint="default"/>
         <w:sz w:val="20"/>
       </w:rPr>
     </w:lvl>
@@ -3768,7 +4343,7 @@
         <w:ind w:left="4320" w:hanging="360"/>
       </w:pPr>
       <w:rPr>
-        <w:rFonts w:hint="default" w:ascii="Wingdings" w:hAnsi="Wingdings"/>
+        <w:rFonts w:ascii="Wingdings" w:hAnsi="Wingdings" w:hint="default"/>
         <w:sz w:val="20"/>
       </w:rPr>
     </w:lvl>
@@ -3784,7 +4359,7 @@
         <w:ind w:left="5040" w:hanging="360"/>
       </w:pPr>
       <w:rPr>
-        <w:rFonts w:hint="default" w:ascii="Wingdings" w:hAnsi="Wingdings"/>
+        <w:rFonts w:ascii="Wingdings" w:hAnsi="Wingdings" w:hint="default"/>
         <w:sz w:val="20"/>
       </w:rPr>
     </w:lvl>
@@ -3800,7 +4375,7 @@
         <w:ind w:left="5760" w:hanging="360"/>
       </w:pPr>
       <w:rPr>
-        <w:rFonts w:hint="default" w:ascii="Wingdings" w:hAnsi="Wingdings"/>
+        <w:rFonts w:ascii="Wingdings" w:hAnsi="Wingdings" w:hint="default"/>
         <w:sz w:val="20"/>
       </w:rPr>
     </w:lvl>
@@ -3816,46 +4391,49 @@
         <w:ind w:left="6480" w:hanging="360"/>
       </w:pPr>
       <w:rPr>
-        <w:rFonts w:hint="default" w:ascii="Wingdings" w:hAnsi="Wingdings"/>
+        <w:rFonts w:ascii="Wingdings" w:hAnsi="Wingdings" w:hint="default"/>
         <w:sz w:val="20"/>
       </w:rPr>
     </w:lvl>
   </w:abstractNum>
-  <w:num w:numId="12">
+  <w:num w:numId="1" w16cid:durableId="138495784">
+    <w:abstractNumId w:val="8"/>
+  </w:num>
+  <w:num w:numId="2" w16cid:durableId="2046053555">
+    <w:abstractNumId w:val="4"/>
+  </w:num>
+  <w:num w:numId="3" w16cid:durableId="976229213">
+    <w:abstractNumId w:val="6"/>
+  </w:num>
+  <w:num w:numId="4" w16cid:durableId="2103335130">
+    <w:abstractNumId w:val="12"/>
+  </w:num>
+  <w:num w:numId="5" w16cid:durableId="953949135">
+    <w:abstractNumId w:val="9"/>
+  </w:num>
+  <w:num w:numId="6" w16cid:durableId="629482643">
+    <w:abstractNumId w:val="0"/>
+  </w:num>
+  <w:num w:numId="7" w16cid:durableId="772238397">
+    <w:abstractNumId w:val="7"/>
+  </w:num>
+  <w:num w:numId="8" w16cid:durableId="825708413">
+    <w:abstractNumId w:val="5"/>
+  </w:num>
+  <w:num w:numId="9" w16cid:durableId="1120683889">
+    <w:abstractNumId w:val="2"/>
+  </w:num>
+  <w:num w:numId="10" w16cid:durableId="1713384720">
+    <w:abstractNumId w:val="1"/>
+  </w:num>
+  <w:num w:numId="11" w16cid:durableId="1019813348">
     <w:abstractNumId w:val="11"/>
   </w:num>
-  <w:num w:numId="1" w16cid:durableId="2046053555">
-    <w:abstractNumId w:val="3"/>
-  </w:num>
-  <w:num w:numId="2" w16cid:durableId="976229213">
-    <w:abstractNumId w:val="5"/>
-  </w:num>
-  <w:num w:numId="3" w16cid:durableId="2103335130">
+  <w:num w:numId="12" w16cid:durableId="1933976462">
     <w:abstractNumId w:val="10"/>
   </w:num>
-  <w:num w:numId="4" w16cid:durableId="953949135">
-    <w:abstractNumId w:val="7"/>
-  </w:num>
-  <w:num w:numId="5" w16cid:durableId="629482643">
-    <w:abstractNumId w:val="0"/>
-  </w:num>
-  <w:num w:numId="6" w16cid:durableId="772238397">
-    <w:abstractNumId w:val="6"/>
-  </w:num>
-  <w:num w:numId="7" w16cid:durableId="825708413">
-    <w:abstractNumId w:val="4"/>
-  </w:num>
-  <w:num w:numId="8" w16cid:durableId="1120683889">
-    <w:abstractNumId w:val="2"/>
-  </w:num>
-  <w:num w:numId="9" w16cid:durableId="1713384720">
-    <w:abstractNumId w:val="1"/>
-  </w:num>
-  <w:num w:numId="10" w16cid:durableId="1019813348">
-    <w:abstractNumId w:val="9"/>
-  </w:num>
-  <w:num w:numId="11" w16cid:durableId="1933976462">
-    <w:abstractNumId w:val="8"/>
+  <w:num w:numId="13" w16cid:durableId="1846629485">
+    <w:abstractNumId w:val="3"/>
   </w:num>
 </w:numbering>
 </file>
@@ -3865,7 +4443,7 @@
   <w:docDefaults>
     <w:rPrDefault>
       <w:rPr>
-        <w:rFonts w:asciiTheme="minorHAnsi" w:hAnsiTheme="minorHAnsi" w:eastAsiaTheme="minorHAnsi" w:cstheme="minorBidi"/>
+        <w:rFonts w:asciiTheme="minorHAnsi" w:eastAsiaTheme="minorHAnsi" w:hAnsiTheme="minorHAnsi" w:cstheme="minorBidi"/>
         <w:kern w:val="2"/>
         <w:sz w:val="24"/>
         <w:szCs w:val="24"/>
@@ -3882,14 +4460,14 @@
   <w:latentStyles w:defLockedState="0" w:defUIPriority="99" w:defSemiHidden="0" w:defUnhideWhenUsed="0" w:defQFormat="0" w:count="376">
     <w:lsdException w:name="Normal" w:uiPriority="0" w:qFormat="1"/>
     <w:lsdException w:name="heading 1" w:uiPriority="9" w:qFormat="1"/>
-    <w:lsdException w:name="heading 2" w:uiPriority="9" w:semiHidden="1" w:unhideWhenUsed="1" w:qFormat="1"/>
-    <w:lsdException w:name="heading 3" w:uiPriority="9" w:semiHidden="1" w:unhideWhenUsed="1" w:qFormat="1"/>
-    <w:lsdException w:name="heading 4" w:uiPriority="9" w:semiHidden="1" w:unhideWhenUsed="1" w:qFormat="1"/>
-    <w:lsdException w:name="heading 5" w:uiPriority="9" w:semiHidden="1" w:unhideWhenUsed="1" w:qFormat="1"/>
-    <w:lsdException w:name="heading 6" w:uiPriority="9" w:semiHidden="1" w:unhideWhenUsed="1" w:qFormat="1"/>
-    <w:lsdException w:name="heading 7" w:uiPriority="9" w:semiHidden="1" w:unhideWhenUsed="1" w:qFormat="1"/>
-    <w:lsdException w:name="heading 8" w:uiPriority="9" w:semiHidden="1" w:unhideWhenUsed="1" w:qFormat="1"/>
-    <w:lsdException w:name="heading 9" w:uiPriority="9" w:semiHidden="1" w:unhideWhenUsed="1" w:qFormat="1"/>
+    <w:lsdException w:name="heading 2" w:semiHidden="1" w:uiPriority="9" w:unhideWhenUsed="1" w:qFormat="1"/>
+    <w:lsdException w:name="heading 3" w:semiHidden="1" w:uiPriority="9" w:unhideWhenUsed="1" w:qFormat="1"/>
+    <w:lsdException w:name="heading 4" w:semiHidden="1" w:uiPriority="9" w:unhideWhenUsed="1" w:qFormat="1"/>
+    <w:lsdException w:name="heading 5" w:semiHidden="1" w:uiPriority="9" w:unhideWhenUsed="1" w:qFormat="1"/>
+    <w:lsdException w:name="heading 6" w:semiHidden="1" w:uiPriority="9" w:unhideWhenUsed="1" w:qFormat="1"/>
+    <w:lsdException w:name="heading 7" w:semiHidden="1" w:uiPriority="9" w:unhideWhenUsed="1" w:qFormat="1"/>
+    <w:lsdException w:name="heading 8" w:semiHidden="1" w:uiPriority="9" w:unhideWhenUsed="1" w:qFormat="1"/>
+    <w:lsdException w:name="heading 9" w:semiHidden="1" w:uiPriority="9" w:unhideWhenUsed="1" w:qFormat="1"/>
     <w:lsdException w:name="index 1" w:semiHidden="1" w:unhideWhenUsed="1"/>
     <w:lsdException w:name="index 2" w:semiHidden="1" w:unhideWhenUsed="1"/>
     <w:lsdException w:name="index 3" w:semiHidden="1" w:unhideWhenUsed="1"/>
@@ -3899,22 +4477,22 @@
     <w:lsdException w:name="index 7" w:semiHidden="1" w:unhideWhenUsed="1"/>
     <w:lsdException w:name="index 8" w:semiHidden="1" w:unhideWhenUsed="1"/>
     <w:lsdException w:name="index 9" w:semiHidden="1" w:unhideWhenUsed="1"/>
-    <w:lsdException w:name="toc 1" w:uiPriority="39" w:semiHidden="1" w:unhideWhenUsed="1"/>
-    <w:lsdException w:name="toc 2" w:uiPriority="39" w:semiHidden="1" w:unhideWhenUsed="1"/>
-    <w:lsdException w:name="toc 3" w:uiPriority="39" w:semiHidden="1" w:unhideWhenUsed="1"/>
-    <w:lsdException w:name="toc 4" w:uiPriority="39" w:semiHidden="1" w:unhideWhenUsed="1"/>
-    <w:lsdException w:name="toc 5" w:uiPriority="39" w:semiHidden="1" w:unhideWhenUsed="1"/>
-    <w:lsdException w:name="toc 6" w:uiPriority="39" w:semiHidden="1" w:unhideWhenUsed="1"/>
-    <w:lsdException w:name="toc 7" w:uiPriority="39" w:semiHidden="1" w:unhideWhenUsed="1"/>
-    <w:lsdException w:name="toc 8" w:uiPriority="39" w:semiHidden="1" w:unhideWhenUsed="1"/>
-    <w:lsdException w:name="toc 9" w:uiPriority="39" w:semiHidden="1" w:unhideWhenUsed="1"/>
+    <w:lsdException w:name="toc 1" w:semiHidden="1" w:uiPriority="39" w:unhideWhenUsed="1"/>
+    <w:lsdException w:name="toc 2" w:semiHidden="1" w:uiPriority="39" w:unhideWhenUsed="1"/>
+    <w:lsdException w:name="toc 3" w:semiHidden="1" w:uiPriority="39" w:unhideWhenUsed="1"/>
+    <w:lsdException w:name="toc 4" w:semiHidden="1" w:uiPriority="39" w:unhideWhenUsed="1"/>
+    <w:lsdException w:name="toc 5" w:semiHidden="1" w:uiPriority="39" w:unhideWhenUsed="1"/>
+    <w:lsdException w:name="toc 6" w:semiHidden="1" w:uiPriority="39" w:unhideWhenUsed="1"/>
+    <w:lsdException w:name="toc 7" w:semiHidden="1" w:uiPriority="39" w:unhideWhenUsed="1"/>
+    <w:lsdException w:name="toc 8" w:semiHidden="1" w:uiPriority="39" w:unhideWhenUsed="1"/>
+    <w:lsdException w:name="toc 9" w:semiHidden="1" w:uiPriority="39" w:unhideWhenUsed="1"/>
     <w:lsdException w:name="Normal Indent" w:semiHidden="1" w:unhideWhenUsed="1"/>
     <w:lsdException w:name="footnote text" w:semiHidden="1" w:unhideWhenUsed="1"/>
     <w:lsdException w:name="annotation text" w:semiHidden="1" w:unhideWhenUsed="1"/>
     <w:lsdException w:name="header" w:semiHidden="1" w:unhideWhenUsed="1"/>
     <w:lsdException w:name="footer" w:semiHidden="1" w:unhideWhenUsed="1"/>
     <w:lsdException w:name="index heading" w:semiHidden="1" w:unhideWhenUsed="1"/>
-    <w:lsdException w:name="caption" w:uiPriority="35" w:semiHidden="1" w:unhideWhenUsed="1" w:qFormat="1"/>
+    <w:lsdException w:name="caption" w:semiHidden="1" w:uiPriority="35" w:unhideWhenUsed="1" w:qFormat="1"/>
     <w:lsdException w:name="table of figures" w:semiHidden="1" w:unhideWhenUsed="1"/>
     <w:lsdException w:name="envelope address" w:semiHidden="1" w:unhideWhenUsed="1"/>
     <w:lsdException w:name="envelope return" w:semiHidden="1" w:unhideWhenUsed="1"/>
@@ -3945,7 +4523,7 @@
     <w:lsdException w:name="Title" w:uiPriority="10" w:qFormat="1"/>
     <w:lsdException w:name="Closing" w:semiHidden="1" w:unhideWhenUsed="1"/>
     <w:lsdException w:name="Signature" w:semiHidden="1" w:unhideWhenUsed="1"/>
-    <w:lsdException w:name="Default Paragraph Font" w:uiPriority="1" w:semiHidden="1" w:unhideWhenUsed="1"/>
+    <w:lsdException w:name="Default Paragraph Font" w:semiHidden="1" w:uiPriority="1" w:unhideWhenUsed="1"/>
     <w:lsdException w:name="Body Text" w:semiHidden="1" w:unhideWhenUsed="1"/>
     <w:lsdException w:name="Body Text Indent" w:semiHidden="1" w:unhideWhenUsed="1"/>
     <w:lsdException w:name="List Continue" w:semiHidden="1" w:unhideWhenUsed="1"/>
@@ -4145,8 +4723,8 @@
     <w:lsdException w:name="Subtle Reference" w:uiPriority="31" w:qFormat="1"/>
     <w:lsdException w:name="Intense Reference" w:uiPriority="32" w:qFormat="1"/>
     <w:lsdException w:name="Book Title" w:uiPriority="33" w:qFormat="1"/>
-    <w:lsdException w:name="Bibliography" w:uiPriority="37" w:semiHidden="1" w:unhideWhenUsed="1"/>
-    <w:lsdException w:name="TOC Heading" w:uiPriority="39" w:semiHidden="1" w:unhideWhenUsed="1" w:qFormat="1"/>
+    <w:lsdException w:name="Bibliography" w:semiHidden="1" w:uiPriority="37" w:unhideWhenUsed="1"/>
+    <w:lsdException w:name="TOC Heading" w:semiHidden="1" w:uiPriority="39" w:unhideWhenUsed="1" w:qFormat="1"/>
     <w:lsdException w:name="Plain Table 1" w:uiPriority="41"/>
     <w:lsdException w:name="Plain Table 2" w:uiPriority="42"/>
     <w:lsdException w:name="Plain Table 3" w:uiPriority="43"/>
@@ -4257,7 +4835,7 @@
     <w:lsdException w:name="Unresolved Mention" w:semiHidden="1" w:unhideWhenUsed="1"/>
     <w:lsdException w:name="Smart Link" w:semiHidden="1" w:unhideWhenUsed="1"/>
   </w:latentStyles>
-  <w:style w:type="paragraph" w:styleId="Normal" w:default="1">
+  <w:style w:type="paragraph" w:default="1" w:styleId="Normal">
     <w:name w:val="Normal"/>
     <w:qFormat/>
   </w:style>
@@ -4276,7 +4854,7 @@
       <w:outlineLvl w:val="0"/>
     </w:pPr>
     <w:rPr>
-      <w:rFonts w:asciiTheme="majorHAnsi" w:hAnsiTheme="majorHAnsi" w:eastAsiaTheme="majorEastAsia" w:cstheme="majorBidi"/>
+      <w:rFonts w:asciiTheme="majorHAnsi" w:eastAsiaTheme="majorEastAsia" w:hAnsiTheme="majorHAnsi" w:cstheme="majorBidi"/>
       <w:color w:val="0F4761" w:themeColor="accent1" w:themeShade="BF"/>
       <w:sz w:val="40"/>
       <w:szCs w:val="40"/>
@@ -4299,7 +4877,7 @@
       <w:outlineLvl w:val="1"/>
     </w:pPr>
     <w:rPr>
-      <w:rFonts w:asciiTheme="majorHAnsi" w:hAnsiTheme="majorHAnsi" w:eastAsiaTheme="majorEastAsia" w:cstheme="majorBidi"/>
+      <w:rFonts w:asciiTheme="majorHAnsi" w:eastAsiaTheme="majorEastAsia" w:hAnsiTheme="majorHAnsi" w:cstheme="majorBidi"/>
       <w:color w:val="0F4761" w:themeColor="accent1" w:themeShade="BF"/>
       <w:sz w:val="32"/>
       <w:szCs w:val="32"/>
@@ -4460,12 +5038,12 @@
       <w:color w:val="272727" w:themeColor="text1" w:themeTint="D8"/>
     </w:rPr>
   </w:style>
-  <w:style w:type="character" w:styleId="DefaultParagraphFont" w:default="1">
+  <w:style w:type="character" w:default="1" w:styleId="DefaultParagraphFont">
     <w:name w:val="Default Paragraph Font"/>
     <w:uiPriority w:val="1"/>
     <w:unhideWhenUsed/>
   </w:style>
-  <w:style w:type="table" w:styleId="TableNormal" w:default="1">
+  <w:style w:type="table" w:default="1" w:styleId="TableNormal">
     <w:name w:val="Normal Table"/>
     <w:uiPriority w:val="99"/>
     <w:semiHidden/>
@@ -4480,26 +5058,26 @@
       </w:tblCellMar>
     </w:tblPr>
   </w:style>
-  <w:style w:type="numbering" w:styleId="NoList" w:default="1">
+  <w:style w:type="numbering" w:default="1" w:styleId="NoList">
     <w:name w:val="No List"/>
     <w:uiPriority w:val="99"/>
     <w:semiHidden/>
     <w:unhideWhenUsed/>
   </w:style>
-  <w:style w:type="character" w:styleId="Heading1Char" w:customStyle="1">
+  <w:style w:type="character" w:customStyle="1" w:styleId="Heading1Char">
     <w:name w:val="Heading 1 Char"/>
     <w:basedOn w:val="DefaultParagraphFont"/>
     <w:link w:val="Heading1"/>
     <w:uiPriority w:val="9"/>
     <w:rsid w:val="003A22B6"/>
     <w:rPr>
-      <w:rFonts w:asciiTheme="majorHAnsi" w:hAnsiTheme="majorHAnsi" w:eastAsiaTheme="majorEastAsia" w:cstheme="majorBidi"/>
+      <w:rFonts w:asciiTheme="majorHAnsi" w:eastAsiaTheme="majorEastAsia" w:hAnsiTheme="majorHAnsi" w:cstheme="majorBidi"/>
       <w:color w:val="0F4761" w:themeColor="accent1" w:themeShade="BF"/>
       <w:sz w:val="40"/>
       <w:szCs w:val="40"/>
     </w:rPr>
   </w:style>
-  <w:style w:type="character" w:styleId="Heading2Char" w:customStyle="1">
+  <w:style w:type="character" w:customStyle="1" w:styleId="Heading2Char">
     <w:name w:val="Heading 2 Char"/>
     <w:basedOn w:val="DefaultParagraphFont"/>
     <w:link w:val="Heading2"/>
@@ -4507,13 +5085,13 @@
     <w:semiHidden/>
     <w:rsid w:val="003A22B6"/>
     <w:rPr>
-      <w:rFonts w:asciiTheme="majorHAnsi" w:hAnsiTheme="majorHAnsi" w:eastAsiaTheme="majorEastAsia" w:cstheme="majorBidi"/>
+      <w:rFonts w:asciiTheme="majorHAnsi" w:eastAsiaTheme="majorEastAsia" w:hAnsiTheme="majorHAnsi" w:cstheme="majorBidi"/>
       <w:color w:val="0F4761" w:themeColor="accent1" w:themeShade="BF"/>
       <w:sz w:val="32"/>
       <w:szCs w:val="32"/>
     </w:rPr>
   </w:style>
-  <w:style w:type="character" w:styleId="Heading3Char" w:customStyle="1">
+  <w:style w:type="character" w:customStyle="1" w:styleId="Heading3Char">
     <w:name w:val="Heading 3 Char"/>
     <w:basedOn w:val="DefaultParagraphFont"/>
     <w:link w:val="Heading3"/>
@@ -4527,7 +5105,7 @@
       <w:szCs w:val="28"/>
     </w:rPr>
   </w:style>
-  <w:style w:type="character" w:styleId="Heading4Char" w:customStyle="1">
+  <w:style w:type="character" w:customStyle="1" w:styleId="Heading4Char">
     <w:name w:val="Heading 4 Char"/>
     <w:basedOn w:val="DefaultParagraphFont"/>
     <w:link w:val="Heading4"/>
@@ -4541,7 +5119,7 @@
       <w:color w:val="0F4761" w:themeColor="accent1" w:themeShade="BF"/>
     </w:rPr>
   </w:style>
-  <w:style w:type="character" w:styleId="Heading5Char" w:customStyle="1">
+  <w:style w:type="character" w:customStyle="1" w:styleId="Heading5Char">
     <w:name w:val="Heading 5 Char"/>
     <w:basedOn w:val="DefaultParagraphFont"/>
     <w:link w:val="Heading5"/>
@@ -4553,7 +5131,7 @@
       <w:color w:val="0F4761" w:themeColor="accent1" w:themeShade="BF"/>
     </w:rPr>
   </w:style>
-  <w:style w:type="character" w:styleId="Heading6Char" w:customStyle="1">
+  <w:style w:type="character" w:customStyle="1" w:styleId="Heading6Char">
     <w:name w:val="Heading 6 Char"/>
     <w:basedOn w:val="DefaultParagraphFont"/>
     <w:link w:val="Heading6"/>
@@ -4567,7 +5145,7 @@
       <w:color w:val="595959" w:themeColor="text1" w:themeTint="A6"/>
     </w:rPr>
   </w:style>
-  <w:style w:type="character" w:styleId="Heading7Char" w:customStyle="1">
+  <w:style w:type="character" w:customStyle="1" w:styleId="Heading7Char">
     <w:name w:val="Heading 7 Char"/>
     <w:basedOn w:val="DefaultParagraphFont"/>
     <w:link w:val="Heading7"/>
@@ -4579,7 +5157,7 @@
       <w:color w:val="595959" w:themeColor="text1" w:themeTint="A6"/>
     </w:rPr>
   </w:style>
-  <w:style w:type="character" w:styleId="Heading8Char" w:customStyle="1">
+  <w:style w:type="character" w:customStyle="1" w:styleId="Heading8Char">
     <w:name w:val="Heading 8 Char"/>
     <w:basedOn w:val="DefaultParagraphFont"/>
     <w:link w:val="Heading8"/>
@@ -4593,7 +5171,7 @@
       <w:color w:val="272727" w:themeColor="text1" w:themeTint="D8"/>
     </w:rPr>
   </w:style>
-  <w:style w:type="character" w:styleId="Heading9Char" w:customStyle="1">
+  <w:style w:type="character" w:customStyle="1" w:styleId="Heading9Char">
     <w:name w:val="Heading 9 Char"/>
     <w:basedOn w:val="DefaultParagraphFont"/>
     <w:link w:val="Heading9"/>
@@ -4618,21 +5196,21 @@
       <w:contextualSpacing/>
     </w:pPr>
     <w:rPr>
-      <w:rFonts w:asciiTheme="majorHAnsi" w:hAnsiTheme="majorHAnsi" w:eastAsiaTheme="majorEastAsia" w:cstheme="majorBidi"/>
+      <w:rFonts w:asciiTheme="majorHAnsi" w:eastAsiaTheme="majorEastAsia" w:hAnsiTheme="majorHAnsi" w:cstheme="majorBidi"/>
       <w:spacing w:val="-10"/>
       <w:kern w:val="28"/>
       <w:sz w:val="56"/>
       <w:szCs w:val="56"/>
     </w:rPr>
   </w:style>
-  <w:style w:type="character" w:styleId="TitleChar" w:customStyle="1">
+  <w:style w:type="character" w:customStyle="1" w:styleId="TitleChar">
     <w:name w:val="Title Char"/>
     <w:basedOn w:val="DefaultParagraphFont"/>
     <w:link w:val="Title"/>
     <w:uiPriority w:val="10"/>
     <w:rsid w:val="003A22B6"/>
     <w:rPr>
-      <w:rFonts w:asciiTheme="majorHAnsi" w:hAnsiTheme="majorHAnsi" w:eastAsiaTheme="majorEastAsia" w:cstheme="majorBidi"/>
+      <w:rFonts w:asciiTheme="majorHAnsi" w:eastAsiaTheme="majorEastAsia" w:hAnsiTheme="majorHAnsi" w:cstheme="majorBidi"/>
       <w:spacing w:val="-10"/>
       <w:kern w:val="28"/>
       <w:sz w:val="56"/>
@@ -4660,7 +5238,7 @@
       <w:szCs w:val="28"/>
     </w:rPr>
   </w:style>
-  <w:style w:type="character" w:styleId="SubtitleChar" w:customStyle="1">
+  <w:style w:type="character" w:customStyle="1" w:styleId="SubtitleChar">
     <w:name w:val="Subtitle Char"/>
     <w:basedOn w:val="DefaultParagraphFont"/>
     <w:link w:val="Subtitle"/>
@@ -4692,7 +5270,7 @@
       <w:color w:val="404040" w:themeColor="text1" w:themeTint="BF"/>
     </w:rPr>
   </w:style>
-  <w:style w:type="character" w:styleId="QuoteChar" w:customStyle="1">
+  <w:style w:type="character" w:customStyle="1" w:styleId="QuoteChar">
     <w:name w:val="Quote Char"/>
     <w:basedOn w:val="DefaultParagraphFont"/>
     <w:link w:val="Quote"/>
@@ -4737,8 +5315,8 @@
     <w:rsid w:val="003A22B6"/>
     <w:pPr>
       <w:pBdr>
-        <w:top w:val="single" w:color="0F4761" w:themeColor="accent1" w:themeShade="BF" w:sz="4" w:space="10"/>
-        <w:bottom w:val="single" w:color="0F4761" w:themeColor="accent1" w:themeShade="BF" w:sz="4" w:space="10"/>
+        <w:top w:val="single" w:sz="4" w:space="10" w:color="0F4761" w:themeColor="accent1" w:themeShade="BF"/>
+        <w:bottom w:val="single" w:sz="4" w:space="10" w:color="0F4761" w:themeColor="accent1" w:themeShade="BF"/>
       </w:pBdr>
       <w:spacing w:before="360" w:after="360"/>
       <w:ind w:left="864" w:right="864"/>
@@ -4750,7 +5328,7 @@
       <w:color w:val="0F4761" w:themeColor="accent1" w:themeShade="BF"/>
     </w:rPr>
   </w:style>
-  <w:style w:type="character" w:styleId="IntenseQuoteChar" w:customStyle="1">
+  <w:style w:type="character" w:customStyle="1" w:styleId="IntenseQuoteChar">
     <w:name w:val="Intense Quote Char"/>
     <w:basedOn w:val="DefaultParagraphFont"/>
     <w:link w:val="IntenseQuote"/>
@@ -4777,9 +5355,9 @@
     </w:rPr>
   </w:style>
   <w:style w:type="character" w:styleId="Hyperlink">
-    <w:uiPriority w:val="99"/>
     <w:name w:val="Hyperlink"/>
     <w:basedOn w:val="DefaultParagraphFont"/>
+    <w:uiPriority w:val="99"/>
     <w:unhideWhenUsed/>
     <w:rsid w:val="06E21B59"/>
     <w:rPr>
@@ -5230,6 +5808,12 @@
 </file>
 
 <file path=customXml/item2.xml><?xml version="1.0" encoding="utf-8"?>
+<p:properties xmlns:p="http://schemas.microsoft.com/office/2006/metadata/properties" xmlns:xsi="http://www.w3.org/2001/XMLSchema-instance" xmlns:pc="http://schemas.microsoft.com/office/infopath/2007/PartnerControls">
+  <documentManagement/>
+</p:properties>
+</file>
+
+<file path=customXml/item3.xml><?xml version="1.0" encoding="utf-8"?>
 <?mso-contentType ?>
 <FormTemplates xmlns="http://schemas.microsoft.com/sharepoint/v3/contenttype/forms">
   <Display>DocumentLibraryForm</Display>
@@ -5238,20 +5822,37 @@
 </FormTemplates>
 </file>
 
-<file path=customXml/item3.xml><?xml version="1.0" encoding="utf-8"?>
-<p:properties xmlns:p="http://schemas.microsoft.com/office/2006/metadata/properties" xmlns:xsi="http://www.w3.org/2001/XMLSchema-instance" xmlns:pc="http://schemas.microsoft.com/office/infopath/2007/PartnerControls">
-  <documentManagement/>
-</p:properties>
-</file>
-
 <file path=customXml/itemProps1.xml><?xml version="1.0" encoding="utf-8"?>
-<ds:datastoreItem xmlns:ds="http://schemas.openxmlformats.org/officeDocument/2006/customXml" ds:itemID="{D9491951-BD1F-42BF-A399-F18DFDFCE167}"/>
+<ds:datastoreItem xmlns:ds="http://schemas.openxmlformats.org/officeDocument/2006/customXml" ds:itemID="{D9491951-BD1F-42BF-A399-F18DFDFCE167}">
+  <ds:schemaRefs>
+    <ds:schemaRef ds:uri="http://schemas.microsoft.com/office/2006/metadata/contentType"/>
+    <ds:schemaRef ds:uri="http://schemas.microsoft.com/office/2006/metadata/properties/metaAttributes"/>
+    <ds:schemaRef ds:uri="http://www.w3.org/2001/XMLSchema"/>
+    <ds:schemaRef ds:uri="http://schemas.microsoft.com/office/2006/metadata/properties"/>
+    <ds:schemaRef ds:uri="4bc4ef79-b2df-4c2a-b56e-7c3bb9392cad"/>
+    <ds:schemaRef ds:uri="http://schemas.microsoft.com/office/2006/documentManagement/types"/>
+    <ds:schemaRef ds:uri="http://schemas.microsoft.com/office/infopath/2007/PartnerControls"/>
+    <ds:schemaRef ds:uri="http://schemas.openxmlformats.org/package/2006/metadata/core-properties"/>
+    <ds:schemaRef ds:uri="http://purl.org/dc/elements/1.1/"/>
+    <ds:schemaRef ds:uri="http://purl.org/dc/terms/"/>
+    <ds:schemaRef ds:uri="http://schemas.microsoft.com/internal/obd"/>
+  </ds:schemaRefs>
+</ds:datastoreItem>
 </file>
 
 <file path=customXml/itemProps2.xml><?xml version="1.0" encoding="utf-8"?>
-<ds:datastoreItem xmlns:ds="http://schemas.openxmlformats.org/officeDocument/2006/customXml" ds:itemID="{25ECE386-7F2A-4376-AEA1-66C78C311276}"/>
+<ds:datastoreItem xmlns:ds="http://schemas.openxmlformats.org/officeDocument/2006/customXml" ds:itemID="{3F26A947-CA64-4ACE-A054-F77A62B2A053}">
+  <ds:schemaRefs>
+    <ds:schemaRef ds:uri="http://schemas.microsoft.com/office/2006/metadata/properties"/>
+    <ds:schemaRef ds:uri="http://schemas.microsoft.com/office/infopath/2007/PartnerControls"/>
+  </ds:schemaRefs>
+</ds:datastoreItem>
 </file>
 
 <file path=customXml/itemProps3.xml><?xml version="1.0" encoding="utf-8"?>
-<ds:datastoreItem xmlns:ds="http://schemas.openxmlformats.org/officeDocument/2006/customXml" ds:itemID="{3F26A947-CA64-4ACE-A054-F77A62B2A053}"/>
+<ds:datastoreItem xmlns:ds="http://schemas.openxmlformats.org/officeDocument/2006/customXml" ds:itemID="{25ECE386-7F2A-4376-AEA1-66C78C311276}">
+  <ds:schemaRefs>
+    <ds:schemaRef ds:uri="http://schemas.microsoft.com/sharepoint/v3/contenttype/forms"/>
+  </ds:schemaRefs>
+</ds:datastoreItem>
 </file>
</xml_diff>